<commit_message>
Clarify VKR semantic ranking terminology
</commit_message>
<xml_diff>
--- a/vkr/artifacts/М24-534_НосовАИ_ВКР_old.docx
+++ b/vkr/artifacts/М24-534_НосовАИ_ВКР_old.docx
@@ -305,7 +305,7 @@
                 <w:rStyle w:val="ae"/>
                 <w:noProof/>
               </w:rPr>
-              <w:t>1.1 Системный анализ предметной области рекрутмента, процессов найма и ATS-систем</w:t>
+              <w:t>1.1 Системный анализ предметной области рекрутмента, процессов найма и систем автоматизированного управления подбором персонала</w:t>
             </w:r>
             <w:r>
               <w:rPr>
@@ -527,7 +527,7 @@
                 <w:rStyle w:val="ae"/>
                 <w:noProof/>
               </w:rPr>
-              <w:t>2 Проектирование данных, архитектуры обработки и интеграции с ATS</w:t>
+              <w:t>2 Проектирование данных, архитектуры обработки и интеграции с системой автоматизированного подбора персонала</w:t>
             </w:r>
             <w:r>
               <w:rPr>
@@ -749,7 +749,7 @@
                 <w:rStyle w:val="ae"/>
                 <w:noProof/>
               </w:rPr>
-              <w:t>2.3 Спецификация программного интерфейса (API) и модулей интеграции с ядром ATS</w:t>
+              <w:t>2.3 Спецификация программного интерфейса (API) и модулей интеграции с ядром системы подбора персонала</w:t>
             </w:r>
             <w:r>
               <w:rPr>
@@ -823,7 +823,7 @@
                 <w:rStyle w:val="ae"/>
                 <w:noProof/>
               </w:rPr>
-              <w:t>3 Разработка и реализация модуля семантического ранжирования кандидатов</w:t>
+              <w:t>3 Разработка и реализация модуля сопоставления вакансий и резюме для ранжирования кандидатов</w:t>
             </w:r>
             <w:r>
               <w:rPr>
@@ -971,7 +971,7 @@
                 <w:rStyle w:val="ae"/>
                 <w:noProof/>
               </w:rPr>
-              <w:t>3.2 Реализация и дообучение (fine-tuning) модели сопоставления «вакансия-резюме»</w:t>
+              <w:t>3.2 Реализация и доменная настройка (fine-tuning) модели сопоставления «вакансия-резюме»</w:t>
             </w:r>
             <w:r>
               <w:rPr>
@@ -1193,7 +1193,7 @@
                 <w:rStyle w:val="ae"/>
                 <w:noProof/>
               </w:rPr>
-              <w:t>4.2 Выполнение интеграции созданного модуля в целевую ATS-систему</w:t>
+              <w:t>4.2 Выполнение интеграции созданного модуля в целевую систему автоматизированного управления подбором персонала</w:t>
             </w:r>
             <w:r>
               <w:rPr>
@@ -1529,634 +1529,67 @@
         </w:rPr>
       </w:pPr>
       <w:r>
+        <w:t>Разработан прототип модуля предварительного отбора кандидатов, который сопоставляет текст вакансии и текст резюме по смысловому содержанию и формирует ранжированный список профилей по степени соответствия требованиям позиции. Решение предназначено для интеграции с системой автоматизированного управления подбором персонала (Applicant Tracking System). В рамках реализации выполнены подготовка и разметка связанных пар «текст вакансии–текст резюме», доменная настройка модели независимого энкодера (bi-encoder) на базе `cointegrated/rubert-tiny2`, разработка модуля ранжирования, создание сервиса HTTP API на Python-фреймворке FastAPI и подключение к тестовому контуру системы Reqcore.</w:t>
+      </w:r>
+    </w:p>
+    <w:p ns2:paraId="7300B41A" ns2:textId="043CCF62">
+      <w:pPr>
         <w:rPr>
           <w:lang w:val="ru-RU"/>
         </w:rPr>
-        <w:t xml:space="preserve">Разработан прототип модуля семантического ранжирования кандидатов для </w:t>
-      </w:r>
-      <w:r>
-        <w:rPr>
-          <w:lang w:val="en-US"/>
-        </w:rPr>
-        <w:t>ATS</w:t>
-      </w:r>
-      <w:r>
+      </w:pPr>
+      <w:r>
+        <w:t>Ключевые слова: автоматизированное управление подбором персонала, рекрутмент, резюме, вакансия, семантическое сопоставление, независимый энкодер (bi-encoder), Sentence-BERT, косинусное сходство, FastAPI, Reqcore.</w:t>
+      </w:r>
+    </w:p>
+    <w:p ns2:paraId="0D20096B" ns2:textId="2BEC91BC">
+      <w:pPr>
         <w:rPr>
           <w:lang w:val="ru-RU"/>
         </w:rPr>
-        <w:t xml:space="preserve">-системы. Реализованы контур подготовки данных, дообучение </w:t>
-      </w:r>
-      <w:r>
-        <w:rPr>
-          <w:lang w:val="en-US"/>
-        </w:rPr>
-        <w:t>bi</w:t>
-      </w:r>
-      <w:r>
+      </w:pPr>
+      <w:r>
+        <w:t>Целью данной работы является разработка и экспериментальная проверка прототипа модуля семантического сопоставления пары «вакансия–резюме» для интеграции в систему автоматизированного управления подбором персонала.</w:t>
+      </w:r>
+    </w:p>
+    <w:p ns2:paraId="66B128CF" ns2:textId="2D9F9671">
+      <w:pPr>
         <w:rPr>
           <w:lang w:val="ru-RU"/>
         </w:rPr>
-        <w:t>-</w:t>
-      </w:r>
-      <w:r>
-        <w:rPr>
-          <w:lang w:val="en-US"/>
-        </w:rPr>
-        <w:t>encoder</w:t>
-      </w:r>
-      <w:r>
+      </w:pPr>
+      <w:r>
+        <w:t>В первой главе анализируются предметная область рекрутмента, процессы найма, системы автоматизированного управления подбором персонала, методы обработки естественного языка и подходы к ранжированию кандидатов. Рассматриваются классические методы информационного поиска, Learning to Rank, архитектуры BERT и Sentence-BERT, а также ограничения, связанные со справедливостью алгоритмического ранжирования.</w:t>
+      </w:r>
+    </w:p>
+    <w:p ns2:paraId="4400168B" ns2:textId="5E5B28EB">
+      <w:pPr>
         <w:rPr>
           <w:lang w:val="ru-RU"/>
         </w:rPr>
-        <w:t xml:space="preserve"> модели на парах «вакансия–резюме», модуль ранжирования, </w:t>
-      </w:r>
-      <w:r>
-        <w:rPr>
-          <w:lang w:val="en-US"/>
-        </w:rPr>
-        <w:t>FastAPI</w:t>
-      </w:r>
-      <w:r>
+      </w:pPr>
+      <w:r>
+        <w:t>Во второй главе проектируется обработка данных и интеграция с системой автоматизированного управления подбором персонала. Описываются сбор, очистка и разметка данных вакансий и резюме, архитектура пайплайна предварительной обработки, модуль семантического анализа, API-интерфейс и связь сервиса независимого энкодера (bi-encoder) с ядром Reqcore.</w:t>
+      </w:r>
+    </w:p>
+    <w:p ns2:paraId="524B8A01" ns2:textId="6A3D9E3A">
+      <w:pPr>
         <w:rPr>
           <w:lang w:val="ru-RU"/>
         </w:rPr>
-        <w:t xml:space="preserve">-сервис и интеграция с тестовым контуром </w:t>
-      </w:r>
-      <w:r>
-        <w:rPr>
-          <w:lang w:val="en-US"/>
-        </w:rPr>
-        <w:t>ATS</w:t>
-      </w:r>
-      <w:r>
+      </w:pPr>
+      <w:r>
+        <w:t>В третьей главе описывается практическая реализация модуля сопоставления вакансий и резюме для ранжирования кандидатов. Приводятся сведения о подготовке обучающих пар, доменной настройке модели `cointegrated/rubert-tiny2`, структуре сохраненного артефакта, гиперпараметрах обучения, реализации класса `ATSRanker` и сервиса на FastAPI для ранжирования кандидатов.</w:t>
+      </w:r>
+    </w:p>
+    <w:p ns2:paraId="340201F2" ns2:textId="58EC159F">
+      <w:pPr>
         <w:rPr>
           <w:lang w:val="ru-RU"/>
         </w:rPr>
-        <w:t xml:space="preserve"> </w:t>
-      </w:r>
-      <w:r>
-        <w:rPr>
-          <w:lang w:val="en-US"/>
-        </w:rPr>
-        <w:t>Reqcore</w:t>
-      </w:r>
-      <w:r>
-        <w:rPr>
-          <w:lang w:val="ru-RU"/>
-        </w:rPr>
-        <w:t>.</w:t>
-      </w:r>
-    </w:p>
-    <w:p ns2:paraId="7300B41A" ns2:textId="043CCF62">
-      <w:pPr>
-        <w:rPr>
-          <w:lang w:val="ru-RU"/>
-        </w:rPr>
-      </w:pPr>
-      <w:r>
-        <w:rPr>
-          <w:lang w:val="ru-RU"/>
-        </w:rPr>
-        <w:t>Ключевые</w:t>
-      </w:r>
-      <w:r>
-        <w:rPr>
-          <w:lang w:val="ru-RU"/>
-        </w:rPr>
-        <w:t xml:space="preserve"> </w:t>
-      </w:r>
-      <w:r>
-        <w:rPr>
-          <w:lang w:val="ru-RU"/>
-        </w:rPr>
-        <w:t>слова</w:t>
-      </w:r>
-      <w:r>
-        <w:rPr>
-          <w:lang w:val="ru-RU"/>
-        </w:rPr>
-        <w:t xml:space="preserve">: </w:t>
-      </w:r>
-      <w:r>
-        <w:rPr>
-          <w:lang w:val="en-US"/>
-        </w:rPr>
-        <w:t>ATS</w:t>
-      </w:r>
-      <w:r>
-        <w:rPr>
-          <w:lang w:val="ru-RU"/>
-        </w:rPr>
-        <w:t xml:space="preserve">, </w:t>
-      </w:r>
-      <w:r>
-        <w:rPr>
-          <w:lang w:val="ru-RU"/>
-        </w:rPr>
-        <w:t>рекрутмент</w:t>
-      </w:r>
-      <w:r>
-        <w:rPr>
-          <w:lang w:val="ru-RU"/>
-        </w:rPr>
-        <w:t xml:space="preserve">, </w:t>
-      </w:r>
-      <w:r>
-        <w:rPr>
-          <w:lang w:val="ru-RU"/>
-        </w:rPr>
-        <w:t>резюме</w:t>
-      </w:r>
-      <w:r>
-        <w:rPr>
-          <w:lang w:val="ru-RU"/>
-        </w:rPr>
-        <w:t xml:space="preserve">, </w:t>
-      </w:r>
-      <w:r>
-        <w:rPr>
-          <w:lang w:val="ru-RU"/>
-        </w:rPr>
-        <w:t>вакансия</w:t>
-      </w:r>
-      <w:r>
-        <w:rPr>
-          <w:lang w:val="ru-RU"/>
-        </w:rPr>
-        <w:t xml:space="preserve">, </w:t>
-      </w:r>
-      <w:r>
-        <w:rPr>
-          <w:lang w:val="ru-RU"/>
-        </w:rPr>
-        <w:t>семантическое</w:t>
-      </w:r>
-      <w:r>
-        <w:rPr>
-          <w:lang w:val="ru-RU"/>
-        </w:rPr>
-        <w:t xml:space="preserve"> </w:t>
-      </w:r>
-      <w:r>
-        <w:rPr>
-          <w:lang w:val="ru-RU"/>
-        </w:rPr>
-        <w:t>ранжирование</w:t>
-      </w:r>
-      <w:r>
-        <w:rPr>
-          <w:lang w:val="ru-RU"/>
-        </w:rPr>
-        <w:t xml:space="preserve">, </w:t>
-      </w:r>
-      <w:r>
-        <w:rPr>
-          <w:lang w:val="en-US"/>
-        </w:rPr>
-        <w:t>bi</w:t>
-      </w:r>
-      <w:r>
-        <w:rPr>
-          <w:lang w:val="ru-RU"/>
-        </w:rPr>
-        <w:t>-</w:t>
-      </w:r>
-      <w:r>
-        <w:rPr>
-          <w:lang w:val="en-US"/>
-        </w:rPr>
-        <w:t>encoder</w:t>
-      </w:r>
-      <w:r>
-        <w:rPr>
-          <w:lang w:val="ru-RU"/>
-        </w:rPr>
-        <w:t xml:space="preserve">, </w:t>
-      </w:r>
-      <w:r>
-        <w:rPr>
-          <w:lang w:val="en-US"/>
-        </w:rPr>
-        <w:t>Sentence</w:t>
-      </w:r>
-      <w:r>
-        <w:rPr>
-          <w:lang w:val="ru-RU"/>
-        </w:rPr>
-        <w:t>-</w:t>
-      </w:r>
-      <w:r>
-        <w:rPr>
-          <w:lang w:val="en-US"/>
-        </w:rPr>
-        <w:t>BERT</w:t>
-      </w:r>
-      <w:r>
-        <w:rPr>
-          <w:lang w:val="ru-RU"/>
-        </w:rPr>
-        <w:t xml:space="preserve">, </w:t>
-      </w:r>
-      <w:r>
-        <w:rPr>
-          <w:lang w:val="en-US"/>
-        </w:rPr>
-        <w:t>cosine</w:t>
-      </w:r>
-      <w:r>
-        <w:rPr>
-          <w:lang w:val="ru-RU"/>
-        </w:rPr>
-        <w:t xml:space="preserve"> </w:t>
-      </w:r>
-      <w:r>
-        <w:rPr>
-          <w:lang w:val="en-US"/>
-        </w:rPr>
-        <w:t>similarity</w:t>
-      </w:r>
-      <w:r>
-        <w:rPr>
-          <w:lang w:val="ru-RU"/>
-        </w:rPr>
-        <w:t xml:space="preserve">, </w:t>
-      </w:r>
-      <w:r>
-        <w:rPr>
-          <w:lang w:val="en-US"/>
-        </w:rPr>
-        <w:t>FastAPI</w:t>
-      </w:r>
-      <w:r>
-        <w:rPr>
-          <w:lang w:val="ru-RU"/>
-        </w:rPr>
-        <w:t xml:space="preserve">, </w:t>
-      </w:r>
-      <w:r>
-        <w:rPr>
-          <w:lang w:val="en-US"/>
-        </w:rPr>
-        <w:t>Reqcore</w:t>
-      </w:r>
-      <w:r>
-        <w:rPr>
-          <w:lang w:val="ru-RU"/>
-        </w:rPr>
-        <w:t>.</w:t>
-      </w:r>
-    </w:p>
-    <w:p ns2:paraId="0D20096B" ns2:textId="2BEC91BC">
-      <w:pPr>
-        <w:rPr>
-          <w:lang w:val="ru-RU"/>
-        </w:rPr>
-      </w:pPr>
-      <w:r>
-        <w:rPr>
-          <w:lang w:val="ru-RU"/>
-        </w:rPr>
-        <w:t xml:space="preserve">Целью данной работы является разработка и экспериментальная проверка прототипа модуля семантического сопоставления пары «вакансия–резюме» для интеграции в </w:t>
-      </w:r>
-      <w:r>
-        <w:rPr>
-          <w:lang w:val="en-US"/>
-        </w:rPr>
-        <w:t>ATS</w:t>
-      </w:r>
-      <w:r>
-        <w:rPr>
-          <w:lang w:val="ru-RU"/>
-        </w:rPr>
-        <w:t>-систему.</w:t>
-      </w:r>
-    </w:p>
-    <w:p ns2:paraId="66B128CF" ns2:textId="2D9F9671">
-      <w:pPr>
-        <w:rPr>
-          <w:lang w:val="ru-RU"/>
-        </w:rPr>
-      </w:pPr>
-      <w:r>
-        <w:rPr>
-          <w:lang w:val="ru-RU"/>
-        </w:rPr>
-        <w:t xml:space="preserve">В первой главе анализируются предметная область рекрутмента, процессы найма, </w:t>
-      </w:r>
-      <w:r>
-        <w:rPr>
-          <w:lang w:val="en-US"/>
-        </w:rPr>
-        <w:t>ATS</w:t>
-      </w:r>
-      <w:r>
-        <w:rPr>
-          <w:lang w:val="ru-RU"/>
-        </w:rPr>
-        <w:t xml:space="preserve">-системы, методы обработки естественного языка и подходы к ранжированию кандидатов. Рассматриваются классические методы информационного поиска, </w:t>
-      </w:r>
-      <w:r>
-        <w:rPr>
-          <w:lang w:val="en-US"/>
-        </w:rPr>
-        <w:t>Learning</w:t>
-      </w:r>
-      <w:r>
-        <w:rPr>
-          <w:lang w:val="ru-RU"/>
-        </w:rPr>
-        <w:t xml:space="preserve"> </w:t>
-      </w:r>
-      <w:r>
-        <w:rPr>
-          <w:lang w:val="en-US"/>
-        </w:rPr>
-        <w:t>to</w:t>
-      </w:r>
-      <w:r>
-        <w:rPr>
-          <w:lang w:val="ru-RU"/>
-        </w:rPr>
-        <w:t xml:space="preserve"> </w:t>
-      </w:r>
-      <w:r>
-        <w:rPr>
-          <w:lang w:val="en-US"/>
-        </w:rPr>
-        <w:t>Rank</w:t>
-      </w:r>
-      <w:r>
-        <w:rPr>
-          <w:lang w:val="ru-RU"/>
-        </w:rPr>
-        <w:t xml:space="preserve">, архитектуры </w:t>
-      </w:r>
-      <w:r>
-        <w:rPr>
-          <w:lang w:val="en-US"/>
-        </w:rPr>
-        <w:t>BERT</w:t>
-      </w:r>
-      <w:r>
-        <w:rPr>
-          <w:lang w:val="ru-RU"/>
-        </w:rPr>
-        <w:t xml:space="preserve"> и </w:t>
-      </w:r>
-      <w:r>
-        <w:rPr>
-          <w:lang w:val="en-US"/>
-        </w:rPr>
-        <w:t>Sentence</w:t>
-      </w:r>
-      <w:r>
-        <w:rPr>
-          <w:lang w:val="ru-RU"/>
-        </w:rPr>
-        <w:t>-</w:t>
-      </w:r>
-      <w:r>
-        <w:rPr>
-          <w:lang w:val="en-US"/>
-        </w:rPr>
-        <w:t>BERT</w:t>
-      </w:r>
-      <w:r>
-        <w:rPr>
-          <w:lang w:val="ru-RU"/>
-        </w:rPr>
-        <w:t>, а также ограничения, связанные со справедливостью алгоритмического ранжирования.</w:t>
-      </w:r>
-    </w:p>
-    <w:p ns2:paraId="4400168B" ns2:textId="5E5B28EB">
-      <w:pPr>
-        <w:rPr>
-          <w:lang w:val="ru-RU"/>
-        </w:rPr>
-      </w:pPr>
-      <w:r>
-        <w:rPr>
-          <w:lang w:val="ru-RU"/>
-        </w:rPr>
-        <w:t xml:space="preserve">Во второй главе проектируется контур обработки данных и интеграции с </w:t>
-      </w:r>
-      <w:r>
-        <w:rPr>
-          <w:lang w:val="en-US"/>
-        </w:rPr>
-        <w:t>ATS</w:t>
-      </w:r>
-      <w:r>
-        <w:rPr>
-          <w:lang w:val="ru-RU"/>
-        </w:rPr>
-        <w:t xml:space="preserve">. Описываются сбор, очистка и разметка данных вакансий и резюме, архитектура пайплайна предварительной обработки, модуль семантического анализа, </w:t>
-      </w:r>
-      <w:r>
-        <w:rPr>
-          <w:lang w:val="en-US"/>
-        </w:rPr>
-        <w:t>API</w:t>
-      </w:r>
-      <w:r>
-        <w:rPr>
-          <w:lang w:val="ru-RU"/>
-        </w:rPr>
-        <w:t xml:space="preserve">-интерфейс и связь </w:t>
-      </w:r>
-      <w:r>
-        <w:rPr>
-          <w:lang w:val="en-US"/>
-        </w:rPr>
-        <w:t>bi</w:t>
-      </w:r>
-      <w:r>
-        <w:rPr>
-          <w:lang w:val="ru-RU"/>
-        </w:rPr>
-        <w:t>-</w:t>
-      </w:r>
-      <w:r>
-        <w:rPr>
-          <w:lang w:val="en-US"/>
-        </w:rPr>
-        <w:t>encoder</w:t>
-      </w:r>
-      <w:r>
-        <w:rPr>
-          <w:lang w:val="ru-RU"/>
-        </w:rPr>
-        <w:t xml:space="preserve"> сервиса с ядром </w:t>
-      </w:r>
-      <w:r>
-        <w:rPr>
-          <w:lang w:val="en-US"/>
-        </w:rPr>
-        <w:t>ATS</w:t>
-      </w:r>
-      <w:r>
-        <w:rPr>
-          <w:lang w:val="ru-RU"/>
-        </w:rPr>
-        <w:t xml:space="preserve"> </w:t>
-      </w:r>
-      <w:r>
-        <w:rPr>
-          <w:lang w:val="en-US"/>
-        </w:rPr>
-        <w:t>Reqcore</w:t>
-      </w:r>
-      <w:r>
-        <w:rPr>
-          <w:lang w:val="ru-RU"/>
-        </w:rPr>
-        <w:t>.</w:t>
-      </w:r>
-    </w:p>
-    <w:p ns2:paraId="524B8A01" ns2:textId="6A3D9E3A">
-      <w:pPr>
-        <w:rPr>
-          <w:lang w:val="ru-RU"/>
-        </w:rPr>
-      </w:pPr>
-      <w:r>
-        <w:rPr>
-          <w:lang w:val="ru-RU"/>
-        </w:rPr>
-        <w:t xml:space="preserve">В третьей главе описывается практическая реализация модуля семантического ранжирования. Приводятся сведения о подготовке обучающих пар, дообучении модели </w:t>
-      </w:r>
-      <w:r>
-        <w:rPr>
-          <w:lang w:val="en-US"/>
-        </w:rPr>
-        <w:t>cointegrated</w:t>
-      </w:r>
-      <w:r>
-        <w:rPr>
-          <w:lang w:val="ru-RU"/>
-        </w:rPr>
-        <w:t>/</w:t>
-      </w:r>
-      <w:r>
-        <w:rPr>
-          <w:lang w:val="en-US"/>
-        </w:rPr>
-        <w:t>rubert</w:t>
-      </w:r>
-      <w:r>
-        <w:rPr>
-          <w:lang w:val="ru-RU"/>
-        </w:rPr>
-        <w:t>-</w:t>
-      </w:r>
-      <w:r>
-        <w:rPr>
-          <w:lang w:val="en-US"/>
-        </w:rPr>
-        <w:t>tiny</w:t>
-      </w:r>
-      <w:r>
-        <w:rPr>
-          <w:lang w:val="ru-RU"/>
-        </w:rPr>
-        <w:t xml:space="preserve">2, структуре сохраненного артефакта, гиперпараметрах обучения, реализации класса </w:t>
-      </w:r>
-      <w:r>
-        <w:rPr>
-          <w:lang w:val="en-US"/>
-        </w:rPr>
-        <w:t>ATSRanker</w:t>
-      </w:r>
-      <w:r>
-        <w:rPr>
-          <w:lang w:val="ru-RU"/>
-        </w:rPr>
-        <w:t xml:space="preserve"> и </w:t>
-      </w:r>
-      <w:r>
-        <w:rPr>
-          <w:lang w:val="en-US"/>
-        </w:rPr>
-        <w:t>FastAPI</w:t>
-      </w:r>
-      <w:r>
-        <w:rPr>
-          <w:lang w:val="ru-RU"/>
-        </w:rPr>
-        <w:t>-сервиса для ранжирования кандидатов.</w:t>
-      </w:r>
-    </w:p>
-    <w:p ns2:paraId="340201F2" ns2:textId="58EC159F">
-      <w:pPr>
-        <w:rPr>
-          <w:lang w:val="ru-RU"/>
-        </w:rPr>
-      </w:pPr>
-      <w:r>
-        <w:rPr>
-          <w:lang w:val="ru-RU"/>
-        </w:rPr>
-        <w:t xml:space="preserve">В четвертой главе проводится экспериментальная оценка качества разработанного модуля. Рассматриваются метрики бинарного сопоставления и </w:t>
-      </w:r>
-      <w:r>
-        <w:rPr>
-          <w:lang w:val="en-US"/>
-        </w:rPr>
-        <w:t>ranking</w:t>
-      </w:r>
-      <w:r>
-        <w:rPr>
-          <w:lang w:val="ru-RU"/>
-        </w:rPr>
-        <w:t xml:space="preserve">-метрики, результаты сравнения базовой и дообученной модели, проверка </w:t>
-      </w:r>
-      <w:r>
-        <w:rPr>
-          <w:lang w:val="en-US"/>
-        </w:rPr>
-        <w:t>API</w:t>
-      </w:r>
-      <w:r>
-        <w:rPr>
-          <w:lang w:val="ru-RU"/>
-        </w:rPr>
-        <w:t xml:space="preserve">-интеграции с </w:t>
-      </w:r>
-      <w:r>
-        <w:rPr>
-          <w:lang w:val="en-US"/>
-        </w:rPr>
-        <w:t>Reqcore</w:t>
-      </w:r>
-      <w:r>
-        <w:rPr>
-          <w:lang w:val="ru-RU"/>
-        </w:rPr>
-        <w:t xml:space="preserve">, а также расчет практической эффективности применения </w:t>
-      </w:r>
-      <w:r>
-        <w:rPr>
-          <w:lang w:val="en-US"/>
-        </w:rPr>
-        <w:t>bi</w:t>
-      </w:r>
-      <w:r>
-        <w:rPr>
-          <w:lang w:val="ru-RU"/>
-        </w:rPr>
-        <w:t>-</w:t>
-      </w:r>
-      <w:r>
-        <w:rPr>
-          <w:lang w:val="en-US"/>
-        </w:rPr>
-        <w:t>encoder</w:t>
-      </w:r>
-      <w:r>
-        <w:rPr>
-          <w:lang w:val="ru-RU"/>
-        </w:rPr>
-        <w:t xml:space="preserve"> подхода для предварительного отбора кандидатов.</w:t>
+      </w:pPr>
+      <w:r>
+        <w:t>В четвертой главе проводится экспериментальная оценка качества разработанного модуля. Рассматриваются метрики бинарного сопоставления и ranking-метрики, результаты сравнения базовой и настроенной модели, проверка API-интеграции с Reqcore, а также расчет практической эффективности применения независимого энкодера (bi-encoder) для предварительного отбора кандидатов.</w:t>
       </w:r>
     </w:p>
     <w:p ns2:paraId="0DD8BAFF" ns2:textId="4C116553">
@@ -2207,7 +1640,7 @@
         </w:rPr>
       </w:pPr>
       <w:r>
-        <w:t>Современный рекрутмент характеризуется высокой нагрузкой на этапе первичного отбора кандидатов. В корпоративной практике на одну вакансию может поступать значительное число откликов, поэтому ручной анализ всех резюме становится трудозатратным и плохо масштабируемым процессом. В этих условиях особую роль приобретают системы управления кандидатами — Applicant Tracking Systems, ATS, которые позволяют хранить данные о вакансиях и кандидатах, управлять стадиями воронки найма, фиксировать результаты рассмотрения откликов и поддерживать принятие решений рекрутером [2].</w:t>
+        <w:t>Современный рекрутмент характеризуется высокой нагрузкой на этапе первичного отбора кандидатов. В корпоративной практике на одну вакансию может поступать значительное число откликов, поэтому ручной анализ всех резюме становится трудозатратным и плохо масштабируемым процессом. В этих условиях особую роль приобретают системы автоматизированного управления подбором персонала (Applicant Tracking System), которые позволяют хранить данные о вакансиях и кандидатах, управлять стадиями воронки найма, фиксировать результаты рассмотрения откликов и поддерживать принятие решений рекрутером [2].</w:t>
       </w:r>
     </w:p>
     <w:p ns2:paraId="11BA2E5C" ns2:textId="76D8A3E0">
@@ -2218,7 +1651,7 @@
         </w:rPr>
       </w:pPr>
       <w:r>
-        <w:t>Одной из ключевых задач ATS является ранжирование кандидатов относительно конкретной вакансии. В такой постановке описание вакансии или набор требований к позиции можно рассматривать как запрос, а резюме кандидатов — как документы, которые необходимо упорядочить по степени релевантности [2, 3]. При этом задача отличается от классического информационного поиска: результат ранжирования влияет не только на удобство работы пользователя, но и на видимость кандидатов в процессе найма. Кандидаты, оказавшиеся в верхней части списка, получают больше внимания со стороны рекрутера, тогда как релевантные профили на нижних позициях могут быть фактически не рассмотрены. Поэтому для систем автоматизированного отбора важны не только точность ранжирования и производительность, но и воспроизводимость оценки, интерпретируемость результата и контроль ограничений применяемого алгоритма [2, 16].</w:t>
+        <w:t>Одной из ключевых задач системы автоматизированного управления подбором персонала является ранжирование кандидатов относительно конкретной вакансии. В такой постановке описание вакансии или набор требований к позиции можно рассматривать как запрос, а резюме кандидатов — как документы, которые необходимо упорядочить по степени релевантности [2, 3]. При этом задача отличается от классического информационного поиска: результат ранжирования влияет не только на удобство работы пользователя, но и на видимость кандидатов в процессе найма. Кандидаты, оказавшиеся в верхней части списка, получают больше внимания со стороны рекрутера, тогда как релевантные профили на нижних позициях могут быть фактически не рассмотрены. Поэтому для систем автоматизированного отбора важны не только точность ранжирования и производительность, но и воспроизводимость оценки, интерпретируемость результата и контроль ограничений применяемого алгоритма [2, 16].</w:t>
       </w:r>
     </w:p>
     <w:p ns2:paraId="1254DF00" ns2:textId="3CC1EE1D">
@@ -2229,11 +1662,7 @@
         </w:rPr>
       </w:pPr>
       <w:r>
-        <w:t xml:space="preserve">Актуальность работы обусловлена необходимостью разработки программных модулей, способных выполнять семантическое сопоставление вакансий и резюме на основе современных методов обработки естественного языка. Традиционные подходы, основанные на ключевых словах и простом совпадении терминов, не всегда позволяют корректно учитывать смысловую близость текстов, различия в формулировках требований и описаний опыта, а также неполноту данных в резюме. Использование нейросетевых моделей представления текста, в частности BERT и Sentence-BERT, позволяет перейти от лексического сравнения к сравнению плотных векторных представлений, что делает возможным более гибкое ранжирование кандидатов [5, 6]. Вместе с тем применение таких моделей в контуре ATS требует не только выбора архитектуры, но и подготовки данных, </w:t>
-      </w:r>
-      <w:r>
-        <w:lastRenderedPageBreak/>
-        <w:t>построения воспроизводимого пайплайна обучения, реализации API-интеграции и экспериментальной проверки качества.</w:t>
+        <w:t>Актуальность работы обусловлена необходимостью разработки программных модулей, способных выполнять семантическое сопоставление вакансий и резюме на основе современных методов обработки естественного языка. Традиционные подходы, основанные на ключевых словах и простом совпадении терминов, не всегда позволяют корректно учитывать смысловую близость текстов, различия в формулировках требований и описаний опыта, а также неполноту данных в резюме. Использование нейросетевых моделей представления текста, в частности BERT и Sentence-BERT, позволяет перейти от лексического сравнения к сравнению плотных векторных представлений, что делает возможным более гибкое ранжирование кандидатов [5, 6]. Вместе с тем применение таких моделей в контуре системы автоматизированного управления подбором персонала требует не только выбора архитектуры, но и подготовки данных, построения воспроизводимого пайплайна обучения, реализации API-интеграции и экспериментальной проверки качества.</w:t>
       </w:r>
     </w:p>
     <w:p ns2:paraId="3E3867A4" ns2:textId="5359F2BC">
@@ -2244,7 +1673,7 @@
         </w:rPr>
       </w:pPr>
       <w:r>
-        <w:t>Целью работы является разработка и экспериментальная проверка прототипа модуля семантического сопоставления пары «вакансия–резюме» для интеграции в ATS-систему.</w:t>
+        <w:t>Целью работы является разработка и экспериментальная проверка прототипа модуля семантического сопоставления пары «вакансия–резюме» для интеграции в систему автоматизированного управления подбором персонала.</w:t>
       </w:r>
     </w:p>
     <w:p ns2:paraId="5D233372" ns2:textId="53FAB0B5">
@@ -2268,7 +1697,7 @@
         </w:numPr>
       </w:pPr>
       <w:r>
-        <w:t>Выполнить анализ предметной области рекрутмента, процессов найма, ATS-систем и существующих подходов к ранжированию кандидатов.</w:t>
+        <w:t>Выполнить анализ предметной области рекрутмента, процессов найма, систем автоматизированного управления подбором персонала и существующих подходов к ранжированию кандидатов.</w:t>
       </w:r>
     </w:p>
     <w:p ns2:paraId="14FBDC46" ns2:textId="77777777">
@@ -2307,7 +1736,7 @@
         </w:numPr>
       </w:pPr>
       <w:r>
-        <w:t>Спроектировать контур подготовки данных, включающий очистку, деидентификацию, формирование текстовых представлений и разметку пар «вакансия–резюме» на основе исторических HR-событий.</w:t>
+        <w:t>Спроектировать этап подготовки данных, включающий очистку, деидентификацию, формирование текстовых представлений и разметку пар «вакансия–резюме» на основе исторических HR-событий.</w:t>
       </w:r>
     </w:p>
     <w:p ns2:paraId="7CD0D99C" ns2:textId="77777777">
@@ -2349,7 +1778,7 @@
         </w:rPr>
       </w:pPr>
       <w:r>
-        <w:t>Проверить возможность интеграции разработанного модуля с тестовым контуром ATS Reqcore и оценить практическую эффективность использования подхода независимого энкодера (bi-encoder) для предварительного отбора кандидатов.</w:t>
+        <w:t>Проверить возможность интеграции разработанного модуля с тестовым контуром Reqcore и оценить практическую эффективность использования подхода независимого энкодера (bi-encoder) для предварительного отбора кандидатов.</w:t>
       </w:r>
     </w:p>
     <w:p ns2:paraId="5D6DAB4C" ns2:textId="30E0C0D0">
@@ -2360,7 +1789,7 @@
         </w:rPr>
       </w:pPr>
       <w:r>
-        <w:t>Объектом исследования являются процессы автоматизированного сопоставления вакансий и резюме в ATS-системах.</w:t>
+        <w:t>Объектом исследования являются процессы автоматизированного сопоставления вакансий и резюме в системах управления подбором персонала.</w:t>
       </w:r>
     </w:p>
     <w:p ns2:paraId="7320BBC6" ns2:textId="1F203011">
@@ -2371,7 +1800,7 @@
         </w:rPr>
       </w:pPr>
       <w:r>
-        <w:t>Предметом исследования являются методы семантического кодирования текстов вакансий и резюме, алгоритмы вычисления меры релевантности и программная архитектура интеграции модуля ранжирования в ATS.</w:t>
+        <w:t>Предметом исследования являются методы семантического кодирования текстов вакансий и резюме, алгоритмы вычисления меры релевантности и программная архитектура интеграции модуля ранжирования в систему автоматизированного управления подбором персонала.</w:t>
       </w:r>
     </w:p>
     <w:p ns2:paraId="62693E45" ns2:textId="4869D514">
@@ -2397,7 +1826,7 @@
         </w:rPr>
       </w:pPr>
       <w:r>
-        <w:t>Теоретическая значимость работы состоит в систематизации подходов к семантическому ранжированию кандидатов, рассмотрении применимости методов Learning to Rank, BERT и Sentence-BERT к задаче рекрутмента, а также в определении ограничений архитектуры независимого энкодера (bi-encoder) при использовании в ATS-сценариях. В работе отдельно фиксируются границы применимости разработанного решения: текущий прототип предназначен для числового семантического скоринга и предварительного отбора кандидатов, но не заменяет полноценную экспертную или LLM-интерпретацию причин соответствия кандидата вакансии.</w:t>
+        <w:t>Теоретическая значимость работы состоит в систематизации подходов к семантическому ранжированию кандидатов, рассмотрении применимости методов Learning to Rank, BERT и Sentence-BERT к задаче рекрутмента, а также в определении ограничений архитектуры независимого энкодера (bi-encoder) при использовании в сценариях автоматизированного подбора персонала. В работе отдельно фиксируются границы применимости разработанного решения: текущий прототип предназначен для числового семантического скоринга и предварительного отбора кандидатов, но не заменяет полноценную экспертную или LLM-интерпретацию причин соответствия кандидата вакансии.</w:t>
       </w:r>
     </w:p>
     <w:p ns2:paraId="2F2DCE77" ns2:textId="0891AB48">
@@ -2408,7 +1837,7 @@
         </w:rPr>
       </w:pPr>
       <w:r>
-        <w:t>Практическая значимость работы заключается в разработке прототипа ML-модуля, который может использоваться в ATS для предварительного ранжирования кандидатов. В рамках работы реализованы подготовка данных, дообучение модели cointegrated/rubert-tiny2, модуль ранжирования, FastAPI-сервис и интеграция с тестовым контуром ATS Reqcore. Такой модуль может применяться как первый этап отбора: он позволяет быстро получить числовую оценку соответствия кандидата вакансии и сократить число профилей, передаваемых на более дорогую экспертную или LLM-оценку.</w:t>
+        <w:t>Практическая значимость работы заключается в разработке прототипа ML-модуля, который может использоваться в системе автоматизированного управления подбором персонала для предварительного ранжирования кандидатов. В рамках работы реализованы подготовка данных, доменная настройка модели `cointegrated/rubert-tiny2`, модуль ранжирования, сервис HTTP API на Python-фреймворке FastAPI и интеграция с тестовым контуром Reqcore. Такой модуль может применяться как первый этап отбора: он позволяет быстро получить числовую оценку соответствия кандидата вакансии и сократить число профилей, передаваемых на более дорогую экспертную или LLM-оценку.</w:t>
       </w:r>
     </w:p>
     <w:p ns2:paraId="0EDA70A2" ns2:textId="79E95C95">
@@ -2427,10 +1856,7 @@
         <w:keepNext/>
       </w:pPr>
       <w:r>
-        <w:t>Работа состоит из введения, четырех разделов, заключения и списка использованных источников. В первом разделе рассматриваются предметная область рекрутмента, ATS-системы, методы NLP и архитектуры семантического ранжирования. Во втором разделе описываются проектирование данных, архитектура обработки и интеграция с ATS. В третьем разделе приводится описание реализации модуля семантического ранжирования, подготовки обучающих данных, дообучения модели и API-сервиса. В четвертом разделе выполняется экспериментальная оценка качества модели, рассматривается интеграция с Reqcore и анализируется практическая эффективность применения подхода независимого энкодера (bi-encoder). В заключении формулируются основные результаты работы, ограничения текущей реализации и направления дальнейшего развития.</w:t>
-      </w:r>
-      <w:r>
-        <w:br w:type="page"/>
+        <w:t>Работа состоит из введения, четырех разделов, заключения и списка использованных источников. В первом разделе рассматриваются предметная область рекрутмента, системы автоматизированного управления подбором персонала, методы NLP и архитектуры семантического ранжирования. Во втором разделе описываются проектирование данных, архитектура обработки и интеграция с Reqcore. В третьем разделе приводится описание реализации модуля сопоставления вакансий и резюме для ранжирования кандидатов, подготовки обучающих данных, доменной настройки модели и API-сервиса. В четвертом разделе выполняется экспериментальная оценка качества модели, рассматривается интеграция с Reqcore и анализируется практическая эффективность применения подхода независимого энкодера (bi-encoder). В заключении формулируются основные результаты работы, ограничения текущей реализации и направления дальнейшего развития.</w:t>
       </w:r>
     </w:p>
     <w:p ns2:paraId="5AA0D662" ns2:textId="77777777">
@@ -2452,15 +1878,13 @@
       <w:pPr>
         <w:pStyle w:val="2"/>
       </w:pPr>
-      <w:bookmarkStart w:id="4" w:name="_Toc230211047"/>
-      <w:r>
-        <w:t>1.1 Системный анализ предметной области рекрутмента, процессов найма и ATS-систем</w:t>
-      </w:r>
-      <w:bookmarkEnd w:id="4"/>
+      <w:r>
+        <w:t>1.1 Системный анализ предметной области рекрутмента, процессов найма и систем автоматизированного управления подбором персонала</w:t>
+      </w:r>
     </w:p>
     <w:p ns2:paraId="1C4739E1" ns2:textId="77777777">
       <w:r>
-        <w:t>Являясь программным ядром современного рекрутинга, системы класса ATS поддерживают как минимум два критически важных и взаимосвязанных процесса: управление воронкой найма (от формирования лонг-листа к шорт-листу) и поддержку принятия решений посредством ранжирования и фильтрации больших пулов кандидатов [2].</w:t>
+        <w:t>Являясь программным ядром современного рекрутинга, системы автоматизированного управления подбором персонала поддерживают как минимум два критически важных и взаимосвязанных процесса: управление воронкой найма (от формирования лонг-листа к шорт-листу) и поддержку принятия решений посредством ранжирования и фильтрации больших пулов кандидатов [2].</w:t>
       </w:r>
     </w:p>
     <w:p ns2:paraId="73842681" ns2:textId="77777777">
@@ -2483,822 +1907,580 @@
     </w:p>
     <w:p ns2:paraId="2FC624CA" ns2:textId="77777777">
       <w:r>
-        <w:t xml:space="preserve">Практический эффект алгоритмов ранжирования на </w:t>
-      </w:r>
-      <w:commentRangeStart w:id="6"/>
-      <w:r>
-        <w:t>популяцию кандидатов</w:t>
-      </w:r>
-      <w:commentRangeEnd w:id="6"/>
+        <w:t>Практический эффект алгоритмов ранжирования на популяцию кандидатов объясняется преимущественно моделью просмотра списков: позиции, находящиеся в топе выдачи, получают непропорционально большую долю внимания (экспозицию). В контексте управления персоналом данный эффект способен многократно усиливать различия между группами соискателей даже при незначительных отличиях в исходных оценках релевантности [2]. Таким образом, справедливость подобных систем зависит не только от лежащего в их основе алгоритма, но и от интерфейса самой системы подбора, а также от стратегии просмотра списков пользователем [2].</w:t>
+      </w:r>
+    </w:p>
+    <w:p ns2:paraId="5F7E3205" ns2:textId="77777777">
+      <w:r>
+        <w:t>Исторически инструменты, ориентированные на интеграцию с системами автоматизированного подбора персонала и автоматизацию процессов отбора, чаще всего использовали методы извлечения структурированных атрибутов (навыков, стажа, образования), механизмы фасетного поиска и техники ранжирования из арсенала классического информационного поиска. Характерным примером подобного подхода может служить система PROSPECT, позиционируемая как система поддержки принятия решений. Данный комплекс извлекает ключевые аспекты профиля кандидата, представляет их в виде фасетов и применяет алгоритмы информационного поиска для ранжирования соискателей относительно требований вакансии. В экспериментальной части исследования авторы отмечают, что использование выявленной структурированной информации повысило качество ранжирования на 30% [3].</w:t>
+      </w:r>
+    </w:p>
+    <w:p ns2:paraId="0751E574" ns2:textId="77777777">
+      <w:r>
+        <w:t>Современная эволюция систем рекрутмента характеризуется переходом к семантическому сопоставлению кандидатов на базе плотных векторных представлений (эмбеддингов) и к обучению ранжирующих моделей на основе поведенческой обратной связи (кликов, конверсий на следующие этапы, фактов найма). Современные индустриальные решения используют конвейеры многозадачного обучения, а также алгоритмы на базе больших языковых моделей (LLM) для более глубокого анализа требований вакансии. В частности, передовые архитектуры включают трехступенчатый процесс поиска талантов (</w:t>
+      </w:r>
+      <w:commentRangeStart w:id="11"/>
+      <w:r>
+        <w:t>отбор кандидатов, предварительное ранжирование, окончательное переранжирование</w:t>
+      </w:r>
+      <w:commentRangeEnd w:id="11"/>
       <w:r>
         <w:rPr>
           <w:rStyle w:val="ac"/>
           <w:sz w:val="24"/>
           <w:szCs w:val="24"/>
         </w:rPr>
-        <w:commentReference w:id="6"/>
-      </w:r>
-      <w:r>
-        <w:t xml:space="preserve"> объясняется преимущественно моделью просмотра списков: позиции, находящиеся в топе выдачи, получают </w:t>
-      </w:r>
-      <w:commentRangeStart w:id="7"/>
-      <w:r>
-        <w:t>непропорционально большую долю внимания (экспозицию).</w:t>
-      </w:r>
-      <w:commentRangeEnd w:id="7"/>
+        <w:commentReference w:id="11"/>
+      </w:r>
+      <w:r>
+        <w:t xml:space="preserve">), применяют LLM для извлечения тонких предпочтений рекрутера из текстовых описаний позиций и истории закрытия вакансий, а также </w:t>
+      </w:r>
+      <w:commentRangeStart w:id="12"/>
+      <w:r>
+        <w:t>задействуют модели класса mixture-of-experts</w:t>
+      </w:r>
+      <w:commentRangeEnd w:id="12"/>
       <w:r>
         <w:rPr>
           <w:rStyle w:val="ac"/>
           <w:sz w:val="24"/>
           <w:szCs w:val="24"/>
         </w:rPr>
-        <w:commentReference w:id="7"/>
-      </w:r>
-      <w:r>
-        <w:t xml:space="preserve"> В контексте управления персоналом данный эффект способен многократно усиливать различия между группами соискателей даже при незначительных отличиях в исходных оценках релевантности [2]. Таким образом, </w:t>
-      </w:r>
-      <w:commentRangeStart w:id="8"/>
-      <w:r>
-        <w:t xml:space="preserve">справедливость </w:t>
-      </w:r>
-      <w:commentRangeEnd w:id="8"/>
+        <w:commentReference w:id="12"/>
+      </w:r>
+      <w:r>
+        <w:t xml:space="preserve"> с учетом специфики конкретной роли [17].</w:t>
+      </w:r>
+    </w:p>
+    <w:p ns2:paraId="6BDC3B60" ns2:textId="77777777">
+      <w:r>
+        <w:t>В контексте настоящего исследования целевая система автоматизированного управления подбором персонала рассматривается как программная среда, для работы внутри которой разрабатываемый модуль должен выполнять следующие функции: 1) принимать на вход текстовое описание вакансии и пул кандидатов; 2) вычислять меру семантической близости и осуществлять эффективное ранжирование; 3) обеспечивать объяснимость результатов выдачи (минимально — через сопоставление извлеченных навыков и атрибутов); 4) предоставлять верифицируемую оценку качества работы [2, 23].</w:t>
+      </w:r>
+    </w:p>
+    <w:p ns2:paraId="7ADEC077" ns2:textId="77777777">
+      <w:pPr>
+        <w:pStyle w:val="2"/>
+        <w:rPr>
+          <w:highlight w:val="yellow"/>
+        </w:rPr>
+      </w:pPr>
+      <w:bookmarkStart w:id="13" w:name="_Toc230211048"/>
+      <w:r>
+        <w:t>1.2 Аналитический обзор методов обработки естественного языка (NLP) и алгоритмов машинного обучения (Learning to Rank)</w:t>
+      </w:r>
+      <w:bookmarkEnd w:id="13"/>
+    </w:p>
+    <w:p ns2:paraId="4E8A9954" ns2:textId="77777777">
+      <w:r>
+        <w:t>Для решения задач сопоставления текстов вакансий и резюме традиционно применяются различные семейства методов представления и сравнения текстовой информации: лексические модели (такие как TF-IDF), вероятностные ранжирующие функции (в частности BM25), а в последнее время — нейросетевые семантические вложения на базе трансформеров. В классической вероятностной парадигме функция BM25 зарекомендовала себя как надежная базовая метрика информационного поиска. Связь показателя релевантности с вероятностными предпосылками, параметрами насыщения частоты термина (tf) и нормализацией по длине документа критически важна для текстов вакансий и резюме, поскольку они зачастую существенно различаются по объему и стилистике [11]. В современных системах поиска информации и рекомендаций (в том числе построенных на методологии Learning to Rank) метрика BM25 по-прежнему служит мощным и устойчивым ориентиром; при интеграции нейросетевых алгоритмов ранжирования в контур системы автоматизированного подбора персонала требуется наличие воспроизводимой классической базовой линии для проведения сравнительного анализа [8, 11].</w:t>
+      </w:r>
+    </w:p>
+    <w:p ns2:paraId="36290E59" ns2:textId="77777777">
+      <w:r>
+        <w:t xml:space="preserve">Методология обучения ранжированию (Learning to Rank, LTR) формализует процесс построения оптимальной ранжирующей функции по заранее размеченным данным (уровням релевантности или </w:t>
+      </w:r>
+      <w:commentRangeStart w:id="15"/>
+      <w:r>
+        <w:t>картам предпочтений</w:t>
+      </w:r>
+      <w:commentRangeEnd w:id="15"/>
       <w:r>
         <w:rPr>
           <w:rStyle w:val="ac"/>
           <w:sz w:val="24"/>
           <w:szCs w:val="24"/>
         </w:rPr>
-        <w:commentReference w:id="8"/>
-      </w:r>
-      <w:r>
-        <w:t>подобных систем зависит не только от лежащего в их основе алгоритма, но и от интерфейса самой ATS, а также от стратегии просмотра списков пользователем [2].</w:t>
-      </w:r>
-    </w:p>
-    <w:p ns2:paraId="5F7E3205" ns2:textId="77777777">
-      <w:r>
-        <w:t xml:space="preserve">Исторически инструменты, ориентированные на интеграцию с ATS и автоматизацию процессов отбора, чаще всего использовали методы извлечения структурированных атрибутов (навыков, стажа, образования), механизмы </w:t>
-      </w:r>
-      <w:commentRangeStart w:id="9"/>
-      <w:r>
-        <w:t>фасетного поиска</w:t>
-      </w:r>
-      <w:commentRangeEnd w:id="9"/>
+        <w:commentReference w:id="15"/>
+      </w:r>
+      <w:r>
+        <w:t xml:space="preserve">). </w:t>
+      </w:r>
+      <w:commentRangeStart w:id="16"/>
+      <w:r>
+        <w:t>Общепринято классифицировать алгоритмы LTR на три основные группы: поточечный подход (pointwise, сводящийся к регрессии или классификации по отдельным объектам), попарный подход (pairwise, обучающийся предсказывать предпочтения между двумя документами) и списочный подход (listwise, оптимизирующий функцию потерь непосредственно на всем списке документов на основе ранжирующих метрик) [8]</w:t>
+      </w:r>
+      <w:commentRangeEnd w:id="16"/>
       <w:r>
         <w:rPr>
           <w:rStyle w:val="ac"/>
           <w:sz w:val="24"/>
           <w:szCs w:val="24"/>
         </w:rPr>
-        <w:commentReference w:id="9"/>
-      </w:r>
-      <w:r>
-        <w:t xml:space="preserve"> и техники ранжирования из арсенала классического информационного поиска. Характерным примером подобного подхода может служить </w:t>
-      </w:r>
-      <w:commentRangeStart w:id="10"/>
-      <w:r>
-        <w:t>система PROSPECT</w:t>
-      </w:r>
-      <w:commentRangeEnd w:id="10"/>
+        <w:commentReference w:id="16"/>
+      </w:r>
+      <w:r>
+        <w:t xml:space="preserve">. Классическим примером попарного подхода выступает </w:t>
+      </w:r>
+      <w:commentRangeStart w:id="17"/>
+      <w:r>
+        <w:t>архитектура RankNet</w:t>
+      </w:r>
+      <w:commentRangeEnd w:id="17"/>
       <w:r>
         <w:rPr>
           <w:rStyle w:val="ac"/>
           <w:sz w:val="24"/>
           <w:szCs w:val="24"/>
         </w:rPr>
-        <w:commentReference w:id="10"/>
-      </w:r>
-      <w:r>
-        <w:t xml:space="preserve">, позиционируемая как система поддержки принятия решений. Данный комплекс извлекает ключевые аспекты профиля кандидата, представляет их в виде фасетов и применяет алгоритмы информационного поиска для ранжирования соискателей относительно </w:t>
-      </w:r>
-      <w:r>
-        <w:lastRenderedPageBreak/>
-        <w:t>требований вакансии. В экспериментальной части исследования авторы отмечают, что использование выявленной структурированной информации повысило качество ранжирования на 30% [3].</w:t>
-      </w:r>
-    </w:p>
-    <w:p ns2:paraId="0751E574" ns2:textId="77777777">
-      <w:r>
-        <w:t>Современная эволюция систем рекрутмента характеризуется переходом к семантическому сопоставлению кандидатов на базе плотных векторных представлений (эмбеддингов) и к обучению ранжирующих моделей на основе поведенческой обратной связи (кликов, конверсий на следующие этапы, фактов найма). Современные индустриальные решения используют конвейеры многозадачного обучения, а также алгоритмы на базе больших языковых моделей (LLM) для более глубокого анализа требований вакансии. В частности, передовые архитектуры включают трехступенчатый процесс поиска талантов (</w:t>
-      </w:r>
-      <w:commentRangeStart w:id="11"/>
-      <w:r>
-        <w:t>отбор кандидатов, предварительное ранжирование, окончательное переранжирование</w:t>
-      </w:r>
-      <w:commentRangeEnd w:id="11"/>
+        <w:commentReference w:id="17"/>
+      </w:r>
+      <w:r>
+        <w:t xml:space="preserve">, </w:t>
+      </w:r>
+      <w:commentRangeStart w:id="18"/>
+      <w:r>
+        <w:t xml:space="preserve">в рамках которой задается вероятностная модель предпочтения между парой объектов исходя из разности их индивидуальных оценок, после чего минимизируется кросс-энтропийная ошибка функции потерь </w:t>
+      </w:r>
+      <w:commentRangeStart w:id="19"/>
+      <w:r>
+        <w:t>логистического связывания</w:t>
+      </w:r>
+      <w:commentRangeEnd w:id="18"/>
       <w:r>
         <w:rPr>
           <w:rStyle w:val="ac"/>
           <w:sz w:val="24"/>
           <w:szCs w:val="24"/>
         </w:rPr>
-        <w:commentReference w:id="11"/>
-      </w:r>
-      <w:r>
-        <w:t xml:space="preserve">), применяют LLM для извлечения тонких предпочтений рекрутера из текстовых описаний позиций и истории закрытия вакансий, а также </w:t>
-      </w:r>
-      <w:commentRangeStart w:id="12"/>
-      <w:r>
-        <w:t>задействуют модели класса mixture-of-experts</w:t>
-      </w:r>
-      <w:commentRangeEnd w:id="12"/>
+        <w:commentReference w:id="18"/>
+      </w:r>
+      <w:commentRangeEnd w:id="19"/>
       <w:r>
         <w:rPr>
           <w:rStyle w:val="ac"/>
           <w:sz w:val="24"/>
           <w:szCs w:val="24"/>
         </w:rPr>
-        <w:commentReference w:id="12"/>
-      </w:r>
-      <w:r>
-        <w:t xml:space="preserve"> с учетом специфики конкретной роли [17].</w:t>
-      </w:r>
-    </w:p>
-    <w:p ns2:paraId="6BDC3B60" ns2:textId="77777777">
-      <w:r>
-        <w:t>В контексте настоящего исследования целевая ATS рассматривается как программная среда, для работы внутри которой разрабатываемый модуль должен выполнять следующие функции: 1) принимать на вход текстовое описание вакансии и пул кандидатов; 2) вычислять меру семантической близости и осуществлять эффективное ранжирование; 3) обеспечивать объяснимость результатов выдачи (минимально — через сопоставление извлеченных навыков и атрибутов); 4) предоставлять верифицируемую оценку качества работы [2, 23].</w:t>
-      </w:r>
-    </w:p>
-    <w:p ns2:paraId="7ADEC077" ns2:textId="77777777">
-      <w:pPr>
-        <w:pStyle w:val="2"/>
-        <w:rPr>
-          <w:highlight w:val="yellow"/>
-        </w:rPr>
-      </w:pPr>
-      <w:bookmarkStart w:id="13" w:name="_Toc230211048"/>
-      <w:r>
-        <w:t>1.2 Аналитический обзор методов обработки естественного языка (NLP) и алгоритмов машинного обучения (Learning to Rank)</w:t>
-      </w:r>
-      <w:bookmarkEnd w:id="13"/>
-    </w:p>
-    <w:p ns2:paraId="4E8A9954" ns2:textId="77777777">
-      <w:r>
-        <w:t xml:space="preserve">Для решения задач сопоставления текстов вакансий и резюме традиционно применяются различные семейства методов представления и сравнения текстовой информации: лексические модели (такие как TF-IDF), вероятностные ранжирующие функции (в частности BM25), а в последнее время — </w:t>
-      </w:r>
-      <w:commentRangeStart w:id="14"/>
-      <w:r>
-        <w:t>нейросетевые семантические вложения на базе трансформеров</w:t>
-      </w:r>
-      <w:commentRangeEnd w:id="14"/>
+        <w:commentReference w:id="19"/>
+      </w:r>
+      <w:r>
+        <w:t>. Главное практическое преимущество подобных методов заключается в их дифференцируемости и встроенной совместимости с нейросетевыми архитектурами [9].</w:t>
+      </w:r>
+    </w:p>
+    <w:p ns2:paraId="60183636" ns2:textId="77777777">
+      <w:r>
+        <w:t xml:space="preserve">Ключевым аспектом LTR является оценка качества получаемого ранжирования. Такие метрики, как </w:t>
+      </w:r>
+      <w:commentRangeStart w:id="20"/>
+      <w:r>
+        <w:t>дисконтированная кумулятивная выгода (DCG)</w:t>
+      </w:r>
+      <w:commentRangeEnd w:id="20"/>
       <w:r>
         <w:rPr>
           <w:rStyle w:val="ac"/>
           <w:sz w:val="24"/>
           <w:szCs w:val="24"/>
         </w:rPr>
-        <w:commentReference w:id="14"/>
-      </w:r>
-      <w:r>
-        <w:t xml:space="preserve">. В классической вероятностной парадигме функция BM25 зарекомендовала себя как надежная базовая метрика информационного поиска. Связь показателя релевантности с вероятностными предпосылками, параметрами насыщения частоты термина (tf) и нормализацией по длине документа критически важна для текстов вакансий и резюме, поскольку они зачастую существенно различаются по объему и стилистике [11]. В современных системах поиска информации и рекомендаций (в том числе построенных на методологии Learning to Rank) метрика BM25 по-прежнему служит мощным и устойчивым ориентиром; при интеграции нейросетевых алгоритмов </w:t>
-      </w:r>
-      <w:r>
-        <w:lastRenderedPageBreak/>
-        <w:t>ранжирования в контур ATS требуется наличие воспроизводимой классической базовой линии для проведения сравнительного анализа [8, 11].</w:t>
-      </w:r>
-    </w:p>
-    <w:p ns2:paraId="36290E59" ns2:textId="77777777">
-      <w:r>
-        <w:t xml:space="preserve">Методология обучения ранжированию (Learning to Rank, LTR) формализует процесс построения оптимальной ранжирующей функции по заранее размеченным данным (уровням релевантности или </w:t>
-      </w:r>
-      <w:commentRangeStart w:id="15"/>
-      <w:r>
-        <w:t>картам предпочтений</w:t>
-      </w:r>
-      <w:commentRangeEnd w:id="15"/>
+        <w:commentReference w:id="20"/>
+      </w:r>
+      <w:r>
+        <w:t xml:space="preserve"> и нормализованная дисконтированная кумулятивная выгода (NDCG), не только учитывают градуированный уровень релевантности, но и </w:t>
+      </w:r>
+      <w:commentRangeStart w:id="21"/>
+      <w:r>
+        <w:t>применяют прогрессивный дисконт в зависимости от занятой позиции</w:t>
+      </w:r>
+      <w:commentRangeEnd w:id="21"/>
       <w:r>
         <w:rPr>
           <w:rStyle w:val="ac"/>
           <w:sz w:val="24"/>
           <w:szCs w:val="24"/>
         </w:rPr>
-        <w:commentReference w:id="15"/>
-      </w:r>
-      <w:r>
-        <w:t xml:space="preserve">). </w:t>
-      </w:r>
-      <w:commentRangeStart w:id="16"/>
-      <w:r>
-        <w:t>Общепринято классифицировать алгоритмы LTR на три основные группы: поточечный подход (pointwise, сводящийся к регрессии или классификации по отдельным объектам), попарный подход (pairwise, обучающийся предсказывать предпочтения между двумя документами) и списочный подход (listwise, оптимизирующий функцию потерь непосредственно на всем списке документов на основе ранжирующих метрик) [8]</w:t>
-      </w:r>
-      <w:commentRangeEnd w:id="16"/>
+        <w:commentReference w:id="21"/>
+      </w:r>
+      <w:r>
+        <w:t xml:space="preserve">, что полностью согласуется с когнитивным эффектом позиционного смещения при просмотре списков пользователем [10]. В прикладной сфере рекрутмента метрики семейства NDCG признаются наиболее подходящими, так как </w:t>
+      </w:r>
+      <w:commentRangeStart w:id="22"/>
+      <w:r>
+        <w:t>HR-специалисты редко просматривают весь перечень соискателей целиком: релевантность первых позиций ранжирования имеет прямое влияние на итоговый результат набора [2, 16]</w:t>
+      </w:r>
+      <w:commentRangeEnd w:id="22"/>
       <w:r>
         <w:rPr>
           <w:rStyle w:val="ac"/>
           <w:sz w:val="24"/>
           <w:szCs w:val="24"/>
         </w:rPr>
-        <w:commentReference w:id="16"/>
-      </w:r>
-      <w:r>
-        <w:t xml:space="preserve">. Классическим примером попарного подхода выступает </w:t>
-      </w:r>
-      <w:commentRangeStart w:id="17"/>
-      <w:r>
-        <w:t>архитектура RankNet</w:t>
-      </w:r>
-      <w:commentRangeEnd w:id="17"/>
+        <w:commentReference w:id="22"/>
+      </w:r>
+      <w:r>
+        <w:t>.</w:t>
+      </w:r>
+    </w:p>
+    <w:p ns2:paraId="1BE49335" ns2:textId="77777777">
+      <w:r>
+        <w:t>Самостоятельным фундаментальным направлением исследований алгоритмов машинного обучения выступает обеспечение справедливости ранжирования (fairness in ranking). В подобных формулировках основной акцент делается на распределении экспозиции как ограниченного ресурса. Применяются ограничения на долю экспозиции в зависимости от объективных достоинств кандидата, с оптимизацией метрики полезности (например, алгоритмы policy-gradient могут оптимизировать NDCG при условии выполнения заданных критериев справедливости) [16]. Для архитектуры системы подбора персонала это представляет значительную концептуальную ценность: вероятность найма кандидата напрямую зависит от занимаемой позиции, и даже незначительные перекосы в базовых скорингах способны резко изменить экспозицию [2, 16].</w:t>
+      </w:r>
+    </w:p>
+    <w:p ns2:paraId="2AF006B6" ns2:textId="77777777">
+      <w:pPr>
+        <w:pStyle w:val="2"/>
+      </w:pPr>
+      <w:bookmarkStart w:id="25" w:name="_Toc230211049"/>
+      <w:r>
+        <w:lastRenderedPageBreak/>
+        <w:t>1.3 Обоснование выбора архитектуры нейросетевых моделей (BERT, Sentence-BERT) и методов векторизации</w:t>
+      </w:r>
+      <w:bookmarkEnd w:id="25"/>
+    </w:p>
+    <w:p ns2:paraId="553E3F45" ns2:textId="77777777">
+      <w:r>
+        <w:t>Современным стандартом анализа семантики текста в области обработки естественного языка выступает архитектура трансформеров, механизм внимания которой позволяет эффективно моделировать смысловые зависимости внутри последовательностей токенов без использования классических сверточных или рекуррентных подходов [7]. На основе этой парадигмы архитектура BERT (Bidirectional Encoder Representations from Transformers) предложила инновационную схему двунаправленного предобучения я</w:t>
+      </w:r>
+      <w:commentRangeStart w:id="26"/>
+      <w:r>
+        <w:t>зыковых представлений</w:t>
+      </w:r>
+      <w:commentRangeEnd w:id="26"/>
       <w:r>
         <w:rPr>
           <w:rStyle w:val="ac"/>
           <w:sz w:val="24"/>
           <w:szCs w:val="24"/>
         </w:rPr>
-        <w:commentReference w:id="17"/>
-      </w:r>
-      <w:r>
-        <w:t xml:space="preserve">, </w:t>
-      </w:r>
-      <w:commentRangeStart w:id="18"/>
-      <w:r>
-        <w:t xml:space="preserve">в рамках которой задается вероятностная модель предпочтения между парой объектов исходя из разности их индивидуальных оценок, после чего минимизируется кросс-энтропийная ошибка функции потерь </w:t>
-      </w:r>
-      <w:commentRangeStart w:id="19"/>
-      <w:r>
-        <w:t>логистического связывания</w:t>
-      </w:r>
-      <w:commentRangeEnd w:id="18"/>
+        <w:commentReference w:id="26"/>
+      </w:r>
+      <w:r>
+        <w:t xml:space="preserve"> на больших объемах неразмеченных текстов с их последующим дообучением (fine-tuning) под прикладные задачи [5].</w:t>
+      </w:r>
+    </w:p>
+    <w:p ns2:paraId="500E1B06" ns2:textId="77777777">
+      <w:r>
+        <w:t>При решении задач семантического сопоставления пар «вакансия–резюме» важнейшим архитектурным решением является выбор между перекрестным энкодером (cross-encoder) и архитектурой независимого энкодера (bi-encoder). Перекрестный энкодер производит совместную контекстную обработку пары текстов сквозь всю сеть, требуя высоких вычислительных затрат на формирование предсказания. Независимый энкодер генерирует отдельные семантические вложения для каждого текста, после чего сравнивает их с помощью стандартной косинусной меры сходства или скалярного произведения. В основополагающей статье по Sentence-BERT (SBERT) подробно раскрыто ограничение перекрестных энкодеров: при использовании классического BERT попарное вычисление мер близости внутри большой базы приводит к непомерно высокому числу циклов инференса. Модели семейства SBERT модифицируют BERT в сиамскую или триплетную архитектуру для генерации оптимизированных вложений предложений, сравнимых напрямую. Это кардинально снижает вычислительные издержки вывода с сохранением высокого качества на бенчмарках семантического сходства текста [6].</w:t>
+      </w:r>
+    </w:p>
+    <w:p ns2:paraId="482F90AB" ns2:textId="77777777">
+      <w:r>
+        <w:t>В сценарии разработки для системы автоматизированного подбора персонала вышеупомянутые выводы делают рациональной реализацию архитектуры двухступенчатого ранжирования. Первая ступень — стадия выборки (recall), основанная на поиске по плотным вложениям через независимый энкодер для быстрого отбора топ-N кандидатов из глобальной базы. Вторая ступень — стадия переранжирования (re-rank), которая может осуществляться более ресурсоемкой моделью перекрестного энкодера либо строиться как отдельная LTR-надстройка над широким пулом признаков. Подобная логика построения конвейера явно задокументирована в передовых индустриальных исследованиях корпоративного поиска соискателей [17].</w:t>
+      </w:r>
+    </w:p>
+    <w:p ns2:paraId="63CDC1A4" ns2:textId="77777777">
+      <w:r>
+        <w:t xml:space="preserve">Эмпирическую применимость решения на базе SBERT к предметной области найма доказывает статья по архитектуре </w:t>
+      </w:r>
+      <w:commentRangeStart w:id="28"/>
+      <w:r>
+        <w:t>CareerBERT</w:t>
+      </w:r>
+      <w:commentRangeEnd w:id="28"/>
       <w:r>
         <w:rPr>
           <w:rStyle w:val="ac"/>
           <w:sz w:val="24"/>
           <w:szCs w:val="24"/>
         </w:rPr>
-        <w:commentReference w:id="18"/>
-      </w:r>
-      <w:commentRangeEnd w:id="19"/>
+        <w:commentReference w:id="28"/>
+      </w:r>
+      <w:r>
+        <w:t xml:space="preserve">: авторам удалось перевести резюме соискателей и описания вакансий в единое векторное пространство. Применялась сиамская </w:t>
+      </w:r>
+      <w:r>
+        <w:lastRenderedPageBreak/>
+        <w:t>нейросеть с функцией потерь попарного ранжирования (Multiple Negatives Ranking loss), формирующая пространство, в котором семантически связанные тексты предельно близки друг к другу, а нерелевантные отдалены [1].</w:t>
+      </w:r>
+    </w:p>
+    <w:p ns2:paraId="678AA264" ns2:textId="77777777">
+      <w:r>
+        <w:t>При работе с русскоязычными текстами дополнительными факторами выступают качество готовых весовых моделей для целевого языка, а также доступность референсных метрик бенчмарков. В современных публикациях вводится мультиязычный формат оценки Massive Text Embedding Benchmark для русского языка (ruMTEB), предлагаются базовые векторные модели (например, cointegrated/rubert-tiny2) и формализуются категории тестовых задач переранжирования, что имеет критическое значение для тестирования будущего модуля обработки отечественного контента [19, 20].</w:t>
+      </w:r>
+    </w:p>
+    <w:p ns2:paraId="4C84D329" ns2:textId="77777777">
+      <w:commentRangeStart w:id="29"/>
+      <w:r>
+        <w:t>Выбор методов векторизации обязательно должен учитывать риски алгоритмического смещения: аудиты в системах рекрутмента подтверждают, что использование только векторных эмбеддингов может провоцировать дискриминационные искажения результатов (по полу, расе, национальности и объему текстового профиля кандидата) [22].</w:t>
+      </w:r>
+      <w:r>
+        <w:br w:type="page"/>
+      </w:r>
+      <w:commentRangeEnd w:id="29"/>
       <w:r>
         <w:rPr>
           <w:rStyle w:val="ac"/>
           <w:sz w:val="24"/>
           <w:szCs w:val="24"/>
         </w:rPr>
-        <w:commentReference w:id="19"/>
-      </w:r>
-      <w:r>
-        <w:t>. Главное практическое преимущество подобных методов заключается в их дифференцируемости и встроенной совместимости с нейросетевыми архитектурами [9].</w:t>
-      </w:r>
-    </w:p>
-    <w:p ns2:paraId="60183636" ns2:textId="77777777">
-      <w:r>
-        <w:t xml:space="preserve">Ключевым аспектом LTR является оценка качества получаемого ранжирования. Такие метрики, как </w:t>
-      </w:r>
-      <w:commentRangeStart w:id="20"/>
-      <w:r>
-        <w:t>дисконтированная кумулятивная выгода (DCG)</w:t>
-      </w:r>
-      <w:commentRangeEnd w:id="20"/>
+        <w:commentReference w:id="29"/>
+      </w:r>
+    </w:p>
+    <w:p ns2:paraId="1EA596E6" ns2:textId="77777777">
+      <w:pPr>
+        <w:pStyle w:val="1"/>
+      </w:pPr>
+      <w:r>
+        <w:t>2 Проектирование данных, архитектуры обработки и интеграции с системой автоматизированного подбора персонала</w:t>
+      </w:r>
+    </w:p>
+    <w:p ns2:paraId="519AC893" ns2:textId="77777777">
+      <w:pPr>
+        <w:pStyle w:val="2"/>
+      </w:pPr>
+      <w:bookmarkStart w:id="31" w:name="_Toc230211051"/>
+      <w:r>
+        <w:t>2.1 Выполнение сбора, профилирования, очистки и разметки исходных данных (вакансии и резюме)</w:t>
+      </w:r>
+      <w:bookmarkEnd w:id="31"/>
+    </w:p>
+    <w:p ns2:paraId="3A0D9322" ns2:textId="77777777">
+      <w:r>
+        <w:t>Сбор текстовой информации в системе подбора персонала концептуально подразделяется на работу с двумя классами сущностей. С одной стороны, обрабатываются данные вакансий (должностные обязанности, формальные требования, стек технологий, условия труда). С другой стороны, обрабатываются резюме (развернутый опыт работы, ключевые навыки, наличие сертификатов, данные об образовании, стаж работы). Практика систематического извлечения данных аспектов для целей ранжирования была ранее описана как надежная основа первичной обработки соискателей [3].</w:t>
+      </w:r>
+    </w:p>
+    <w:p ns2:paraId="35D25020" ns2:textId="77777777">
+      <w:commentRangeStart w:id="34"/>
+      <w:r>
+        <w:t>Профилирование корпуса вакансий и резюме должно протоколировать распределение длины текста, долю шумовой или неформативной информации (маркетинговые блоки, универсальные фразы), плотность доменных терминов, процентную долю смысловых дубликатов, а также языковой состав.</w:t>
+      </w:r>
+      <w:commentRangeEnd w:id="34"/>
       <w:r>
         <w:rPr>
           <w:rStyle w:val="ac"/>
           <w:sz w:val="24"/>
           <w:szCs w:val="24"/>
         </w:rPr>
-        <w:commentReference w:id="20"/>
-      </w:r>
-      <w:r>
-        <w:t xml:space="preserve"> и нормализованная дисконтированная кумулятивная выгода (NDCG), не только учитывают градуированный уровень релевантности, но и </w:t>
-      </w:r>
-      <w:commentRangeStart w:id="21"/>
-      <w:r>
-        <w:t>применяют прогрессивный дисконт в зависимости от занятой позиции</w:t>
-      </w:r>
-      <w:commentRangeEnd w:id="21"/>
+        <w:commentReference w:id="34"/>
+      </w:r>
+      <w:r>
+        <w:t xml:space="preserve"> </w:t>
+      </w:r>
+      <w:commentRangeStart w:id="35"/>
+      <w:r>
+        <w:t>В контексте извлечения навыков из резюме существенной проблемой признаются границы определений терминологии: научные обзоры демонстрируют тенденцию к разнообразию в подходах к классификации и стандартизации доменных параметров HR, что обуславливает необходимость создания строгих внутренних регламентов и унификации метрик для разметки данных [18].</w:t>
+      </w:r>
+      <w:commentRangeEnd w:id="35"/>
       <w:r>
         <w:rPr>
           <w:rStyle w:val="ac"/>
           <w:sz w:val="24"/>
           <w:szCs w:val="24"/>
         </w:rPr>
-        <w:commentReference w:id="21"/>
-      </w:r>
-      <w:r>
-        <w:t xml:space="preserve">, что полностью согласуется с когнитивным эффектом позиционного смещения при просмотре списков пользователем [10]. В прикладной сфере рекрутмента метрики семейства NDCG признаются наиболее подходящими, так как </w:t>
-      </w:r>
-      <w:commentRangeStart w:id="22"/>
-      <w:r>
-        <w:t>HR-специалисты редко просматривают весь перечень соискателей целиком: релевантность первых позиций ранжирования имеет прямое влияние на итоговый результат набора [2, 16]</w:t>
-      </w:r>
-      <w:commentRangeEnd w:id="22"/>
+        <w:commentReference w:id="35"/>
+      </w:r>
+    </w:p>
+    <w:p ns2:paraId="6058AE1F" ns2:textId="77777777">
+      <w:r>
+        <w:t>Процедура разметки массива данных в рамках проекта протекает на нескольких уровнях:</w:t>
+      </w:r>
+    </w:p>
+    <w:p ns2:paraId="451CB494" ns2:textId="77777777">
+      <w:r>
+        <w:t xml:space="preserve">1. </w:t>
+      </w:r>
+      <w:commentRangeStart w:id="36"/>
+      <w:r>
+        <w:t>Разметка глобальной релевантности пар «вакансия–резюме» для последующего обучения ранжирующих моделей и контроля качества по NDCG.</w:t>
+      </w:r>
+      <w:commentRangeEnd w:id="36"/>
       <w:r>
         <w:rPr>
           <w:rStyle w:val="ac"/>
           <w:sz w:val="24"/>
           <w:szCs w:val="24"/>
         </w:rPr>
-        <w:commentReference w:id="22"/>
-      </w:r>
-      <w:r>
-        <w:t>.</w:t>
-      </w:r>
-    </w:p>
-    <w:p ns2:paraId="1BE49335" ns2:textId="77777777">
-      <w:commentRangeStart w:id="23"/>
-      <w:r>
-        <w:t xml:space="preserve">Самостоятельным фундаментальным направлением исследований алгоритмов машинного обучения выступает обеспечение справедливости ранжирования (fairness in ranking). В подобных формулировках основной акцент делается на распределении экспозиции как ограниченного ресурса. Применяются ограничения на долю экспозиции в зависимости от объективных достоинств кандидата, с оптимизацией метрики полезности (например, </w:t>
-      </w:r>
-      <w:commentRangeStart w:id="24"/>
-      <w:r>
-        <w:t>алгоритмы policy-gradient</w:t>
-      </w:r>
-      <w:commentRangeEnd w:id="24"/>
+        <w:commentReference w:id="36"/>
+      </w:r>
+    </w:p>
+    <w:p ns2:paraId="79485905" ns2:textId="77777777">
+      <w:r>
+        <w:t xml:space="preserve">2. </w:t>
+      </w:r>
+      <w:commentRangeStart w:id="37"/>
+      <w:r>
+        <w:t>Детализированная разметка терминов на уровне выделения текстовых фрагментов (span-level) с типизацией скиллов (hard, soft, knowledge) для построения интерпретируемой выдачи.</w:t>
+      </w:r>
+      <w:commentRangeEnd w:id="37"/>
       <w:r>
         <w:rPr>
           <w:rStyle w:val="ac"/>
           <w:sz w:val="24"/>
           <w:szCs w:val="24"/>
         </w:rPr>
-        <w:commentReference w:id="24"/>
-      </w:r>
-      <w:r>
-        <w:t xml:space="preserve"> могут оптимизировать NDCG при условии выполнения заданных критериев справедливости) [16]. Для архитектуры ATS это представляет значительную концептуальную ценность: вероятность найма кандидата напрямую зависит от занимаемой позиции, и даже незначительные перекосы в базовых скорингах способны резко изменить экспозицию [2, 16].</w:t>
-      </w:r>
-      <w:commentRangeEnd w:id="23"/>
+        <w:commentReference w:id="37"/>
+      </w:r>
+    </w:p>
+    <w:p ns2:paraId="678C0B0D" ns2:textId="77777777">
+      <w:r>
+        <w:t xml:space="preserve">3. </w:t>
+      </w:r>
+      <w:commentRangeStart w:id="38"/>
+      <w:r>
+        <w:t>Косвенная разметка посредством накопления поведенческих сигналов рекрутеров (отказы, приглашения на собеседование), реализуемая в условиях промышленной эксплуатации алгоритма.</w:t>
+      </w:r>
+      <w:commentRangeEnd w:id="38"/>
       <w:r>
         <w:rPr>
           <w:rStyle w:val="ac"/>
           <w:sz w:val="24"/>
           <w:szCs w:val="24"/>
         </w:rPr>
-        <w:commentReference w:id="23"/>
-      </w:r>
-    </w:p>
-    <w:p ns2:paraId="2AF006B6" ns2:textId="77777777">
-      <w:pPr>
-        <w:pStyle w:val="2"/>
-      </w:pPr>
-      <w:bookmarkStart w:id="25" w:name="_Toc230211049"/>
-      <w:r>
-        <w:lastRenderedPageBreak/>
-        <w:t>1.3 Обоснование выбора архитектуры нейросетевых моделей (BERT, Sentence-BERT) и методов векторизации</w:t>
-      </w:r>
-      <w:bookmarkEnd w:id="25"/>
-    </w:p>
-    <w:p ns2:paraId="553E3F45" ns2:textId="77777777">
-      <w:r>
-        <w:t>Современным стандартом анализа семантики текста в области обработки естественного языка выступает архитектура трансформеров, механизм внимания которой позволяет эффективно моделировать смысловые зависимости внутри последовательностей токенов без использования классических сверточных или рекуррентных подходов [7]. На основе этой парадигмы архитектура BERT (Bidirectional Encoder Representations from Transformers) предложила инновационную схему двунаправленного предобучения я</w:t>
-      </w:r>
-      <w:commentRangeStart w:id="26"/>
-      <w:r>
-        <w:t>зыковых представлений</w:t>
-      </w:r>
-      <w:commentRangeEnd w:id="26"/>
+        <w:commentReference w:id="38"/>
+      </w:r>
+    </w:p>
+    <w:p ns2:paraId="0290E3D8" ns2:textId="77777777">
+      <w:r>
+        <w:t>Ключевым примером при решении задачи разметки является ресурс SKILLSPAN, включающий более 14 тысяч предложений из описаний вакансий, экспертно размеченных согласно строгим гайдлайнам. В исследовании показано, что доменно адаптированные модели машинного обучения (single-task подход) в этой задаче значительно превосходят общие алгоритмы генерации текстов [24]. Основываясь на этом, необходимо: а) актуализировать собственную таксономию навыков; б) выполнять настройку трансформеров на локальных корпусах системы подбора персонала; в) оформлять модуль извлечения навыков как независимый подпроцесс [18, 24].</w:t>
+      </w:r>
+    </w:p>
+    <w:p ns2:paraId="0B817B16" ns2:textId="77777777">
+      <w:commentRangeStart w:id="42"/>
+      <w:r>
+        <w:t>По аналогии с работой CareerBERT [1], при наличии внутреннего резерва данных целесообразно использовать подходы лемматизации и стандартизации профессий по государственным классификаторам или международным таксономиям (например, ESCO). Это снижает терминологический разрыв между кандидатами и рекрутерами [1, 18, 24].</w:t>
+      </w:r>
+      <w:commentRangeEnd w:id="42"/>
       <w:r>
         <w:rPr>
           <w:rStyle w:val="ac"/>
           <w:sz w:val="24"/>
           <w:szCs w:val="24"/>
         </w:rPr>
-        <w:commentReference w:id="26"/>
-      </w:r>
-      <w:r>
-        <w:t xml:space="preserve"> на больших объемах неразмеченных текстов с их последующим дообучением (fine-tuning) под прикладные задачи [5].</w:t>
-      </w:r>
-    </w:p>
-    <w:p ns2:paraId="500E1B06" ns2:textId="77777777">
-      <w:r>
-        <w:t>При решении задач семантического сопоставления пар «вакансия–резюме» важнейшим архитектурным решением является выбор между перекрестным энкодером (cross-encoder) и архитектурой на основе независимого энкодера (bi-encoder). Перекрестный энкодер производит совместную контекстную обработку пары текстов сквозь всю сеть, требуя высоких вычислительных затрат на формирование предсказания. Би-энкодер генерирует независимые семантические вложения для каждого текста, после чего сравнивает их с помощью стандартной косинусной меры сходства или скалярного произведения. В основополагающей статье по Sentence-BERT (SBERT) подробно раскрыто ограничение перекрестных энкодеров: при использовании классического BERT попарное вычисление мер близости внутри большой базы приводит к непомерно высокому числу циклов инференса. Модели семейства SBERT модифицируют BERT в сиамскую или триплетную архитектуру для генерации оптимизированных вложений предложений, сравнимых напрямую. Это кардинально снижает вычислительные издержки вывода с сохранением высокого качества на бенчмарках семантического сходства текста [6].</w:t>
-      </w:r>
-    </w:p>
-    <w:p ns2:paraId="482F90AB" ns2:textId="77777777">
-      <w:r>
-        <w:t xml:space="preserve">В сценарии разработки для ATS вышеупомянутые выводы делают рациональной реализацию архитектуры двухступенчатого ранжирования. Первая ступень — стадия выборки (recall), основанная на поиске по плотным вложениям через независимый энкодер для быстрого отбора топ-N кандидатов из глобальной базы. Вторая ступень — стадия переранжирования (re-rank), которая может осуществляться более ресурсоемкой моделью перекрестного энкодера либо строиться как отдельная LTR-надстройка над широким пулом признаков. Подобная логика построения конвейера </w:t>
-      </w:r>
-      <w:commentRangeStart w:id="27"/>
-      <w:r>
-        <w:t>явно задокументирована в передовых индустриальных исследованиях корпоративного поиска соискателей [17]</w:t>
-      </w:r>
-      <w:commentRangeEnd w:id="27"/>
+        <w:commentReference w:id="42"/>
+      </w:r>
+    </w:p>
+    <w:p ns2:paraId="015BB585" ns2:textId="77777777">
+      <w:r>
+        <w:t>Ввиду наличия конфиденциальных персональных данных в резюме процедуры очистки должны включать деидентификацию. Доказано, что избыточные «сигнальные» поля (индикация локации, ФИО, университета) способны стать фактором предвзятости для трансформерных моделей [22]. Корректная подготовка данных обязана скрывать параметры, не отражающие напрямую профессиональные качества [2, 22]. В реализованном конвейере маскирование персональных данных выполнено методом жесткой подстановки токенов: все обнаруженные паттерны телефонных номеров и адресов электронной почты заменяются соответственно на токены `[MASKED_PHONE]` и `[MASKED_EMAIL]`, удаляются HTML-теги и шумовые спецсимволы, заполняются пропущенные значения полей. Весь конвейер подготовки данных реализован по принципу Zero-Dependency Batch Processing — на нативном Python с потоковым чтением файлов, что позволяет обрабатывать корпуса объемом в десятки гигабайт без загрузки полного объема информации в оперативную память и повышает воспроизводимость на маломощных серверных конфигурациях.</w:t>
+      </w:r>
+    </w:p>
+    <w:p ns2:paraId="364F4E1A" ns2:textId="77777777">
+      <w:pPr>
+        <w:pStyle w:val="2"/>
+      </w:pPr>
+      <w:bookmarkStart w:id="43" w:name="_Toc230211052"/>
+      <w:r>
+        <w:t>2.2 Проектирование архитектуры пайплайна предварительной обработки и модуля семантического анализа</w:t>
+      </w:r>
+      <w:bookmarkEnd w:id="43"/>
+    </w:p>
+    <w:p ns2:paraId="1B741F22" ns2:textId="77777777">
+      <w:pPr>
+        <w:ind w:firstLine="708"/>
+      </w:pPr>
+      <w:r>
+        <w:t>Архитектура пайплайна проектируется в виде логически упорядоченной последовательности модулей предпроцессинга:</w:t>
+      </w:r>
+    </w:p>
+    <w:p ns2:paraId="50DB11AD" ns2:textId="77777777">
+      <w:pPr>
+        <w:ind w:firstLine="708"/>
+      </w:pPr>
+      <w:r>
+        <w:t>1. Модуль приема (ingestion): получение профилей кандидатов и описаний позиций из БД системы автоматизированного управления подбором персонала, проверка структурного формата и нормализация кодировок.</w:t>
+      </w:r>
+    </w:p>
+    <w:p ns2:paraId="7F41E7C5" ns2:textId="77777777">
+      <w:pPr>
+        <w:ind w:firstLine="708"/>
+      </w:pPr>
+      <w:r>
+        <w:t xml:space="preserve">2. Модуль лингвистической нормализации: реализация токенизации строк, удаление пунктуации и приведение текста к нижнему регистру (lowercasing). Модуль выявляет язык источника, производит дедупликацию и удаляет </w:t>
+      </w:r>
+      <w:commentRangeStart w:id="44"/>
+      <w:r>
+        <w:t>юридические штампы</w:t>
+      </w:r>
+      <w:commentRangeEnd w:id="44"/>
       <w:r>
         <w:rPr>
           <w:rStyle w:val="ac"/>
           <w:sz w:val="24"/>
           <w:szCs w:val="24"/>
         </w:rPr>
-        <w:commentReference w:id="27"/>
+        <w:commentReference w:id="44"/>
       </w:r>
       <w:r>
         <w:t>.</w:t>
       </w:r>
     </w:p>
-    <w:p ns2:paraId="63CDC1A4" ns2:textId="77777777">
-      <w:r>
-        <w:t xml:space="preserve">Эмпирическую применимость решения на базе SBERT к предметной области найма доказывает статья по архитектуре </w:t>
-      </w:r>
-      <w:commentRangeStart w:id="28"/>
-      <w:r>
-        <w:t>CareerBERT</w:t>
-      </w:r>
-      <w:commentRangeEnd w:id="28"/>
+    <w:p ns2:paraId="1E656D2D" ns2:textId="77777777">
+      <w:pPr>
+        <w:ind w:firstLine="708"/>
+      </w:pPr>
+      <w:r>
+        <w:t xml:space="preserve">3. Структурно-аналитический модуль: отвечает за вычленение смысловых кластеров (опыт работы, образование, навыки), экстракцию специализированных терминов по категориям hard/soft skills. </w:t>
+      </w:r>
+      <w:commentRangeStart w:id="45"/>
+      <w:r>
+        <w:t>Формируется детальная цифровая матрица компетенций профиля [24].</w:t>
+      </w:r>
+      <w:commentRangeEnd w:id="45"/>
       <w:r>
         <w:rPr>
           <w:rStyle w:val="ac"/>
           <w:sz w:val="24"/>
           <w:szCs w:val="24"/>
         </w:rPr>
-        <w:commentReference w:id="28"/>
-      </w:r>
-      <w:r>
-        <w:t xml:space="preserve">: авторам удалось перевести резюме соискателей и описания вакансий в единое векторное пространство. Применялась сиамская </w:t>
+        <w:commentReference w:id="45"/>
+      </w:r>
+    </w:p>
+    <w:p ns2:paraId="341A0D86" ns2:textId="77777777">
+      <w:pPr>
+        <w:ind w:firstLine="708"/>
+      </w:pPr>
+      <w:r>
+        <w:t xml:space="preserve">4. Модуль построения эмбеддингов: компонент конвертации нормализованных текстов в плотные векторные представления на базе сиамских архитектур Sentence-BERT. </w:t>
       </w:r>
       <w:r>
         <w:lastRenderedPageBreak/>
-        <w:t>нейросеть с функцией потерь попарного ранжирования (Multiple Negatives Ranking loss), формирующая пространство, в котором семантически связанные тексты предельно близки друг к другу, а нерелевантные отдалены [1].</w:t>
-      </w:r>
-    </w:p>
-    <w:p ns2:paraId="678AA264" ns2:textId="77777777">
-      <w:r>
-        <w:t>При работе с русскоязычными текстами дополнительными факторами выступают качество готовых весовых моделей для целевого языка, а также доступность референсных метрик бенчмарков. В современных публикациях вводится мультиязычный формат оценки Massive Text Embedding Benchmark для русского языка (ruMTEB), предлагаются базовые векторные модели (например, cointegrated/rubert-tiny2) и формализуются категории тестовых задач переранжирования, что имеет критическое значение для тестирования будущего модуля обработки отечественного контента [19, 20].</w:t>
-      </w:r>
-    </w:p>
-    <w:p ns2:paraId="4C84D329" ns2:textId="77777777">
-      <w:commentRangeStart w:id="29"/>
-      <w:r>
-        <w:t>Выбор методов векторизации обязательно должен учитывать риски алгоритмического смещения: аудиты в системах рекрутмента подтверждают, что использование только векторных эмбеддингов может провоцировать дискриминационные искажения результатов (по полу, расе, национальности и объему текстового профиля кандидата) [22].</w:t>
-      </w:r>
-      <w:r>
-        <w:br w:type="page"/>
-      </w:r>
-      <w:commentRangeEnd w:id="29"/>
+        <w:t>При необходимости базовые веса моделей обогащаются в ходе доменного</w:t>
+      </w:r>
+      <w:commentRangeStart w:id="46"/>
+      <w:r>
+        <w:t xml:space="preserve"> дообучения ин-хаус</w:t>
+      </w:r>
+      <w:commentRangeEnd w:id="46"/>
       <w:r>
         <w:rPr>
           <w:rStyle w:val="ac"/>
           <w:sz w:val="24"/>
           <w:szCs w:val="24"/>
         </w:rPr>
-        <w:commentReference w:id="29"/>
-      </w:r>
-    </w:p>
-    <w:p ns2:paraId="1EA596E6" ns2:textId="77777777">
-      <w:pPr>
-        <w:pStyle w:val="1"/>
-      </w:pPr>
-      <w:bookmarkStart w:id="30" w:name="_Toc230211050"/>
-      <w:r>
-        <w:lastRenderedPageBreak/>
-        <w:t>2 Проектирование данных, архитектуры обработки и интеграции с ATS</w:t>
-      </w:r>
-      <w:bookmarkEnd w:id="30"/>
-    </w:p>
-    <w:p ns2:paraId="519AC893" ns2:textId="77777777">
+        <w:commentReference w:id="46"/>
+      </w:r>
+      <w:r>
+        <w:t xml:space="preserve"> [1, 6, 24].</w:t>
+      </w:r>
+    </w:p>
+    <w:p ns2:paraId="66858DAB" ns2:textId="77777777">
+      <w:pPr>
+        <w:ind w:firstLine="708"/>
+      </w:pPr>
+      <w:r>
+        <w:t>5. Блок первичной выборки (Recall/Retrieval): отбор узкой первичной выборки лучших кандидатов по критериям семантической схожести векторов. В планах развития проекта осуществление подсчёта схожести векторов через механизмы поиска ближайших приближенных соседей (ANN). Для этого в инфраструктуре закладывается система класса Vector DB (например, Milvus), обеспечивающая гибкую фильтрацию [12].</w:t>
+      </w:r>
+    </w:p>
+    <w:p ns2:paraId="2C98B79B" ns2:textId="77777777">
+      <w:pPr>
+        <w:ind w:firstLine="708"/>
+      </w:pPr>
+      <w:r>
+        <w:t>6. Далее в планах развития проекта идёт модуль алгоритмического переранжирования (Re-ranking): отвечает за финальный пересчет позиций топ-N выборки при помощи LTR-алгоритмов. Учитываются и интегрируются исходные семантические скоры, выявленные структурные пересечения по профессиональному стажу и прокси-метрики поведения [17].</w:t>
+      </w:r>
+    </w:p>
+    <w:p ns2:paraId="79C89105" ns2:textId="77777777">
+      <w:pPr>
+        <w:ind w:firstLine="708"/>
+      </w:pPr>
+      <w:r>
+        <w:t>7. Модуль объяснимости (Explainability Engine): формирует интерпретируемые сводки (например, текстовые плашки совпадения навыков). Механизм прозрачности работы модели призван компенсировать фактор эффекта «черного ящика», повышая доверие конечного пользователя внутри системы подбора персонала к результату алгоритма [23].</w:t>
+      </w:r>
+    </w:p>
+    <w:p ns2:paraId="1E70533F" ns2:textId="77777777">
+      <w:pPr>
+        <w:ind w:firstLine="708"/>
+      </w:pPr>
+      <w:r>
+        <w:t>8. И наконец в планах развития проекта, чтобы заверщающим шагом должен идти модуль LLM-генерации критериев оценки: в целевой системе Reqcore реализован автоматизированный конвейер формирования объективной шкалы оценивания кандидатов на основе текста описания вакансии. Система передает описание позиции в LLM (с поддержкой нескольких провайдеров: OpenAI, Anthropic, Google AI) и получает структурированный ответ, жестко валидируемый JSON-схемой. Каждый сгенерированный критерий содержит уникальный идентификатор, наименование, инструкцию по поиску фактов в резюме, категорию (технический навык, soft skill, образование), базовую шкалу оценки и рекомендованный вес значимости. Полученные критерии далее выступают в роли формализованного чек-листа для автоматического AI-скоринга входящих резюме.</w:t>
+      </w:r>
+    </w:p>
+    <w:p ns2:paraId="5636570D" ns2:textId="77777777">
       <w:pPr>
         <w:pStyle w:val="2"/>
       </w:pPr>
-      <w:bookmarkStart w:id="31" w:name="_Toc230211051"/>
-      <w:r>
-        <w:t>2.1 Выполнение сбора, профилирования, очистки и разметки исходных данных (вакансии и резюме)</w:t>
-      </w:r>
-      <w:bookmarkEnd w:id="31"/>
-    </w:p>
-    <w:p ns2:paraId="3A0D9322" ns2:textId="77777777">
-      <w:r>
-        <w:t>Сбор текстовой информации в ATS концептуально подразделяется на работу с двумя классами сущностей. С одной стороны, обрабатываются данные вакансий (</w:t>
-      </w:r>
-      <w:commentRangeStart w:id="32"/>
-      <w:r>
-        <w:t>должностные обязанности, формальные требования, стек технологий, условия труда</w:t>
-      </w:r>
-      <w:commentRangeEnd w:id="32"/>
-      <w:r>
-        <w:rPr>
-          <w:rStyle w:val="ac"/>
-          <w:sz w:val="24"/>
-          <w:szCs w:val="24"/>
-        </w:rPr>
-        <w:commentReference w:id="32"/>
-      </w:r>
-      <w:r>
-        <w:t>). С другой стороны, обрабатываются резюме (</w:t>
-      </w:r>
-      <w:commentRangeStart w:id="33"/>
-      <w:r>
-        <w:t>развернутый опыт работы, ключевые навыки, наличие сертификатов, данные об образовании, стаж работы</w:t>
-      </w:r>
-      <w:commentRangeEnd w:id="33"/>
-      <w:r>
-        <w:rPr>
-          <w:rStyle w:val="ac"/>
-          <w:sz w:val="24"/>
-          <w:szCs w:val="24"/>
-        </w:rPr>
-        <w:commentReference w:id="33"/>
-      </w:r>
-      <w:r>
-        <w:t>). Практика систематического извлечения данных аспектов для целей ранжирования была ранее описана как надежная основа первичной обработки соискателей [3].</w:t>
-      </w:r>
-    </w:p>
-    <w:p ns2:paraId="35D25020" ns2:textId="77777777">
-      <w:commentRangeStart w:id="34"/>
-      <w:r>
-        <w:t>Профилирование корпуса вакансий и резюме должно протоколировать распределение длины текста, долю шумовой или неформативной информации (маркетинговые блоки, универсальные фразы), плотность доменных терминов, процентную долю смысловых дубликатов, а также языковой состав.</w:t>
-      </w:r>
-      <w:commentRangeEnd w:id="34"/>
-      <w:r>
-        <w:rPr>
-          <w:rStyle w:val="ac"/>
-          <w:sz w:val="24"/>
-          <w:szCs w:val="24"/>
-        </w:rPr>
-        <w:commentReference w:id="34"/>
-      </w:r>
-      <w:r>
-        <w:t xml:space="preserve"> </w:t>
-      </w:r>
-      <w:commentRangeStart w:id="35"/>
-      <w:r>
-        <w:t>В контексте извлечения навыков из резюме существенной проблемой признаются границы определений терминологии: научные обзоры демонстрируют тенденцию к разнообразию в подходах к классификации и стандартизации доменных параметров HR, что обуславливает необходимость создания строгих внутренних регламентов и унификации метрик для разметки данных [18].</w:t>
-      </w:r>
-      <w:commentRangeEnd w:id="35"/>
-      <w:r>
-        <w:rPr>
-          <w:rStyle w:val="ac"/>
-          <w:sz w:val="24"/>
-          <w:szCs w:val="24"/>
-        </w:rPr>
-        <w:commentReference w:id="35"/>
-      </w:r>
-    </w:p>
-    <w:p ns2:paraId="6058AE1F" ns2:textId="77777777">
-      <w:r>
-        <w:t>Процедура разметки массива данных в рамках проекта протекает на нескольких уровнях:</w:t>
-      </w:r>
-    </w:p>
-    <w:p ns2:paraId="451CB494" ns2:textId="77777777">
-      <w:r>
-        <w:t xml:space="preserve">1. </w:t>
-      </w:r>
-      <w:commentRangeStart w:id="36"/>
-      <w:r>
-        <w:t>Разметка глобальной релевантности пар «вакансия–резюме» для последующего обучения ранжирующих моделей и контроля качества по NDCG.</w:t>
-      </w:r>
-      <w:commentRangeEnd w:id="36"/>
-      <w:r>
-        <w:rPr>
-          <w:rStyle w:val="ac"/>
-          <w:sz w:val="24"/>
-          <w:szCs w:val="24"/>
-        </w:rPr>
-        <w:commentReference w:id="36"/>
-      </w:r>
-    </w:p>
-    <w:p ns2:paraId="79485905" ns2:textId="77777777">
-      <w:r>
-        <w:t xml:space="preserve">2. </w:t>
-      </w:r>
-      <w:commentRangeStart w:id="37"/>
-      <w:r>
-        <w:t>Детализированная разметка терминов на уровне выделения текстовых фрагментов (span-level) с типизацией скиллов (hard, soft, knowledge) для построения интерпретируемой выдачи.</w:t>
-      </w:r>
-      <w:commentRangeEnd w:id="37"/>
-      <w:r>
-        <w:rPr>
-          <w:rStyle w:val="ac"/>
-          <w:sz w:val="24"/>
-          <w:szCs w:val="24"/>
-        </w:rPr>
-        <w:commentReference w:id="37"/>
-      </w:r>
-    </w:p>
-    <w:p ns2:paraId="678C0B0D" ns2:textId="77777777">
-      <w:r>
-        <w:t xml:space="preserve">3. </w:t>
-      </w:r>
-      <w:commentRangeStart w:id="38"/>
-      <w:r>
-        <w:t>Косвенная разметка посредством накопления поведенческих сигналов рекрутеров (отказы, приглашения на собеседование), реализуемая в условиях промышленной эксплуатации алгоритма.</w:t>
-      </w:r>
-      <w:commentRangeEnd w:id="38"/>
-      <w:r>
-        <w:rPr>
-          <w:rStyle w:val="ac"/>
-          <w:sz w:val="24"/>
-          <w:szCs w:val="24"/>
-        </w:rPr>
-        <w:commentReference w:id="38"/>
-      </w:r>
-    </w:p>
-    <w:p ns2:paraId="0290E3D8" ns2:textId="77777777">
-      <w:r>
-        <w:t xml:space="preserve">Ключевым примером при решении задачи разметки является ресурс </w:t>
-      </w:r>
-      <w:commentRangeStart w:id="39"/>
-      <w:r>
-        <w:t>SKILLSPAN</w:t>
-      </w:r>
-      <w:commentRangeEnd w:id="39"/>
-      <w:r>
-        <w:rPr>
-          <w:rStyle w:val="ac"/>
-          <w:sz w:val="24"/>
-          <w:szCs w:val="24"/>
-        </w:rPr>
-        <w:commentReference w:id="39"/>
-      </w:r>
-      <w:r>
-        <w:t xml:space="preserve">, включающий более 14 тысяч предложений из описаний вакансий, экспертно размеченных согласно строгим гайдлайнам. В исследовании показано, что доменно адаптированные модели машинного обучения (single-task подход) в этой задаче значительно превосходят </w:t>
-      </w:r>
-      <w:commentRangeStart w:id="40"/>
-      <w:r>
-        <w:t>общие алгоритмы генерации текстов [24]</w:t>
-      </w:r>
-      <w:commentRangeEnd w:id="40"/>
-      <w:r>
-        <w:rPr>
-          <w:rStyle w:val="ac"/>
-          <w:sz w:val="24"/>
-          <w:szCs w:val="24"/>
-        </w:rPr>
-        <w:commentReference w:id="40"/>
-      </w:r>
-      <w:r>
-        <w:t xml:space="preserve">. Основываясь на этом, необходимо: а) актуализировать собственную таксономию навыков; б) выполнять настройку </w:t>
-      </w:r>
-      <w:r>
-        <w:lastRenderedPageBreak/>
-        <w:t xml:space="preserve">трансформеров на локальных корпусах ATS; </w:t>
-      </w:r>
-      <w:commentRangeStart w:id="41"/>
-      <w:r>
-        <w:t>в) оформлять модуль извлечения навыков как независимый подпроцесс [18, 24].</w:t>
-      </w:r>
-      <w:commentRangeEnd w:id="41"/>
-      <w:r>
-        <w:rPr>
-          <w:rStyle w:val="ac"/>
-          <w:sz w:val="24"/>
-          <w:szCs w:val="24"/>
-        </w:rPr>
-        <w:commentReference w:id="41"/>
-      </w:r>
-    </w:p>
-    <w:p ns2:paraId="0B817B16" ns2:textId="77777777">
-      <w:commentRangeStart w:id="42"/>
-      <w:r>
-        <w:t>По аналогии с работой CareerBERT [1], при наличии внутреннего резерва данных целесообразно использовать подходы лемматизации и стандартизации профессий по государственным классификаторам или международным таксономиям (например, ESCO). Это снижает терминологический разрыв между кандидатами и рекрутерами [1, 18, 24].</w:t>
-      </w:r>
-      <w:commentRangeEnd w:id="42"/>
-      <w:r>
-        <w:rPr>
-          <w:rStyle w:val="ac"/>
-          <w:sz w:val="24"/>
-          <w:szCs w:val="24"/>
-        </w:rPr>
-        <w:commentReference w:id="42"/>
-      </w:r>
-    </w:p>
-    <w:p ns2:paraId="015BB585" ns2:textId="77777777">
-      <w:r>
-        <w:t>Ввиду наличия конфиденциальных персональных данных в резюме процедуры очистки должны включать деидентификацию. Доказано, что избыточные «сигнальные» поля (индикация локации, ФИО, университета) способны стать фактором предвзятости для трансформерных моделей [22]. Корректная подготовка данных обязана скрывать параметры, не отражающие напрямую профессиональные качества [2, 22]. В реализованном конвейере маскирование персональных данных выполнено методом жесткой подстановки токенов: все обнаруженные паттерны телефонных номеров и адресов электронной почты заменяются соответственно на токены `[MASKED_PHONE]` и `[MASKED_EMAIL]`, удаляются HTML-теги и шумовые спецсимволы, заполняются пропущенные значения полей. Весь конвейер подготовки данных реализован по принципу Zero-Dependency Batch Processing — на нативном Python с потоковым чтением файлов, что позволяет обрабатывать корпуса объемом в десятки гигабайт без загрузки полного объема информации в оперативную память и повышает воспроизводимость на маломощных серверных конфигурациях.</w:t>
-      </w:r>
-    </w:p>
-    <w:p ns2:paraId="364F4E1A" ns2:textId="77777777">
-      <w:pPr>
-        <w:pStyle w:val="2"/>
-      </w:pPr>
-      <w:bookmarkStart w:id="43" w:name="_Toc230211052"/>
-      <w:r>
-        <w:t>2.2 Проектирование архитектуры пайплайна предварительной обработки и модуля семантического анализа</w:t>
-      </w:r>
-      <w:bookmarkEnd w:id="43"/>
-    </w:p>
-    <w:p ns2:paraId="1B741F22" ns2:textId="77777777">
-      <w:pPr>
-        <w:ind w:firstLine="708"/>
-      </w:pPr>
-      <w:r>
-        <w:t>Архитектура пайплайна проектируется в виде логически упорядоченной последовательности модулей предпроцессинга:</w:t>
-      </w:r>
-    </w:p>
-    <w:p ns2:paraId="50DB11AD" ns2:textId="77777777">
-      <w:pPr>
-        <w:ind w:firstLine="708"/>
-      </w:pPr>
-      <w:r>
-        <w:t>1. Модуль приема (ingestion): получение профилей кандидатов и описаний позиций из БД комплекса ATS, проверка структурного формата и нормализация кодировок.</w:t>
-      </w:r>
-    </w:p>
-    <w:p ns2:paraId="7F41E7C5" ns2:textId="77777777">
-      <w:pPr>
-        <w:ind w:firstLine="708"/>
-      </w:pPr>
-      <w:r>
-        <w:t xml:space="preserve">2. Модуль лингвистической нормализации: реализация токенизации строк, удаление пунктуации и приведение текста к нижнему регистру (lowercasing). Модуль выявляет язык источника, производит дедупликацию и удаляет </w:t>
-      </w:r>
-      <w:commentRangeStart w:id="44"/>
-      <w:r>
-        <w:t>юридические штампы</w:t>
-      </w:r>
-      <w:commentRangeEnd w:id="44"/>
-      <w:r>
-        <w:rPr>
-          <w:rStyle w:val="ac"/>
-          <w:sz w:val="24"/>
-          <w:szCs w:val="24"/>
-        </w:rPr>
-        <w:commentReference w:id="44"/>
-      </w:r>
-      <w:r>
-        <w:t>.</w:t>
-      </w:r>
-    </w:p>
-    <w:p ns2:paraId="1E656D2D" ns2:textId="77777777">
-      <w:pPr>
-        <w:ind w:firstLine="708"/>
-      </w:pPr>
-      <w:r>
-        <w:t xml:space="preserve">3. Структурно-аналитический модуль: отвечает за вычленение смысловых кластеров (опыт работы, образование, навыки), экстракцию специализированных терминов по категориям hard/soft skills. </w:t>
-      </w:r>
-      <w:commentRangeStart w:id="45"/>
-      <w:r>
-        <w:t>Формируется детальная цифровая матрица компетенций профиля [24].</w:t>
-      </w:r>
-      <w:commentRangeEnd w:id="45"/>
-      <w:r>
-        <w:rPr>
-          <w:rStyle w:val="ac"/>
-          <w:sz w:val="24"/>
-          <w:szCs w:val="24"/>
-        </w:rPr>
-        <w:commentReference w:id="45"/>
-      </w:r>
-    </w:p>
-    <w:p ns2:paraId="341A0D86" ns2:textId="77777777">
-      <w:pPr>
-        <w:ind w:firstLine="708"/>
-      </w:pPr>
-      <w:r>
-        <w:t xml:space="preserve">4. Модуль построения эмбеддингов: компонент конвертации нормализованных текстов в плотные векторные представления на базе сиамских архитектур Sentence-BERT. </w:t>
-      </w:r>
-      <w:r>
-        <w:lastRenderedPageBreak/>
-        <w:t>При необходимости базовые веса моделей обогащаются в ходе доменного</w:t>
-      </w:r>
-      <w:commentRangeStart w:id="46"/>
-      <w:r>
-        <w:t xml:space="preserve"> дообучения ин-хаус</w:t>
-      </w:r>
-      <w:commentRangeEnd w:id="46"/>
-      <w:r>
-        <w:rPr>
-          <w:rStyle w:val="ac"/>
-          <w:sz w:val="24"/>
-          <w:szCs w:val="24"/>
-        </w:rPr>
-        <w:commentReference w:id="46"/>
-      </w:r>
-      <w:r>
-        <w:t xml:space="preserve"> [1, 6, 24].</w:t>
-      </w:r>
-    </w:p>
-    <w:p ns2:paraId="66858DAB" ns2:textId="77777777">
-      <w:pPr>
-        <w:ind w:firstLine="708"/>
-      </w:pPr>
-      <w:r>
-        <w:t>5. Блок первичной выборки (Recall/Retrieval): отбор узкой первичной выборки лучших кандидатов по критериям семантической схожести векторов. В планах развития проекта осуществление подсчёта схожести векторов через механизмы поиска ближайших приближенных соседей (ANN). Для этого в инфраструктуре закладывается система класса Vector DB (например, Milvus), обеспечивающая гибкую фильтрацию [12].</w:t>
-      </w:r>
-    </w:p>
-    <w:p ns2:paraId="2C98B79B" ns2:textId="77777777">
-      <w:pPr>
-        <w:ind w:firstLine="708"/>
-      </w:pPr>
-      <w:r>
-        <w:t>6. Далее в планах развития проекта идёт модуль алгоритмического переранжирования (Re-ranking): отвечает за финальный пересчет позиций топ-N выборки при помощи LTR-алгоритмов. Учитываются и интегрируются исходные семантические скоры, выявленные структурные пересечения по профессиональному стажу и прокси-метрики поведения [17].</w:t>
-      </w:r>
-    </w:p>
-    <w:p ns2:paraId="79C89105" ns2:textId="77777777">
-      <w:pPr>
-        <w:ind w:firstLine="708"/>
-      </w:pPr>
-      <w:commentRangeStart w:id="47"/>
-      <w:r>
-        <w:t>7. Модуль объяснимости (Explainability Engine): формирует интерпретируемые сводки (например, текстовые плашки совпадения навыков). Механизм прозрачности работы модели призван компенсировать фактор эффекта «черного ящика», повышая доверие конечного пользователя внутри ATS к результату алгоритма [23].</w:t>
-      </w:r>
-      <w:commentRangeEnd w:id="47"/>
-      <w:r>
-        <w:rPr>
-          <w:rStyle w:val="ac"/>
-          <w:sz w:val="24"/>
-          <w:szCs w:val="24"/>
-        </w:rPr>
-        <w:commentReference w:id="47"/>
-      </w:r>
-    </w:p>
-    <w:p ns2:paraId="1E70533F" ns2:textId="77777777">
-      <w:pPr>
-        <w:ind w:firstLine="708"/>
-      </w:pPr>
-      <w:r>
-        <w:t>8. И наконец в планах развития проекта, чтобы заверщающим шагом должен идти модуль LLM-генерации критериев оценки: в целевой ATS-системе (Reqcore) реализован автоматизированный конвейер формирования объективной шкалы оценивания кандидатов на основе текста описания вакансии. Система передает описание позиции в LLM (с поддержкой нескольких провайдеров: OpenAI, Anthropic, Google AI) и получает структурированный ответ, жестко валидируемый JSON-схемой. Каждый сгенерированный критерий содержит уникальный идентификатор, наименование, инструкцию по поиску фактов в резюме, категорию (технический навык, soft skill, образование), базовую шкалу оценки и рекомендованный вес значимости. Полученные критерии далее выступают в роли формализованного чек-листа для автоматического AI-скоринга входящих резюме.</w:t>
-      </w:r>
-    </w:p>
-    <w:p ns2:paraId="5636570D" ns2:textId="77777777">
-      <w:pPr>
-        <w:pStyle w:val="2"/>
-      </w:pPr>
-      <w:bookmarkStart w:id="48" w:name="_Toc230211053"/>
-      <w:r>
-        <w:t>2.3 Спецификация программного интерфейса (API) и модулей интеграции с ядром ATS</w:t>
-      </w:r>
-      <w:bookmarkEnd w:id="48"/>
+      <w:r>
+        <w:t>2.3 Спецификация программного интерфейса (API) и модулей интеграции с ядром системы подбора персонала</w:t>
+      </w:r>
     </w:p>
     <w:p ns2:paraId="7DB66C47" ns2:textId="77777777">
       <w:r>
@@ -4092,16 +3274,12 @@
     </w:p>
     <w:p ns2:paraId="2854CA36" ns2:textId="4515C8B0">
       <w:r>
-        <w:t xml:space="preserve">Одним из таких направлений может стать введение отдельных публичных маршрутов для работы с эмбеддингами вакансий и резюме. В отличие от текущей реализации, где кандидатский профиль поступает в систему уже в подготовленном текстовом виде, выделение специализированных endpointов для получения векторных представлений позволило бы формализовать этап предрасчёта признаков, упростить </w:t>
-      </w:r>
-      <w:r>
-        <w:lastRenderedPageBreak/>
-        <w:t>инкрементальное обновление представлений и сделать API более пригодным для сценариев, в которых контур подготовки данных отделён от контура ранжирования. Такое расширение особенно актуально при переходе от прототипной схемы взаимодействия к более устойчивой сервисной архитектуре.</w:t>
+        <w:t>Одним из таких направлений может стать введение отдельных публичных маршрутов для работы с эмбеддингами вакансий и резюме. В отличие от текущей реализации, где кандидатский профиль поступает в систему уже в подготовленном текстовом виде, выделение специализированных endpointов для получения векторных представлений позволило бы формализовать этап предрасчёта признаков, упростить инкрементальное обновление представлений и сделать API более пригодным для сценариев, в которых этап подготовки данных отделён от этапа ранжирования. Такое расширение особенно актуально при переходе от прототипной схемы взаимодействия к более устойчивой сервисной архитектуре.</w:t>
       </w:r>
     </w:p>
     <w:p ns2:paraId="57DE3D0D" ns2:textId="77777777">
       <w:r>
-        <w:t>Перспективным направлением также является развитие механизмов синхронизации индекса. В текущем состоянии используется временный in-memory индекс, достаточный для демонстрации и проверки базовой логики поиска, однако в дальнейшем API может быть дополнено операциями обновления и удаления записей, ориентированными на согласованную синхронизацию между ATS и внешним хранилищем представлений кандидатов. Реализация такого слоя позволила бы перейти от эпизодической загрузки данных к управляемому жизненному циклу профилей в системе и тем самым приблизить решение к требованиям промышленной эксплуатации.</w:t>
+        <w:t>Перспективным направлением также является развитие механизмов синхронизации индекса. В текущем состоянии используется временный in-memory индекс, достаточный для демонстрации и проверки базовой логики поиска, однако в дальнейшем API может быть дополнено операциями обновления и удаления записей, ориентированными на согласованную синхронизацию между системой подбора персонала и внешним хранилищем представлений кандидатов. Реализация такого слоя позволила бы перейти от эпизодической загрузки данных к управляемому жизненному циклу профилей в системе и тем самым приблизить решение к требованиям промышленной эксплуатации.</w:t>
       </w:r>
     </w:p>
     <w:p ns2:paraId="03D907D9" ns2:textId="77777777">
@@ -4111,12 +3289,12 @@
     </w:p>
     <w:p ns2:paraId="380EC76E" ns2:textId="77777777">
       <w:r>
-        <w:t>Наконец, дальнейшее расширение возможно на уровне самого поискового маршрута. Если в текущей реализации выдача ориентирована прежде всего на возврат результата ранжирования, то в перспективе API может быть дополнено поддержкой более богатого выходного формата, включающего дополнительные метаданные и интерпретационные компоненты. Подобное развитие позволило бы сделать систему удобнее для практического использования в ATS-сценариях, где важна не только численная релевантность кандидата, но и возможность объяснить основания, по которым профиль оказался выше или ниже в итоговом списке.</w:t>
+        <w:t>Наконец, дальнейшее расширение возможно на уровне самого поискового маршрута. Если в текущей реализации выдача ориентирована прежде всего на возврат результата ранжирования, то в перспективе API может быть дополнено поддержкой более богатого выходного формата, включающего дополнительные метаданные и интерпретационные компоненты. Подобное развитие позволило бы сделать систему удобнее для практического использования в сценариях автоматизированного подбора персонала, где важна не только численная релевантность кандидата, но и возможность объяснить основания, по которым профиль оказался выше или ниже в итоговом списке.</w:t>
       </w:r>
     </w:p>
     <w:p ns2:paraId="2A059843" ns2:textId="77777777">
       <w:r>
-        <w:t>Текущая серверная интеграция между ATS Reqcore и модулем ML-оценки реализована в обработчике `ats/reqcore/server/api/applications/[id]/analyze.post.ts`. Эта точка является фактическим входом для анализа одной заявки и отвечает за выбор ветки скоринга по значению `ai_config.provider`. В обоих вариантах результат интеграции сводится к обновлению числового поля `application.score` и записи аудита в `analysis_run`; различается только способ получения этого числа.</w:t>
+        <w:t>Текущая серверная интеграция между системой Reqcore и модулем ML-оценки реализована в обработчике `ats/reqcore/server/api/applications/[id]/analyze.post.ts`. Эта точка является фактическим входом для анализа одной заявки и отвечает за выбор ветки скоринга по значению `ai_config.provider`. В обоих вариантах результат интеграции сводится к обновлению числового поля `application.score` и записи аудита в `analysis_run`; различается только способ получения этого числа.</w:t>
       </w:r>
     </w:p>
     <w:p ns2:paraId="33AEF8E4" ns2:textId="77777777">
@@ -4198,12 +3376,9 @@
       <w:pPr>
         <w:pStyle w:val="1"/>
       </w:pPr>
-      <w:bookmarkStart w:id="49" w:name="_Toc230211054"/>
-      <w:r>
-        <w:lastRenderedPageBreak/>
-        <w:t>3 Разработка и реализация модуля семантического ранжирования кандидатов</w:t>
-      </w:r>
-      <w:bookmarkEnd w:id="49"/>
+      <w:r>
+        <w:t>3 Разработка и реализация модуля сопоставления вакансий и резюме для ранжирования кандидатов</w:t>
+      </w:r>
     </w:p>
     <w:p ns2:paraId="7C2893EF" ns2:textId="77777777">
       <w:pPr>
@@ -4227,7 +3402,7 @@
     </w:p>
     <w:p ns2:paraId="3BC02EA9" ns2:textId="77777777">
       <w:r>
-        <w:t>Контур разработки ML-кода разделен на офлайн- и онлайн-контуры в соответствии с передовой практикой систем талантов [17]. Офлайн-модули собирают, подготавливают данные и проводят обучение; онлайн-система занимается инференсом эмбеддингов и передачей API-команд.</w:t>
+        <w:t>Программная реализация ML-модуля разделена на офлайн-часть и онлайн-часть в соответствии с передовой практикой систем поиска талантов [17]. Офлайн-модули собирают, очищают и размечают данные, формируют обучающие пары «текст вакансии–текст резюме» и проводят обучение модели; онлайн-часть выполняет инференс векторных представлений и предоставляет API-команды для ранжирования.</w:t>
       </w:r>
     </w:p>
     <w:p ns2:paraId="56CAE688" ns2:textId="77777777">
@@ -4246,32 +3421,17 @@
       </w:r>
     </w:p>
     <w:p ns2:paraId="353C54B2" ns2:textId="77777777">
-      <w:commentRangeStart w:id="52"/>
-      <w:r>
-        <w:t xml:space="preserve">3. </w:t>
-      </w:r>
-      <w:commentRangeEnd w:id="52"/>
-      <w:r>
-        <w:rPr>
-          <w:rStyle w:val="ac"/>
-          <w:sz w:val="24"/>
-          <w:szCs w:val="24"/>
-        </w:rPr>
-        <w:commentReference w:id="52"/>
-      </w:r>
-      <w:r>
-        <w:t>Формирования разметки корпуса в рамках подготовки к обучению алгоритма. Данный этап реализован совместно с инструментарием доменных экспертов системы ATS для формирования локальных гайдлайнов поиска [24]. В будущем планируется адаптировать/применить эту разметку для обучения алгоритмов LTR.</w:t>
+      <w:r>
+        <w:t>3. Формирования разметки корпуса в рамках подготовки к обучению алгоритма. Данный этап реализован совместно с инструментарием доменных экспертов системы автоматизированного управления подбором персонала для формирования локальных гайдлайнов поиска [24]. В будущем планируется адаптировать/применить эту разметку для обучения алгоритмов LTR.</w:t>
       </w:r>
     </w:p>
     <w:p ns2:paraId="6689FAEA" ns2:textId="77777777">
       <w:pPr>
         <w:pStyle w:val="2"/>
       </w:pPr>
-      <w:bookmarkStart w:id="53" w:name="_Toc230211056"/>
-      <w:r>
-        <w:t>3.2 Реализация и дообучение (fine-tuning) модели сопоставления «вакансия-резюме»</w:t>
-      </w:r>
-      <w:bookmarkEnd w:id="53"/>
+      <w:r>
+        <w:t>3.2 Реализация и доменная настройка (fine-tuning) модели сопоставления «вакансия-резюме»</w:t>
+      </w:r>
     </w:p>
     <w:p ns2:paraId="566BE36F" ns2:textId="77777777">
       <w:pPr>
@@ -4280,112 +3440,7 @@
         </w:rPr>
       </w:pPr>
       <w:r>
-        <w:t xml:space="preserve">При реализации контура векторного кодирования фактически используется только модель `cointegrated/rubert-tiny2`. Это реализовано обучающим скриптом `experiments/scripts/09_train_biencoder.py`, где аргумент `--model_name` имеет значение по умолчанию </w:t>
-      </w:r>
-      <w:r>
-        <w:rPr>
-          <w:lang w:val="en-US"/>
-        </w:rPr>
-        <w:t xml:space="preserve">`cointegrated/rubert-tiny2`, </w:t>
-      </w:r>
-      <w:r>
-        <w:t>а</w:t>
-      </w:r>
-      <w:r>
-        <w:rPr>
-          <w:lang w:val="en-US"/>
-        </w:rPr>
-        <w:t xml:space="preserve"> </w:t>
-      </w:r>
-      <w:r>
-        <w:t>также</w:t>
-      </w:r>
-      <w:r>
-        <w:rPr>
-          <w:lang w:val="en-US"/>
-        </w:rPr>
-        <w:t xml:space="preserve"> </w:t>
-      </w:r>
-      <w:r>
-        <w:t>сохраненным</w:t>
-      </w:r>
-      <w:r>
-        <w:rPr>
-          <w:lang w:val="en-US"/>
-        </w:rPr>
-        <w:t xml:space="preserve"> </w:t>
-      </w:r>
-      <w:r>
-        <w:t>артефактом</w:t>
-      </w:r>
-      <w:r>
-        <w:rPr>
-          <w:lang w:val="en-US"/>
-        </w:rPr>
-        <w:t xml:space="preserve"> `experiments/models/bi_encoder_rubert_tiny2`, </w:t>
-      </w:r>
-      <w:r>
-        <w:t>в</w:t>
-      </w:r>
-      <w:r>
-        <w:rPr>
-          <w:lang w:val="en-US"/>
-        </w:rPr>
-        <w:t xml:space="preserve"> `README.md` </w:t>
-      </w:r>
-      <w:r>
-        <w:t>которого</w:t>
-      </w:r>
-      <w:r>
-        <w:rPr>
-          <w:lang w:val="en-US"/>
-        </w:rPr>
-        <w:t xml:space="preserve"> </w:t>
-      </w:r>
-      <w:r>
-        <w:t>указан</w:t>
-      </w:r>
-      <w:r>
-        <w:rPr>
-          <w:lang w:val="en-US"/>
-        </w:rPr>
-        <w:t xml:space="preserve"> `base_model: cointegrated/rubert-tiny2`. </w:t>
-      </w:r>
-      <w:r>
-        <w:t>В</w:t>
-      </w:r>
-      <w:r>
-        <w:rPr>
-          <w:lang w:val="en-US"/>
-        </w:rPr>
-        <w:t xml:space="preserve"> </w:t>
-      </w:r>
-      <w:r>
-        <w:t>планах</w:t>
-      </w:r>
-      <w:r>
-        <w:rPr>
-          <w:lang w:val="en-US"/>
-        </w:rPr>
-        <w:t xml:space="preserve"> </w:t>
-      </w:r>
-      <w:r>
-        <w:t>возможно</w:t>
-      </w:r>
-      <w:r>
-        <w:rPr>
-          <w:lang w:val="en-US"/>
-        </w:rPr>
-        <w:t xml:space="preserve"> </w:t>
-      </w:r>
-      <w:r>
-        <w:t>применение</w:t>
-      </w:r>
-      <w:r>
-        <w:rPr>
-          <w:lang w:val="en-US"/>
-        </w:rPr>
-        <w:t xml:space="preserve"> `ru-en-RoSBERTa`.</w:t>
+        <w:t>В реализации основного масштабируемого подхода используется архитектура независимого энкодера (bi-encoder) на базе `cointegrated/rubert-tiny2`: вакансия и резюме кодируются раздельно, а затем сравниваются по косинусной близости полученных векторных представлений. Это реализовано обучающим скриптом `experiments/scripts/09_train_biencoder.py`, где аргумент `--model_name` имеет значение по умолчанию `cointegrated/rubert-tiny2`, а также сохраненным артефактом `experiments/models/bi_encoder_rubert_tiny2`, в `README.md` которого указан `base_model: cointegrated/rubert-tiny2`.</w:t>
       </w:r>
     </w:p>
     <w:p ns2:paraId="0400FFE8" ns2:textId="77777777">
@@ -7759,133 +6814,7 @@
     </w:p>
     <w:p ns2:paraId="20E87204" ns2:textId="77777777">
       <w:r>
-        <w:t>Оценка качества текущей модели интерпретируется как проверка семантического скоринга на сформированных split-файлах, а не как внешняя бизнес-валидация ATS. Для исправленных `val.tsv` и `test.tsv` были измерены метрики бинарного разделения пар по cosine score с подбором лучшего порога. Базовая</w:t>
-      </w:r>
-      <w:r>
-        <w:rPr>
-          <w:lang w:val="en-US"/>
-        </w:rPr>
-        <w:t xml:space="preserve"> </w:t>
-      </w:r>
-      <w:r>
-        <w:t>модель</w:t>
-      </w:r>
-      <w:r>
-        <w:rPr>
-          <w:lang w:val="en-US"/>
-        </w:rPr>
-        <w:t xml:space="preserve"> `cointegrated/rubert-tiny2` </w:t>
-      </w:r>
-      <w:r>
-        <w:t>без</w:t>
-      </w:r>
-      <w:r>
-        <w:rPr>
-          <w:lang w:val="en-US"/>
-        </w:rPr>
-        <w:t xml:space="preserve"> </w:t>
-      </w:r>
-      <w:r>
-        <w:t>дообучения</w:t>
-      </w:r>
-      <w:r>
-        <w:rPr>
-          <w:lang w:val="en-US"/>
-        </w:rPr>
-        <w:t xml:space="preserve"> </w:t>
-      </w:r>
-      <w:r>
-        <w:t>на</w:t>
-      </w:r>
-      <w:r>
-        <w:rPr>
-          <w:lang w:val="en-US"/>
-        </w:rPr>
-        <w:t xml:space="preserve"> `val` </w:t>
-      </w:r>
-      <w:r>
-        <w:t>имела</w:t>
-      </w:r>
-      <w:r>
-        <w:rPr>
-          <w:lang w:val="en-US"/>
-        </w:rPr>
-        <w:t xml:space="preserve"> Average Precision `0.2590`, best F1 `0.5079`, best accuracy `0.6603`, MCC `0.0315`; </w:t>
-      </w:r>
-      <w:r>
-        <w:t>после</w:t>
-      </w:r>
-      <w:r>
-        <w:rPr>
-          <w:lang w:val="en-US"/>
-        </w:rPr>
-        <w:t xml:space="preserve"> fine-tuning </w:t>
-      </w:r>
-      <w:r>
-        <w:t>сохраненная</w:t>
-      </w:r>
-      <w:r>
-        <w:rPr>
-          <w:lang w:val="en-US"/>
-        </w:rPr>
-        <w:t xml:space="preserve"> </w:t>
-      </w:r>
-      <w:r>
-        <w:t>модель</w:t>
-      </w:r>
-      <w:r>
-        <w:rPr>
-          <w:lang w:val="en-US"/>
-        </w:rPr>
-        <w:t xml:space="preserve"> `experiments/models/bi_encoder_rubert_tiny2` </w:t>
-      </w:r>
-      <w:r>
-        <w:t>достигла</w:t>
-      </w:r>
-      <w:r>
-        <w:rPr>
-          <w:lang w:val="en-US"/>
-        </w:rPr>
-        <w:t xml:space="preserve"> Average Precision `0.9870`, best F1 `0.9582`, best accuracy `0.9712`, MCC `0.9365`. </w:t>
-      </w:r>
-      <w:r>
-        <w:t>На</w:t>
-      </w:r>
-      <w:r>
-        <w:rPr>
-          <w:lang w:val="en-US"/>
-        </w:rPr>
-        <w:t xml:space="preserve"> `test` baseline </w:t>
-      </w:r>
-      <w:r>
-        <w:t>показал</w:t>
-      </w:r>
-      <w:r>
-        <w:rPr>
-          <w:lang w:val="en-US"/>
-        </w:rPr>
-        <w:t xml:space="preserve"> Average Precision `0.2222`, best F1 `0.5072`, best accuracy `0.6583`, MCC `0.0000`; fine-tuned </w:t>
-      </w:r>
-      <w:r>
-        <w:t>модель</w:t>
-      </w:r>
-      <w:r>
-        <w:rPr>
-          <w:lang w:val="en-US"/>
-        </w:rPr>
-        <w:t xml:space="preserve"> </w:t>
-      </w:r>
-      <w:r>
-        <w:t>показала</w:t>
-      </w:r>
-      <w:r>
-        <w:rPr>
-          <w:lang w:val="en-US"/>
-        </w:rPr>
-        <w:t xml:space="preserve"> Average Precision `0.9921`, best F1 `0.9636`, best accuracy `0.9750`, MCC `0.9447`. </w:t>
-      </w:r>
-      <w:r>
-        <w:t>Эти числа подтверждают улучшение разделимости положительных и отрицательных пар после обучения, но не являются метриками fair ranking или внешней экспертной проверки.</w:t>
+        <w:t>Оценка качества текущей модели интерпретируется как проверка семантического скоринга на сформированных split-файлах, а не как внешняя бизнес-валидация системы автоматизированного подбора персонала. Для исправленных `val.tsv` и `test.tsv` были измерены метрики бинарного разделения пар по cosine score с подбором лучшего порога. Базовая модель `cointegrated/rubert-tiny2` без дообучения на `val` имела Average Precision `0.2590`, best F1 `0.5079`, best accuracy `0.6603`, MCC `0.0315`; после fine-tuning сохраненная модель `experiments/models/bi_encoder_rubert_tiny2` достигла Average Precision `0.9870`, best F1 `0.9582`, best accuracy `0.9712`, MCC `0.9365`. На `test` baseline показал Average Precision `0.2222`, best F1 `0.5072`, best accuracy `0.6583`, MCC `0.0000`; fine-tuned модель показала Average Precision `0.9921`, best F1 `0.9636`, best accuracy `0.9750`, MCC `0.9447`. Эти числа подтверждают улучшение разделимости положительных и отрицательных пар после обучения, но не являются метриками fair ranking или внешней экспертной проверки.</w:t>
       </w:r>
     </w:p>
     <w:p ns2:paraId="106ABBA7" ns2:textId="77777777">
@@ -8714,12 +7643,12 @@
     </w:p>
     <w:p ns2:paraId="5E3C6997" ns2:textId="77777777">
       <w:r>
-        <w:t>Перед интерпретацией экспериментальных метрик важно зафиксировать, с какими классами ранжирующих систем сопоставляется реализованный подход на базе двунаправленного кодировщика представлений на основе трансформера (Bidirectional Encoder Representations from Transformers), модели векторных представлений предложений (Sentence Bidirectional Encoder Representations from Transformers) и архитектуры двойного кодировщика (dual encoder architecture). В задаче ATS описание вакансии фактически играет роль поискового запроса, а резюме кандидатов — роль документов, которые необходимо упорядочить по степени релевантности. Поэтому естественной точкой отсчета являются классические методы информационного поиска: векторная модель, TF-IDF, BM25, вероятностные модели релевантности, а также методы обучения ранжированию над заранее рассчитанными признаками [8, 11, 25, 26].</w:t>
+        <w:t>Перед интерпретацией экспериментальных метрик важно зафиксировать, с какими классами ранжирующих систем сопоставляется реализованный подход на базе двунаправленного кодировщика представлений на основе трансформера (Bidirectional Encoder Representations from Transformers), модели векторных представлений предложений (Sentence Bidirectional Encoder Representations from Transformers) и архитектуры двойного кодировщика (dual encoder architecture). В задаче автоматизированного подбора персонала описание вакансии фактически играет роль поискового запроса, а резюме кандидатов — роль документов, которые необходимо упорядочить по степени релевантности. Поэтому естественной точкой отсчета являются классические методы информационного поиска: векторная модель, TF-IDF, BM25, вероятностные модели релевантности, а также методы обучения ранжированию над заранее рассчитанными признаками [8, 11, 25, 26].</w:t>
       </w:r>
     </w:p>
     <w:p ns2:paraId="5E3C6997" ns2:textId="77777777">
       <w:r>
-        <w:t>Лексические методы, такие как TF-IDF и BM25, остаются полезными baseline-подходами, поскольку они просты, вычислительно дешевы и хорошо интерпретируются. Для ATS-сценария это означает возможность быстро оценивать совпадение должностей, технологий, сертификатов и иных явно указанных требований. Однако в текстах вакансий и резюме релевантность часто выражается не буквальным совпадением слов, а согласованностью содержания вакансии и резюме: совпадением названия должности и уровня позиции, пересечением требуемых и указанных в резюме навыков и технологий, а также сопоставимостью описанных задач, обязанностей и достижений. В таких случаях чисто лексическое ранжирование может недооценивать релевантное резюме, если кандидат и работодатель описывают один и тот же опыт разными словами.</w:t>
+        <w:t>Лексические методы, такие как TF-IDF и BM25, остаются полезными baseline-подходами, поскольку они просты, вычислительно дешевы и хорошо интерпретируются. Для сценария автоматизированного подбора персонала это означает возможность быстро оценивать совпадение должностей, технологий, сертификатов и иных явно указанных требований. Однако в текстах вакансий и резюме релевантность часто выражается не буквальным совпадением слов, а согласованностью содержания вакансии и резюме: совпадением названия должности и уровня позиции, пересечением требуемых и указанных в резюме навыков и технологий, а также сопоставимостью описанных задач, обязанностей и достижений. В таких случаях чисто лексическое ранжирование может недооценивать релевантное резюме, если кандидат и работодатель описывают один и тот же опыт разными словами.</w:t>
       </w:r>
     </w:p>
     <w:p ns2:paraId="5E3C6997" ns2:textId="77777777">
@@ -8729,7 +7658,7 @@
     </w:p>
     <w:p ns2:paraId="5E3C6997" ns2:textId="77777777">
       <w:r>
-        <w:t>Ссылочные методы, например PageRank, в рассматриваемой постановке имеют меньшую практическую роль: они естественны для веб-графов и сетей цитирования, но не описывают напрямую смысловое соответствие вакансии и резюме [27]. Напротив, классические методы обучения ранжированию (learning to rank), включая RankNet, LambdaMART и градиентный бустинг для ранжирования, являются логичным направлением дальнейшего развития [8, 9, 28]. При наличии достаточного числа списков кандидатов и градуированных оценок они могут объединить BM25-score, семантический показатель, полученный архитектурой двойного кодировщика (dual encoder architecture), структурные признаки профиля и поведенческие сигналы ATS в единую ранжирующую функцию. Поэтому выбор двунаправленного кодировщика (Bidirectional Encoder Representations from Transformers) и модели векторных представлений предложений (Sentence Bidirectional Encoder Representations from Transformers) в текущей реализации следует понимать не как отказ от классического информационного поиска, а как получение и экспериментальную проверку воспроизводимого семантического показателя для русскоязычных пар «вакансия–резюме»; построение полноценной гибридной модели ранжирования с обучением ранжированию (learning to rank) вынесено на следующий этап и предполагает использование этого показателя как одного из входных признаков.</w:t>
+        <w:t>Ссылочные методы, например PageRank, в рассматриваемой постановке имеют меньшую практическую роль: они естественны для веб-графов и сетей цитирования, но не описывают напрямую смысловое соответствие вакансии и резюме [27]. Напротив, классические методы обучения ранжированию (learning to rank), включая RankNet, LambdaMART и градиентный бустинг для ранжирования, являются логичным направлением дальнейшего развития [8, 9, 28]. При наличии достаточного числа списков кандидатов и градуированных оценок они могут объединить BM25-score, семантический показатель, полученный архитектурой двойного кодировщика (dual encoder architecture), структурные признаки профиля и поведенческие сигналы системы подбора персонала в единую ранжирующую функцию. Поэтому выбор двунаправленного кодировщика (Bidirectional Encoder Representations from Transformers) и модели векторных представлений предложений (Sentence Bidirectional Encoder Representations from Transformers) в текущей реализации следует понимать не как отказ от классического информационного поиска, а как реализацию первого, семантического признака в более широком семействе методов ранжирования.</w:t>
       </w:r>
     </w:p>
     <w:p ns2:paraId="4EABBBF1" ns2:textId="77777777">
@@ -8877,7 +7806,7 @@
         <w:jc w:val="left"/>
       </w:pPr>
       <w:r>
-        <w:t>Таким образом, в работе реально подтверждены два результата. Во-первых, дообучение `cointegrated/rubert-tiny2` на целевом наборе связанных пар заметно улучшает качество бинарного различения релевантных и нерелевантных соответствий. Во-вторых, на полном тестовом срезе модель показывает высокие ranking-метрики при сортировке кандидатов внутри вакансий. Вместе с тем эти результаты следует интерпретировать как офлайн-валидацию на исторических данных, а не как онлайн-эксперимент в рабочем контуре ATS.</w:t>
+        <w:t>Таким образом, в работе реально подтверждены два результата. Во-первых, дообучение `cointegrated/rubert-tiny2` на целевом наборе связанных пар заметно улучшает качество бинарного различения релевантных и нерелевантных соответствий. Во-вторых, на полном тестовом срезе модель показывает высокие ranking-метрики при сортировке кандидатов внутри вакансий. Вместе с тем эти результаты следует интерпретировать как офлайн-валидацию на исторических данных, а не как онлайн-эксперимент в рабочем контуре Reqcore.</w:t>
       </w:r>
     </w:p>
     <w:p ns2:paraId="5D5F3ADB" ns2:textId="3A6B7152">
@@ -8887,38 +7816,20 @@
         <w:jc w:val="left"/>
       </w:pPr>
       <w:r>
-        <w:t xml:space="preserve">Ограничения экспериментальной части также должны быть зафиксированы явно. В работе </w:t>
-      </w:r>
-      <w:r>
-        <w:t>нет отдельных воспроизводимых экспериментов</w:t>
-      </w:r>
-      <w:r>
-        <w:rPr>
-          <w:lang w:val="ru-RU"/>
-        </w:rPr>
-        <w:t xml:space="preserve"> </w:t>
-      </w:r>
-      <w:r>
-        <w:t>по подтверждению утверждения о TF-IDF edge-case baseline, полном ablation-анализе архитектурных блоков, HR-валидации explainability, bias-audit по социальным признакам и нагрузочном сравнении больших кандидатских пулов. Кроме того, treatment-ветка `biencoder` в текущем коде возвращает только числовой score и не формирует criterion-level `evidence`, `strengths` и `gaps`, поэтому результаты корректно трактовать именно как проверку качества числового сопоставления и ранжирования, а не как оценку полноты объяснимости решения.</w:t>
+        <w:t>Ограничения экспериментальной части также должны быть зафиксированы явно. В работе нет отдельных воспроизводимых экспериментов по подтверждению утверждения о TF-IDF edge-case baseline, полном ablation-анализе архитектурных блоков, HR-валидации explainability, bias-audit по социальным признакам и нагрузочном сравнении больших кандидатских пулов. Кроме того, treatment-ветка `biencoder` в текущем коде возвращает только числовой score и не формирует criterion-level `evidence`, `strengths` и `gaps`, поэтому результаты корректно трактовать именно как проверку качества числового сопоставления и ранжирования, а не как оценку полноты объяснимости решения.</w:t>
       </w:r>
     </w:p>
     <w:p ns2:paraId="2961DD05" ns2:textId="77777777">
       <w:pPr>
         <w:pStyle w:val="2"/>
       </w:pPr>
-      <w:bookmarkStart w:id="57" w:name="_Toc230211059"/>
-      <w:r>
-        <w:t>4.2 Выполнение интеграции созданного модуля в целевую ATS-систему</w:t>
-      </w:r>
-      <w:bookmarkEnd w:id="57"/>
+      <w:r>
+        <w:t>4.2 Выполнение интеграции созданного модуля в целевую систему автоматизированного управления подбором персонала</w:t>
+      </w:r>
     </w:p>
     <w:p ns2:paraId="2A68CD27" ns2:textId="77777777">
       <w:r>
-        <w:t xml:space="preserve">Интеграция реализована в виде отдельного FastAPI-сервиса ранжирования, который взаимодействует с ATS по HTTP. В текущем коде Python-сервис `experiments/scripts/11_api_server.py` предоставляет три маршрута: `POST /index/candidate` для загрузки кандидатских профилей во временный in-memory пул, `POST /search/rank` для ранжирования списка кандидатов по cosine similarity и `POST /score` для расчета score </w:t>
-      </w:r>
-      <w:r>
-        <w:lastRenderedPageBreak/>
-        <w:t>одной пары `вакансия-кандидат`. Таким образом, фактически реализованный контур представляет собой внешний сервис семантического скоринга с in-memory хранением профилей, а не связку с промышленной векторной базой данных.</w:t>
+        <w:t>Интеграция реализована в виде отдельного сервиса HTTP API на Python-фреймворке FastAPI, который взаимодействует с Reqcore по HTTP. В текущем коде Python-сервис `experiments/scripts/11_api_server.py` предоставляет три маршрута: `POST /index/candidate` для загрузки кандидатских профилей во временный in-memory пул, `POST /search/rank` для ранжирования списка кандидатов по косинусному сходству и `POST /score` для расчета числовой оценки соответствия одной пары «текст вакансии–текст резюме». Таким образом, фактически реализованная интеграция представляет собой внешний сервис семантического скоринга с in-memory хранением профилей, а не связку с промышленной векторной базой данных.</w:t>
       </w:r>
     </w:p>
     <w:p ns2:paraId="11931DD3" ns2:textId="77777777">
@@ -8928,27 +7839,17 @@
     </w:p>
     <w:p ns2:paraId="53EBD429" ns2:textId="5A1E205B">
       <w:r>
-        <w:t xml:space="preserve">Дополнительно была выполнена практическая локальная проверка интеграции с Reqcore. Для этого был поднят локальный demo-стенд Reqcore через Docker Compose, Python сервис независимого энкодера (bi-encoder) был запущен отдельно с указанием `MODEL_PATH`, а серверная переменная `BIENCODER_URL` была направлена на этот сервис. В результате treatment-путь `provider === biencoder` в `ats/reqcore/server/api/applications/[id]/analyze.post.ts` был реально пройден до конца: Reqcore вызвал `POST /score`, получил числовой `match_score`, преобразовал его в итоговый `application.score` и сохранил completed `analysis_run` с `provider = biencoder`, `model = cointegrated/rubert-tiny2`, `promptTokens = 0` и `completionTokens = 0`. Тем самым подтверждена не только автономная работа FastAPI-сервиса, но и его фактическое подключение к </w:t>
-      </w:r>
-      <w:r>
-        <w:t>ATS-контуру Reqcore</w:t>
-      </w:r>
-      <w:r>
-        <w:t>.</w:t>
+        <w:t>Дополнительно была выполнена практическая локальная проверка интеграции с Reqcore. Для этого был поднят локальный demo-стенд Reqcore через Docker Compose, Python-сервис независимого энкодера (bi-encoder) был запущен отдельно с указанием `MODEL_PATH`, а серверная переменная `BIENCODER_URL` была направлена на этот сервис. В результате treatment-путь `provider === biencoder` в `ats/reqcore/server/api/applications/[id]/analyze.post.ts` был реально пройден до конца: Reqcore вызвал `POST /score`, получил числовой `match_score`, преобразовал его в итоговый `application.score` и сохранил completed `analysis_run` с `provider = biencoder`, `model = cointegrated/rubert-tiny2`, `promptTokens = 0` и `completionTokens = 0`. Тем самым подтверждена не только автономная работа сервиса на FastAPI, но и его фактическое подключение к тестовому контуру Reqcore.</w:t>
       </w:r>
     </w:p>
     <w:p ns2:paraId="1936FEB1" ns2:textId="77777777">
       <w:r>
-        <w:t>Важно, что текущая интеграция с Reqcore не заменяет весь LLM-контур целиком, а добавляет альтернативный score-only путь. Для стандартного LLM-сценария маршрут `POST /api/applications/[id]/analyze` продолжает использовать `scoreApplication()`, провайдера LLM и сохранение criterion-level breakdown в `criterion_score`. Для biencoder-сценария тот же маршрут использует отдельную ветку с вызовом `BIENCODER_URL + /score`, после чего в ATS записывается только итоговый числовой score без `criterion_score`, `evidence`, `strengths` и `gaps`. Следовательно, интеграция корректно описывается как подключение альтернативного семантического scoring-модуля, а не как внедрение полноценной векторной БД или полного replacement всего LLM-анализа.</w:t>
+        <w:t>Важно, что текущая интеграция с Reqcore не заменяет весь LLM-контур целиком, а добавляет альтернативный score-only путь. Для стандартного LLM-сценария маршрут `POST /api/applications/[id]/analyze` продолжает использовать `scoreApplication()`, провайдера LLM и сохранение criterion-level breakdown в `criterion_score`. Для biencoder-сценария тот же маршрут использует отдельную ветку с вызовом `BIENCODER_URL + /score`, после чего в Reqcore записывается только итоговый числовой score без `criterion_score`, `evidence`, `strengths` и `gaps`. Следовательно, интеграция корректно описывается как подключение альтернативного семантического scoring-модуля, а не как внедрение полноценной векторной БД или полного replacement всего LLM-анализа.</w:t>
       </w:r>
     </w:p>
     <w:p ns2:paraId="6DD57EF3" ns2:textId="77777777">
       <w:r>
-        <w:t xml:space="preserve">Ограничения интеграционного контура также должны быть зафиксированы явно. В текущей реализации не подтверждены утверждения о корпоративном дисковом векторном хранилище профилей, Milvus, DiskANN, SPANN, миллионных индексах, графовой навигации по ANN-структурам или специальных механизмах контроля деградации через версионируемое внешнее векторное хранилище. Также не подтверждено наличие </w:t>
-      </w:r>
-      <w:r>
-        <w:lastRenderedPageBreak/>
-        <w:t>отдельного production-контура аудита на независимых тестовых корпусах русского языка. Реально реализованный и проверенный контур ограничивается микросервисом независимого энкодера (bi-encoder), in-memory candidate pool для ranking API, Reqcore-интеграцией через `BIENCODER_URL` и локальным E2E/smoke-тестированием этой связки.</w:t>
+        <w:t>Ограничения интеграционного контура также должны быть зафиксированы явно. В текущей реализации не подтверждены утверждения о корпоративном дисковом векторном хранилище профилей, Milvus, DiskANN, SPANN, миллионных индексах, графовой навигации по ANN-структурам или специальных механизмах контроля деградации через версионируемое внешнее векторное хранилище. Также не подтверждено наличие отдельного production-контура аудита на независимых тестовых корпусах русского языка. Реально реализованный и проверенный контур ограничивается микросервисом независимого энкодера (bi-encoder), in-memory candidate pool для ranking API, Reqcore-интеграцией через `BIENCODER_URL` и локальным E2E/smoke-тестированием этой связки.</w:t>
       </w:r>
     </w:p>
     <w:p ns2:paraId="32742863" ns2:textId="77777777">
@@ -8963,7 +7864,7 @@
     </w:p>
     <w:p ns2:paraId="2D3E3E66" ns2:textId="77777777">
       <w:r>
-        <w:t>Экономическая оценка в данной версии не опирается на production-логи токенов и не утверждает, что фактический расход был извлечен из работающей ATS. В коде Reqcore действительно предусмотрены поля `analysis_run.prompt_tokens`, `analysis_run.completion_tokens` и настраиваемые `input_price_per_1m` / `output_price_per_1m`, а UI рассчитывает стоимость по формуле `(promptTokens / 1_000_000) * inputPrice + (completionTokens / 1_000_000) * outputPrice`. Однако в рамках данной работы эти значения не выгружались из production-БД, поэтому ниже приведен только оценочный расчет на публичных pricing constants и явно заданных допущениях.</w:t>
+        <w:t>Экономическая оценка в данной версии не опирается на production-логи токенов и не утверждает, что фактический расход был извлечен из работающей системы подбора персонала. В коде Reqcore действительно предусмотрены поля `analysis_run.prompt_tokens`, `analysis_run.completion_tokens` и настраиваемые `input_price_per_1m` / `output_price_per_1m`, а UI рассчитывает стоимость по формуле `(promptTokens / 1_000_000) * inputPrice + (completionTokens / 1_000_000) * outputPrice`. Однако в рамках данной работы эти значения не выгружались из production-БД, поэтому ниже приведен только оценочный расчет на публичных pricing constants и явно заданных допущениях.</w:t>
       </w:r>
     </w:p>
     <w:p ns2:paraId="47ECA020" ns2:textId="77777777">
@@ -10437,7 +9338,7 @@
         </w:rPr>
       </w:pPr>
       <w:r>
-        <w:t>Если локальная инфраструктурная стоимость мала относительно LLM API-cost или уже включена в стоимость работающего ATS-сервера, то оценочная экономия по внешнему API приближенно равна:</w:t>
+        <w:t>Если локальная инфраструктурная стоимость мала относительно LLM API-cost или уже включена в стоимость работающего сервера системы подбора персонала, то оценочная экономия по внешнему API приближенно равна:</w:t>
       </w:r>
     </w:p>
     <w:p ns2:paraId="7A69F076" ns2:textId="192AE64F">
@@ -11753,10 +10654,7 @@
     </w:p>
     <w:p ns2:paraId="3331DABC" ns2:textId="77777777">
       <w:r>
-        <w:t>Таким образом, LLM scoring дает более детальное объяснимое оценивание по критериям, но имеет переменную стоимость за каждый candidate/job вызов и зависит от внешнего API. Bi-encoder scoring дешевле по внешним API-платежам и лучше подходит для первичного top-K отбора, но требует локального обслуживания модели и не заменяет полноценную экспертную или LLM-интерпретацию причин соответствия кандидата.</w:t>
-      </w:r>
-      <w:r>
-        <w:br w:type="page"/>
+        <w:t>Таким образом, LLM scoring дает более детальное объяснимое оценивание по критериям, но имеет переменную стоимость за каждый candidate/job вызов и зависит от внешнего API. Скоринг независимым энкодером (bi-encoder) дешевле по внешним API-платежам и лучше подходит для первичного top-K отбора, но требует локального обслуживания модели и не заменяет полноценную экспертную или LLM-интерпретацию причин соответствия кандидата.</w:t>
       </w:r>
     </w:p>
     <w:p ns2:paraId="1AA13F8E" ns2:textId="77777777">
@@ -11777,7 +10675,7 @@
         </w:rPr>
       </w:pPr>
       <w:r>
-        <w:t>В ходе работы был разработан и проверен прототип модуля семантического сопоставления пары «вакансия–резюме» для интеграции в ATS-систему. Основой решения стала архитектура независимого энкодера (bi-encoder) на базе cointegrated/rubert-tiny2, дообученная на корпусе связанных HR-событий. Для подготовки данных были выполнены фильтрация явно интерпретируемых статусов, деидентификация текстов, формирование unified-представлений резюме и вакансий, а также построение train/val/test split.</w:t>
+        <w:t>В ходе работы был разработан и проверен прототип модуля семантического сопоставления пары «вакансия–резюме» для интеграции в систему автоматизированного управления подбором персонала. Основой решения стала архитектура независимого энкодера (bi-encoder) на базе `cointegrated/rubert-tiny2`: вакансия и резюме кодируются раздельно, после чего оценка рассчитывается по косинусному сходству. Для подготовки данных были выполнены фильтрация явно интерпретируемых статусов, деидентификация текстов, формирование unified-представлений резюме и вакансий, а также построение train/val/test split.</w:t>
       </w:r>
     </w:p>
     <w:p ns2:paraId="632A2732" ns2:textId="7AA56A26">
@@ -11787,7 +10685,7 @@
         </w:rPr>
       </w:pPr>
       <w:r>
-        <w:t>Практическая реализация включает модуль ранжирования ATSRanker и FastAPI-сервис, предоставляющий маршруты для индексации кандидатов, ранжирования кандидатского пула и вычисления score для одной пары «вакансия–резюме». Дополнительно была выполнена интеграция с тестовым контуром ATS Reqcore через ветку provider === biencoder, где результат работы модели преобразуется в числовое поле application.score.</w:t>
+        <w:t>Практическая реализация включает модуль ранжирования `ATSRanker` и сервис HTTP API на Python-фреймворке FastAPI, предоставляющий маршруты для индексации кандидатов, ранжирования кандидатского пула и вычисления score для одной пары «вакансия–резюме». Дополнительно была выполнена интеграция с тестовым контуром Reqcore через ветку `provider === biencoder`, где результат работы модели преобразуется в числовое поле `application.score`.</w:t>
       </w:r>
     </w:p>
     <w:p ns2:paraId="0B2DC5FC" ns2:textId="5EF0B305">
@@ -11807,7 +10705,7 @@
         </w:rPr>
       </w:pPr>
       <w:r>
-        <w:t>Ограничения текущей реализации связаны с использованием in-memory candidate pool, отсутствием промышленного векторного хранилища, ANN-поиска, LTR-реранжирования, bias-audit и нагрузочного тестирования. Дальнейшее развитие работы целесообразно направить на масштабирование поиска, добавление второго этапа reranking, расширение explainability-механизмов и проведение онлайн-валидации в рабочем ATS-контуре.</w:t>
+        <w:t>Ограничения текущей реализации связаны с использованием in-memory candidate pool, отсутствием промышленного векторного хранилища, ANN-поиска, LTR-реранжирования, bias-audit и нагрузочного тестирования. Дальнейшее развитие работы целесообразно направить на масштабирование поиска, добавление второго этапа reranking, расширение explainability-механизмов и проведение онлайн-валидации в рабочем контуре Reqcore.</w:t>
       </w:r>
     </w:p>
     <w:p ns2:paraId="58AC8CB7" ns2:textId="77777777"/>

</xml_diff>

<commit_message>
Keep VKR docx artifact unchanged
</commit_message>
<xml_diff>
--- a/vkr/artifacts/М24-534_НосовАИ_ВКР_old.docx
+++ b/vkr/artifacts/М24-534_НосовАИ_ВКР_old.docx
@@ -305,7 +305,7 @@
                 <w:rStyle w:val="ae"/>
                 <w:noProof/>
               </w:rPr>
-              <w:t>1.1 Системный анализ предметной области рекрутмента, процессов найма и систем автоматизированного управления подбором персонала</w:t>
+              <w:t>1.1 Системный анализ предметной области рекрутмента, процессов найма и ATS-систем</w:t>
             </w:r>
             <w:r>
               <w:rPr>
@@ -527,7 +527,7 @@
                 <w:rStyle w:val="ae"/>
                 <w:noProof/>
               </w:rPr>
-              <w:t>2 Проектирование данных, архитектуры обработки и интеграции с системой автоматизированного подбора персонала</w:t>
+              <w:t>2 Проектирование данных, архитектуры обработки и интеграции с ATS</w:t>
             </w:r>
             <w:r>
               <w:rPr>
@@ -749,7 +749,7 @@
                 <w:rStyle w:val="ae"/>
                 <w:noProof/>
               </w:rPr>
-              <w:t>2.3 Спецификация программного интерфейса (API) и модулей интеграции с ядром системы подбора персонала</w:t>
+              <w:t>2.3 Спецификация программного интерфейса (API) и модулей интеграции с ядром ATS</w:t>
             </w:r>
             <w:r>
               <w:rPr>
@@ -823,7 +823,7 @@
                 <w:rStyle w:val="ae"/>
                 <w:noProof/>
               </w:rPr>
-              <w:t>3 Разработка и реализация модуля сопоставления вакансий и резюме для ранжирования кандидатов</w:t>
+              <w:t>3 Разработка и реализация модуля семантического ранжирования кандидатов</w:t>
             </w:r>
             <w:r>
               <w:rPr>
@@ -971,7 +971,7 @@
                 <w:rStyle w:val="ae"/>
                 <w:noProof/>
               </w:rPr>
-              <w:t>3.2 Реализация и доменная настройка (fine-tuning) модели сопоставления «вакансия-резюме»</w:t>
+              <w:t>3.2 Реализация и дообучение (fine-tuning) модели сопоставления «вакансия-резюме»</w:t>
             </w:r>
             <w:r>
               <w:rPr>
@@ -1193,7 +1193,7 @@
                 <w:rStyle w:val="ae"/>
                 <w:noProof/>
               </w:rPr>
-              <w:t>4.2 Выполнение интеграции созданного модуля в целевую систему автоматизированного управления подбором персонала</w:t>
+              <w:t>4.2 Выполнение интеграции созданного модуля в целевую ATS-систему</w:t>
             </w:r>
             <w:r>
               <w:rPr>
@@ -1529,7 +1529,82 @@
         </w:rPr>
       </w:pPr>
       <w:r>
-        <w:t>Разработан прототип модуля предварительного отбора кандидатов, который сопоставляет текст вакансии и текст резюме по смысловому содержанию и формирует ранжированный список профилей по степени соответствия требованиям позиции. Решение предназначено для интеграции с системой автоматизированного управления подбором персонала (Applicant Tracking System). В рамках реализации выполнены подготовка и разметка связанных пар «текст вакансии–текст резюме», доменная настройка модели независимого энкодера (bi-encoder) на базе `cointegrated/rubert-tiny2`, разработка модуля ранжирования, создание сервиса HTTP API на Python-фреймворке FastAPI и подключение к тестовому контуру системы Reqcore.</w:t>
+        <w:rPr>
+          <w:lang w:val="ru-RU"/>
+        </w:rPr>
+        <w:t xml:space="preserve">Разработан прототип модуля семантического ранжирования кандидатов для </w:t>
+      </w:r>
+      <w:r>
+        <w:rPr>
+          <w:lang w:val="en-US"/>
+        </w:rPr>
+        <w:t>ATS</w:t>
+      </w:r>
+      <w:r>
+        <w:rPr>
+          <w:lang w:val="ru-RU"/>
+        </w:rPr>
+        <w:t xml:space="preserve">-системы. Реализованы контур подготовки данных, дообучение </w:t>
+      </w:r>
+      <w:r>
+        <w:rPr>
+          <w:lang w:val="en-US"/>
+        </w:rPr>
+        <w:t>bi</w:t>
+      </w:r>
+      <w:r>
+        <w:rPr>
+          <w:lang w:val="ru-RU"/>
+        </w:rPr>
+        <w:t>-</w:t>
+      </w:r>
+      <w:r>
+        <w:rPr>
+          <w:lang w:val="en-US"/>
+        </w:rPr>
+        <w:t>encoder</w:t>
+      </w:r>
+      <w:r>
+        <w:rPr>
+          <w:lang w:val="ru-RU"/>
+        </w:rPr>
+        <w:t xml:space="preserve"> модели на парах «вакансия–резюме», модуль ранжирования, </w:t>
+      </w:r>
+      <w:r>
+        <w:rPr>
+          <w:lang w:val="en-US"/>
+        </w:rPr>
+        <w:t>FastAPI</w:t>
+      </w:r>
+      <w:r>
+        <w:rPr>
+          <w:lang w:val="ru-RU"/>
+        </w:rPr>
+        <w:t xml:space="preserve">-сервис и интеграция с тестовым контуром </w:t>
+      </w:r>
+      <w:r>
+        <w:rPr>
+          <w:lang w:val="en-US"/>
+        </w:rPr>
+        <w:t>ATS</w:t>
+      </w:r>
+      <w:r>
+        <w:rPr>
+          <w:lang w:val="ru-RU"/>
+        </w:rPr>
+        <w:t xml:space="preserve"> </w:t>
+      </w:r>
+      <w:r>
+        <w:rPr>
+          <w:lang w:val="en-US"/>
+        </w:rPr>
+        <w:t>Reqcore</w:t>
+      </w:r>
+      <w:r>
+        <w:rPr>
+          <w:lang w:val="ru-RU"/>
+        </w:rPr>
+        <w:t>.</w:t>
       </w:r>
     </w:p>
     <w:p ns2:paraId="7300B41A" ns2:textId="043CCF62">
@@ -1539,7 +1614,196 @@
         </w:rPr>
       </w:pPr>
       <w:r>
-        <w:t>Ключевые слова: автоматизированное управление подбором персонала, рекрутмент, резюме, вакансия, семантическое сопоставление, независимый энкодер (bi-encoder), Sentence-BERT, косинусное сходство, FastAPI, Reqcore.</w:t>
+        <w:rPr>
+          <w:lang w:val="ru-RU"/>
+        </w:rPr>
+        <w:t>Ключевые</w:t>
+      </w:r>
+      <w:r>
+        <w:rPr>
+          <w:lang w:val="ru-RU"/>
+        </w:rPr>
+        <w:t xml:space="preserve"> </w:t>
+      </w:r>
+      <w:r>
+        <w:rPr>
+          <w:lang w:val="ru-RU"/>
+        </w:rPr>
+        <w:t>слова</w:t>
+      </w:r>
+      <w:r>
+        <w:rPr>
+          <w:lang w:val="ru-RU"/>
+        </w:rPr>
+        <w:t xml:space="preserve">: </w:t>
+      </w:r>
+      <w:r>
+        <w:rPr>
+          <w:lang w:val="en-US"/>
+        </w:rPr>
+        <w:t>ATS</w:t>
+      </w:r>
+      <w:r>
+        <w:rPr>
+          <w:lang w:val="ru-RU"/>
+        </w:rPr>
+        <w:t xml:space="preserve">, </w:t>
+      </w:r>
+      <w:r>
+        <w:rPr>
+          <w:lang w:val="ru-RU"/>
+        </w:rPr>
+        <w:t>рекрутмент</w:t>
+      </w:r>
+      <w:r>
+        <w:rPr>
+          <w:lang w:val="ru-RU"/>
+        </w:rPr>
+        <w:t xml:space="preserve">, </w:t>
+      </w:r>
+      <w:r>
+        <w:rPr>
+          <w:lang w:val="ru-RU"/>
+        </w:rPr>
+        <w:t>резюме</w:t>
+      </w:r>
+      <w:r>
+        <w:rPr>
+          <w:lang w:val="ru-RU"/>
+        </w:rPr>
+        <w:t xml:space="preserve">, </w:t>
+      </w:r>
+      <w:r>
+        <w:rPr>
+          <w:lang w:val="ru-RU"/>
+        </w:rPr>
+        <w:t>вакансия</w:t>
+      </w:r>
+      <w:r>
+        <w:rPr>
+          <w:lang w:val="ru-RU"/>
+        </w:rPr>
+        <w:t xml:space="preserve">, </w:t>
+      </w:r>
+      <w:r>
+        <w:rPr>
+          <w:lang w:val="ru-RU"/>
+        </w:rPr>
+        <w:t>семантическое</w:t>
+      </w:r>
+      <w:r>
+        <w:rPr>
+          <w:lang w:val="ru-RU"/>
+        </w:rPr>
+        <w:t xml:space="preserve"> </w:t>
+      </w:r>
+      <w:r>
+        <w:rPr>
+          <w:lang w:val="ru-RU"/>
+        </w:rPr>
+        <w:t>ранжирование</w:t>
+      </w:r>
+      <w:r>
+        <w:rPr>
+          <w:lang w:val="ru-RU"/>
+        </w:rPr>
+        <w:t xml:space="preserve">, </w:t>
+      </w:r>
+      <w:r>
+        <w:rPr>
+          <w:lang w:val="en-US"/>
+        </w:rPr>
+        <w:t>bi</w:t>
+      </w:r>
+      <w:r>
+        <w:rPr>
+          <w:lang w:val="ru-RU"/>
+        </w:rPr>
+        <w:t>-</w:t>
+      </w:r>
+      <w:r>
+        <w:rPr>
+          <w:lang w:val="en-US"/>
+        </w:rPr>
+        <w:t>encoder</w:t>
+      </w:r>
+      <w:r>
+        <w:rPr>
+          <w:lang w:val="ru-RU"/>
+        </w:rPr>
+        <w:t xml:space="preserve">, </w:t>
+      </w:r>
+      <w:r>
+        <w:rPr>
+          <w:lang w:val="en-US"/>
+        </w:rPr>
+        <w:t>Sentence</w:t>
+      </w:r>
+      <w:r>
+        <w:rPr>
+          <w:lang w:val="ru-RU"/>
+        </w:rPr>
+        <w:t>-</w:t>
+      </w:r>
+      <w:r>
+        <w:rPr>
+          <w:lang w:val="en-US"/>
+        </w:rPr>
+        <w:t>BERT</w:t>
+      </w:r>
+      <w:r>
+        <w:rPr>
+          <w:lang w:val="ru-RU"/>
+        </w:rPr>
+        <w:t xml:space="preserve">, </w:t>
+      </w:r>
+      <w:r>
+        <w:rPr>
+          <w:lang w:val="en-US"/>
+        </w:rPr>
+        <w:t>cosine</w:t>
+      </w:r>
+      <w:r>
+        <w:rPr>
+          <w:lang w:val="ru-RU"/>
+        </w:rPr>
+        <w:t xml:space="preserve"> </w:t>
+      </w:r>
+      <w:r>
+        <w:rPr>
+          <w:lang w:val="en-US"/>
+        </w:rPr>
+        <w:t>similarity</w:t>
+      </w:r>
+      <w:r>
+        <w:rPr>
+          <w:lang w:val="ru-RU"/>
+        </w:rPr>
+        <w:t xml:space="preserve">, </w:t>
+      </w:r>
+      <w:r>
+        <w:rPr>
+          <w:lang w:val="en-US"/>
+        </w:rPr>
+        <w:t>FastAPI</w:t>
+      </w:r>
+      <w:r>
+        <w:rPr>
+          <w:lang w:val="ru-RU"/>
+        </w:rPr>
+        <w:t xml:space="preserve">, </w:t>
+      </w:r>
+      <w:r>
+        <w:rPr>
+          <w:lang w:val="en-US"/>
+        </w:rPr>
+        <w:t>Reqcore</w:t>
+      </w:r>
+      <w:r>
+        <w:rPr>
+          <w:lang w:val="ru-RU"/>
+        </w:rPr>
+        <w:t>.</w:t>
       </w:r>
     </w:p>
     <w:p ns2:paraId="0D20096B" ns2:textId="2BEC91BC">
@@ -1549,7 +1813,22 @@
         </w:rPr>
       </w:pPr>
       <w:r>
-        <w:t>Целью данной работы является разработка и экспериментальная проверка прототипа модуля семантического сопоставления пары «вакансия–резюме» для интеграции в систему автоматизированного управления подбором персонала.</w:t>
+        <w:rPr>
+          <w:lang w:val="ru-RU"/>
+        </w:rPr>
+        <w:t xml:space="preserve">Целью данной работы является разработка и экспериментальная проверка прототипа модуля семантического сопоставления пары «вакансия–резюме» для интеграции в </w:t>
+      </w:r>
+      <w:r>
+        <w:rPr>
+          <w:lang w:val="en-US"/>
+        </w:rPr>
+        <w:t>ATS</w:t>
+      </w:r>
+      <w:r>
+        <w:rPr>
+          <w:lang w:val="ru-RU"/>
+        </w:rPr>
+        <w:t>-систему.</w:t>
       </w:r>
     </w:p>
     <w:p ns2:paraId="66B128CF" ns2:textId="2D9F9671">
@@ -1559,7 +1838,94 @@
         </w:rPr>
       </w:pPr>
       <w:r>
-        <w:t>В первой главе анализируются предметная область рекрутмента, процессы найма, системы автоматизированного управления подбором персонала, методы обработки естественного языка и подходы к ранжированию кандидатов. Рассматриваются классические методы информационного поиска, Learning to Rank, архитектуры BERT и Sentence-BERT, а также ограничения, связанные со справедливостью алгоритмического ранжирования.</w:t>
+        <w:rPr>
+          <w:lang w:val="ru-RU"/>
+        </w:rPr>
+        <w:t xml:space="preserve">В первой главе анализируются предметная область рекрутмента, процессы найма, </w:t>
+      </w:r>
+      <w:r>
+        <w:rPr>
+          <w:lang w:val="en-US"/>
+        </w:rPr>
+        <w:t>ATS</w:t>
+      </w:r>
+      <w:r>
+        <w:rPr>
+          <w:lang w:val="ru-RU"/>
+        </w:rPr>
+        <w:t xml:space="preserve">-системы, методы обработки естественного языка и подходы к ранжированию кандидатов. Рассматриваются классические методы информационного поиска, </w:t>
+      </w:r>
+      <w:r>
+        <w:rPr>
+          <w:lang w:val="en-US"/>
+        </w:rPr>
+        <w:t>Learning</w:t>
+      </w:r>
+      <w:r>
+        <w:rPr>
+          <w:lang w:val="ru-RU"/>
+        </w:rPr>
+        <w:t xml:space="preserve"> </w:t>
+      </w:r>
+      <w:r>
+        <w:rPr>
+          <w:lang w:val="en-US"/>
+        </w:rPr>
+        <w:t>to</w:t>
+      </w:r>
+      <w:r>
+        <w:rPr>
+          <w:lang w:val="ru-RU"/>
+        </w:rPr>
+        <w:t xml:space="preserve"> </w:t>
+      </w:r>
+      <w:r>
+        <w:rPr>
+          <w:lang w:val="en-US"/>
+        </w:rPr>
+        <w:t>Rank</w:t>
+      </w:r>
+      <w:r>
+        <w:rPr>
+          <w:lang w:val="ru-RU"/>
+        </w:rPr>
+        <w:t xml:space="preserve">, архитектуры </w:t>
+      </w:r>
+      <w:r>
+        <w:rPr>
+          <w:lang w:val="en-US"/>
+        </w:rPr>
+        <w:t>BERT</w:t>
+      </w:r>
+      <w:r>
+        <w:rPr>
+          <w:lang w:val="ru-RU"/>
+        </w:rPr>
+        <w:t xml:space="preserve"> и </w:t>
+      </w:r>
+      <w:r>
+        <w:rPr>
+          <w:lang w:val="en-US"/>
+        </w:rPr>
+        <w:t>Sentence</w:t>
+      </w:r>
+      <w:r>
+        <w:rPr>
+          <w:lang w:val="ru-RU"/>
+        </w:rPr>
+        <w:t>-</w:t>
+      </w:r>
+      <w:r>
+        <w:rPr>
+          <w:lang w:val="en-US"/>
+        </w:rPr>
+        <w:t>BERT</w:t>
+      </w:r>
+      <w:r>
+        <w:rPr>
+          <w:lang w:val="ru-RU"/>
+        </w:rPr>
+        <w:t>, а также ограничения, связанные со справедливостью алгоритмического ранжирования.</w:t>
       </w:r>
     </w:p>
     <w:p ns2:paraId="4400168B" ns2:textId="5E5B28EB">
@@ -1569,7 +1935,82 @@
         </w:rPr>
       </w:pPr>
       <w:r>
-        <w:t>Во второй главе проектируется обработка данных и интеграция с системой автоматизированного управления подбором персонала. Описываются сбор, очистка и разметка данных вакансий и резюме, архитектура пайплайна предварительной обработки, модуль семантического анализа, API-интерфейс и связь сервиса независимого энкодера (bi-encoder) с ядром Reqcore.</w:t>
+        <w:rPr>
+          <w:lang w:val="ru-RU"/>
+        </w:rPr>
+        <w:t xml:space="preserve">Во второй главе проектируется контур обработки данных и интеграции с </w:t>
+      </w:r>
+      <w:r>
+        <w:rPr>
+          <w:lang w:val="en-US"/>
+        </w:rPr>
+        <w:t>ATS</w:t>
+      </w:r>
+      <w:r>
+        <w:rPr>
+          <w:lang w:val="ru-RU"/>
+        </w:rPr>
+        <w:t xml:space="preserve">. Описываются сбор, очистка и разметка данных вакансий и резюме, архитектура пайплайна предварительной обработки, модуль семантического анализа, </w:t>
+      </w:r>
+      <w:r>
+        <w:rPr>
+          <w:lang w:val="en-US"/>
+        </w:rPr>
+        <w:t>API</w:t>
+      </w:r>
+      <w:r>
+        <w:rPr>
+          <w:lang w:val="ru-RU"/>
+        </w:rPr>
+        <w:t xml:space="preserve">-интерфейс и связь </w:t>
+      </w:r>
+      <w:r>
+        <w:rPr>
+          <w:lang w:val="en-US"/>
+        </w:rPr>
+        <w:t>bi</w:t>
+      </w:r>
+      <w:r>
+        <w:rPr>
+          <w:lang w:val="ru-RU"/>
+        </w:rPr>
+        <w:t>-</w:t>
+      </w:r>
+      <w:r>
+        <w:rPr>
+          <w:lang w:val="en-US"/>
+        </w:rPr>
+        <w:t>encoder</w:t>
+      </w:r>
+      <w:r>
+        <w:rPr>
+          <w:lang w:val="ru-RU"/>
+        </w:rPr>
+        <w:t xml:space="preserve"> сервиса с ядром </w:t>
+      </w:r>
+      <w:r>
+        <w:rPr>
+          <w:lang w:val="en-US"/>
+        </w:rPr>
+        <w:t>ATS</w:t>
+      </w:r>
+      <w:r>
+        <w:rPr>
+          <w:lang w:val="ru-RU"/>
+        </w:rPr>
+        <w:t xml:space="preserve"> </w:t>
+      </w:r>
+      <w:r>
+        <w:rPr>
+          <w:lang w:val="en-US"/>
+        </w:rPr>
+        <w:t>Reqcore</w:t>
+      </w:r>
+      <w:r>
+        <w:rPr>
+          <w:lang w:val="ru-RU"/>
+        </w:rPr>
+        <w:t>.</w:t>
       </w:r>
     </w:p>
     <w:p ns2:paraId="524B8A01" ns2:textId="6A3D9E3A">
@@ -1579,7 +2020,70 @@
         </w:rPr>
       </w:pPr>
       <w:r>
-        <w:t>В третьей главе описывается практическая реализация модуля сопоставления вакансий и резюме для ранжирования кандидатов. Приводятся сведения о подготовке обучающих пар, доменной настройке модели `cointegrated/rubert-tiny2`, структуре сохраненного артефакта, гиперпараметрах обучения, реализации класса `ATSRanker` и сервиса на FastAPI для ранжирования кандидатов.</w:t>
+        <w:rPr>
+          <w:lang w:val="ru-RU"/>
+        </w:rPr>
+        <w:t xml:space="preserve">В третьей главе описывается практическая реализация модуля семантического ранжирования. Приводятся сведения о подготовке обучающих пар, дообучении модели </w:t>
+      </w:r>
+      <w:r>
+        <w:rPr>
+          <w:lang w:val="en-US"/>
+        </w:rPr>
+        <w:t>cointegrated</w:t>
+      </w:r>
+      <w:r>
+        <w:rPr>
+          <w:lang w:val="ru-RU"/>
+        </w:rPr>
+        <w:t>/</w:t>
+      </w:r>
+      <w:r>
+        <w:rPr>
+          <w:lang w:val="en-US"/>
+        </w:rPr>
+        <w:t>rubert</w:t>
+      </w:r>
+      <w:r>
+        <w:rPr>
+          <w:lang w:val="ru-RU"/>
+        </w:rPr>
+        <w:t>-</w:t>
+      </w:r>
+      <w:r>
+        <w:rPr>
+          <w:lang w:val="en-US"/>
+        </w:rPr>
+        <w:t>tiny</w:t>
+      </w:r>
+      <w:r>
+        <w:rPr>
+          <w:lang w:val="ru-RU"/>
+        </w:rPr>
+        <w:t xml:space="preserve">2, структуре сохраненного артефакта, гиперпараметрах обучения, реализации класса </w:t>
+      </w:r>
+      <w:r>
+        <w:rPr>
+          <w:lang w:val="en-US"/>
+        </w:rPr>
+        <w:t>ATSRanker</w:t>
+      </w:r>
+      <w:r>
+        <w:rPr>
+          <w:lang w:val="ru-RU"/>
+        </w:rPr>
+        <w:t xml:space="preserve"> и </w:t>
+      </w:r>
+      <w:r>
+        <w:rPr>
+          <w:lang w:val="en-US"/>
+        </w:rPr>
+        <w:t>FastAPI</w:t>
+      </w:r>
+      <w:r>
+        <w:rPr>
+          <w:lang w:val="ru-RU"/>
+        </w:rPr>
+        <w:t>-сервиса для ранжирования кандидатов.</w:t>
       </w:r>
     </w:p>
     <w:p ns2:paraId="340201F2" ns2:textId="58EC159F">
@@ -1589,7 +2093,70 @@
         </w:rPr>
       </w:pPr>
       <w:r>
-        <w:t>В четвертой главе проводится экспериментальная оценка качества разработанного модуля. Рассматриваются метрики бинарного сопоставления и ranking-метрики, результаты сравнения базовой и настроенной модели, проверка API-интеграции с Reqcore, а также расчет практической эффективности применения независимого энкодера (bi-encoder) для предварительного отбора кандидатов.</w:t>
+        <w:rPr>
+          <w:lang w:val="ru-RU"/>
+        </w:rPr>
+        <w:t xml:space="preserve">В четвертой главе проводится экспериментальная оценка качества разработанного модуля. Рассматриваются метрики бинарного сопоставления и </w:t>
+      </w:r>
+      <w:r>
+        <w:rPr>
+          <w:lang w:val="en-US"/>
+        </w:rPr>
+        <w:t>ranking</w:t>
+      </w:r>
+      <w:r>
+        <w:rPr>
+          <w:lang w:val="ru-RU"/>
+        </w:rPr>
+        <w:t xml:space="preserve">-метрики, результаты сравнения базовой и дообученной модели, проверка </w:t>
+      </w:r>
+      <w:r>
+        <w:rPr>
+          <w:lang w:val="en-US"/>
+        </w:rPr>
+        <w:t>API</w:t>
+      </w:r>
+      <w:r>
+        <w:rPr>
+          <w:lang w:val="ru-RU"/>
+        </w:rPr>
+        <w:t xml:space="preserve">-интеграции с </w:t>
+      </w:r>
+      <w:r>
+        <w:rPr>
+          <w:lang w:val="en-US"/>
+        </w:rPr>
+        <w:t>Reqcore</w:t>
+      </w:r>
+      <w:r>
+        <w:rPr>
+          <w:lang w:val="ru-RU"/>
+        </w:rPr>
+        <w:t xml:space="preserve">, а также расчет практической эффективности применения </w:t>
+      </w:r>
+      <w:r>
+        <w:rPr>
+          <w:lang w:val="en-US"/>
+        </w:rPr>
+        <w:t>bi</w:t>
+      </w:r>
+      <w:r>
+        <w:rPr>
+          <w:lang w:val="ru-RU"/>
+        </w:rPr>
+        <w:t>-</w:t>
+      </w:r>
+      <w:r>
+        <w:rPr>
+          <w:lang w:val="en-US"/>
+        </w:rPr>
+        <w:t>encoder</w:t>
+      </w:r>
+      <w:r>
+        <w:rPr>
+          <w:lang w:val="ru-RU"/>
+        </w:rPr>
+        <w:t xml:space="preserve"> подхода для предварительного отбора кандидатов.</w:t>
       </w:r>
     </w:p>
     <w:p ns2:paraId="0DD8BAFF" ns2:textId="4C116553">
@@ -1640,7 +2207,7 @@
         </w:rPr>
       </w:pPr>
       <w:r>
-        <w:t>Современный рекрутмент характеризуется высокой нагрузкой на этапе первичного отбора кандидатов. В корпоративной практике на одну вакансию может поступать значительное число откликов, поэтому ручной анализ всех резюме становится трудозатратным и плохо масштабируемым процессом. В этих условиях особую роль приобретают системы автоматизированного управления подбором персонала (Applicant Tracking System), которые позволяют хранить данные о вакансиях и кандидатах, управлять стадиями воронки найма, фиксировать результаты рассмотрения откликов и поддерживать принятие решений рекрутером [2].</w:t>
+        <w:t>Современный рекрутмент характеризуется высокой нагрузкой на этапе первичного отбора кандидатов. В корпоративной практике на одну вакансию может поступать значительное число откликов, поэтому ручной анализ всех резюме становится трудозатратным и плохо масштабируемым процессом. В этих условиях особую роль приобретают системы управления кандидатами — Applicant Tracking Systems, ATS, которые позволяют хранить данные о вакансиях и кандидатах, управлять стадиями воронки найма, фиксировать результаты рассмотрения откликов и поддерживать принятие решений рекрутером [2].</w:t>
       </w:r>
     </w:p>
     <w:p ns2:paraId="11BA2E5C" ns2:textId="76D8A3E0">
@@ -1651,7 +2218,7 @@
         </w:rPr>
       </w:pPr>
       <w:r>
-        <w:t>Одной из ключевых задач системы автоматизированного управления подбором персонала является ранжирование кандидатов относительно конкретной вакансии. В такой постановке описание вакансии или набор требований к позиции можно рассматривать как запрос, а резюме кандидатов — как документы, которые необходимо упорядочить по степени релевантности [2, 3]. При этом задача отличается от классического информационного поиска: результат ранжирования влияет не только на удобство работы пользователя, но и на видимость кандидатов в процессе найма. Кандидаты, оказавшиеся в верхней части списка, получают больше внимания со стороны рекрутера, тогда как релевантные профили на нижних позициях могут быть фактически не рассмотрены. Поэтому для систем автоматизированного отбора важны не только точность ранжирования и производительность, но и воспроизводимость оценки, интерпретируемость результата и контроль ограничений применяемого алгоритма [2, 16].</w:t>
+        <w:t>Одной из ключевых задач ATS является ранжирование кандидатов относительно конкретной вакансии. В такой постановке описание вакансии или набор требований к позиции можно рассматривать как запрос, а резюме кандидатов — как документы, которые необходимо упорядочить по степени релевантности [2, 3]. При этом задача отличается от классического информационного поиска: результат ранжирования влияет не только на удобство работы пользователя, но и на видимость кандидатов в процессе найма. Кандидаты, оказавшиеся в верхней части списка, получают больше внимания со стороны рекрутера, тогда как релевантные профили на нижних позициях могут быть фактически не рассмотрены. Поэтому для систем автоматизированного отбора важны не только точность ранжирования и производительность, но и воспроизводимость оценки, интерпретируемость результата и контроль ограничений применяемого алгоритма [2, 16].</w:t>
       </w:r>
     </w:p>
     <w:p ns2:paraId="1254DF00" ns2:textId="3CC1EE1D">
@@ -1662,7 +2229,11 @@
         </w:rPr>
       </w:pPr>
       <w:r>
-        <w:t>Актуальность работы обусловлена необходимостью разработки программных модулей, способных выполнять семантическое сопоставление вакансий и резюме на основе современных методов обработки естественного языка. Традиционные подходы, основанные на ключевых словах и простом совпадении терминов, не всегда позволяют корректно учитывать смысловую близость текстов, различия в формулировках требований и описаний опыта, а также неполноту данных в резюме. Использование нейросетевых моделей представления текста, в частности BERT и Sentence-BERT, позволяет перейти от лексического сравнения к сравнению плотных векторных представлений, что делает возможным более гибкое ранжирование кандидатов [5, 6]. Вместе с тем применение таких моделей в контуре системы автоматизированного управления подбором персонала требует не только выбора архитектуры, но и подготовки данных, построения воспроизводимого пайплайна обучения, реализации API-интеграции и экспериментальной проверки качества.</w:t>
+        <w:t xml:space="preserve">Актуальность работы обусловлена необходимостью разработки программных модулей, способных выполнять семантическое сопоставление вакансий и резюме на основе современных методов обработки естественного языка. Традиционные подходы, основанные на ключевых словах и простом совпадении терминов, не всегда позволяют корректно учитывать смысловую близость текстов, различия в формулировках требований и описаний опыта, а также неполноту данных в резюме. Использование нейросетевых моделей представления текста, в частности BERT и Sentence-BERT, позволяет перейти от лексического сравнения к сравнению плотных векторных представлений, что делает возможным более гибкое ранжирование кандидатов [5, 6]. Вместе с тем применение таких моделей в контуре ATS требует не только выбора архитектуры, но и подготовки данных, </w:t>
+      </w:r>
+      <w:r>
+        <w:lastRenderedPageBreak/>
+        <w:t>построения воспроизводимого пайплайна обучения, реализации API-интеграции и экспериментальной проверки качества.</w:t>
       </w:r>
     </w:p>
     <w:p ns2:paraId="3E3867A4" ns2:textId="5359F2BC">
@@ -1673,7 +2244,7 @@
         </w:rPr>
       </w:pPr>
       <w:r>
-        <w:t>Целью работы является разработка и экспериментальная проверка прототипа модуля семантического сопоставления пары «вакансия–резюме» для интеграции в систему автоматизированного управления подбором персонала.</w:t>
+        <w:t>Целью работы является разработка и экспериментальная проверка прототипа модуля семантического сопоставления пары «вакансия–резюме» для интеграции в ATS-систему.</w:t>
       </w:r>
     </w:p>
     <w:p ns2:paraId="5D233372" ns2:textId="53FAB0B5">
@@ -1697,7 +2268,7 @@
         </w:numPr>
       </w:pPr>
       <w:r>
-        <w:t>Выполнить анализ предметной области рекрутмента, процессов найма, систем автоматизированного управления подбором персонала и существующих подходов к ранжированию кандидатов.</w:t>
+        <w:t>Выполнить анализ предметной области рекрутмента, процессов найма, ATS-систем и существующих подходов к ранжированию кандидатов.</w:t>
       </w:r>
     </w:p>
     <w:p ns2:paraId="14FBDC46" ns2:textId="77777777">
@@ -1736,7 +2307,7 @@
         </w:numPr>
       </w:pPr>
       <w:r>
-        <w:t>Спроектировать этап подготовки данных, включающий очистку, деидентификацию, формирование текстовых представлений и разметку пар «вакансия–резюме» на основе исторических HR-событий.</w:t>
+        <w:t>Спроектировать контур подготовки данных, включающий очистку, деидентификацию, формирование текстовых представлений и разметку пар «вакансия–резюме» на основе исторических HR-событий.</w:t>
       </w:r>
     </w:p>
     <w:p ns2:paraId="7CD0D99C" ns2:textId="77777777">
@@ -1778,7 +2349,7 @@
         </w:rPr>
       </w:pPr>
       <w:r>
-        <w:t>Проверить возможность интеграции разработанного модуля с тестовым контуром Reqcore и оценить практическую эффективность использования подхода независимого энкодера (bi-encoder) для предварительного отбора кандидатов.</w:t>
+        <w:t>Проверить возможность интеграции разработанного модуля с тестовым контуром ATS Reqcore и оценить практическую эффективность использования подхода независимого энкодера (bi-encoder) для предварительного отбора кандидатов.</w:t>
       </w:r>
     </w:p>
     <w:p ns2:paraId="5D6DAB4C" ns2:textId="30E0C0D0">
@@ -1789,7 +2360,7 @@
         </w:rPr>
       </w:pPr>
       <w:r>
-        <w:t>Объектом исследования являются процессы автоматизированного сопоставления вакансий и резюме в системах управления подбором персонала.</w:t>
+        <w:t>Объектом исследования являются процессы автоматизированного сопоставления вакансий и резюме в ATS-системах.</w:t>
       </w:r>
     </w:p>
     <w:p ns2:paraId="7320BBC6" ns2:textId="1F203011">
@@ -1800,7 +2371,7 @@
         </w:rPr>
       </w:pPr>
       <w:r>
-        <w:t>Предметом исследования являются методы семантического кодирования текстов вакансий и резюме, алгоритмы вычисления меры релевантности и программная архитектура интеграции модуля ранжирования в систему автоматизированного управления подбором персонала.</w:t>
+        <w:t>Предметом исследования являются методы семантического кодирования текстов вакансий и резюме, алгоритмы вычисления меры релевантности и программная архитектура интеграции модуля ранжирования в ATS.</w:t>
       </w:r>
     </w:p>
     <w:p ns2:paraId="62693E45" ns2:textId="4869D514">
@@ -1826,7 +2397,7 @@
         </w:rPr>
       </w:pPr>
       <w:r>
-        <w:t>Теоретическая значимость работы состоит в систематизации подходов к семантическому ранжированию кандидатов, рассмотрении применимости методов Learning to Rank, BERT и Sentence-BERT к задаче рекрутмента, а также в определении ограничений архитектуры независимого энкодера (bi-encoder) при использовании в сценариях автоматизированного подбора персонала. В работе отдельно фиксируются границы применимости разработанного решения: текущий прототип предназначен для числового семантического скоринга и предварительного отбора кандидатов, но не заменяет полноценную экспертную или LLM-интерпретацию причин соответствия кандидата вакансии.</w:t>
+        <w:t>Теоретическая значимость работы состоит в систематизации подходов к семантическому ранжированию кандидатов, рассмотрении применимости методов Learning to Rank, BERT и Sentence-BERT к задаче рекрутмента, а также в определении ограничений архитектуры независимого энкодера (bi-encoder) при использовании в ATS-сценариях. В работе отдельно фиксируются границы применимости разработанного решения: текущий прототип предназначен для числового семантического скоринга и предварительного отбора кандидатов, но не заменяет полноценную экспертную или LLM-интерпретацию причин соответствия кандидата вакансии.</w:t>
       </w:r>
     </w:p>
     <w:p ns2:paraId="2F2DCE77" ns2:textId="0891AB48">
@@ -1837,7 +2408,7 @@
         </w:rPr>
       </w:pPr>
       <w:r>
-        <w:t>Практическая значимость работы заключается в разработке прототипа ML-модуля, который может использоваться в системе автоматизированного управления подбором персонала для предварительного ранжирования кандидатов. В рамках работы реализованы подготовка данных, доменная настройка модели `cointegrated/rubert-tiny2`, модуль ранжирования, сервис HTTP API на Python-фреймворке FastAPI и интеграция с тестовым контуром Reqcore. Такой модуль может применяться как первый этап отбора: он позволяет быстро получить числовую оценку соответствия кандидата вакансии и сократить число профилей, передаваемых на более дорогую экспертную или LLM-оценку.</w:t>
+        <w:t>Практическая значимость работы заключается в разработке прототипа ML-модуля, который может использоваться в ATS для предварительного ранжирования кандидатов. В рамках работы реализованы подготовка данных, дообучение модели cointegrated/rubert-tiny2, модуль ранжирования, FastAPI-сервис и интеграция с тестовым контуром ATS Reqcore. Такой модуль может применяться как первый этап отбора: он позволяет быстро получить числовую оценку соответствия кандидата вакансии и сократить число профилей, передаваемых на более дорогую экспертную или LLM-оценку.</w:t>
       </w:r>
     </w:p>
     <w:p ns2:paraId="0EDA70A2" ns2:textId="79E95C95">
@@ -1856,7 +2427,10 @@
         <w:keepNext/>
       </w:pPr>
       <w:r>
-        <w:t>Работа состоит из введения, четырех разделов, заключения и списка использованных источников. В первом разделе рассматриваются предметная область рекрутмента, системы автоматизированного управления подбором персонала, методы NLP и архитектуры семантического ранжирования. Во втором разделе описываются проектирование данных, архитектура обработки и интеграция с Reqcore. В третьем разделе приводится описание реализации модуля сопоставления вакансий и резюме для ранжирования кандидатов, подготовки обучающих данных, доменной настройки модели и API-сервиса. В четвертом разделе выполняется экспериментальная оценка качества модели, рассматривается интеграция с Reqcore и анализируется практическая эффективность применения подхода независимого энкодера (bi-encoder). В заключении формулируются основные результаты работы, ограничения текущей реализации и направления дальнейшего развития.</w:t>
+        <w:t>Работа состоит из введения, четырех разделов, заключения и списка использованных источников. В первом разделе рассматриваются предметная область рекрутмента, ATS-системы, методы NLP и архитектуры семантического ранжирования. Во втором разделе описываются проектирование данных, архитектура обработки и интеграция с ATS. В третьем разделе приводится описание реализации модуля семантического ранжирования, подготовки обучающих данных, дообучения модели и API-сервиса. В четвертом разделе выполняется экспериментальная оценка качества модели, рассматривается интеграция с Reqcore и анализируется практическая эффективность применения подхода независимого энкодера (bi-encoder). В заключении формулируются основные результаты работы, ограничения текущей реализации и направления дальнейшего развития.</w:t>
+      </w:r>
+      <w:r>
+        <w:br w:type="page"/>
       </w:r>
     </w:p>
     <w:p ns2:paraId="5AA0D662" ns2:textId="77777777">
@@ -1878,13 +2452,15 @@
       <w:pPr>
         <w:pStyle w:val="2"/>
       </w:pPr>
-      <w:r>
-        <w:t>1.1 Системный анализ предметной области рекрутмента, процессов найма и систем автоматизированного управления подбором персонала</w:t>
-      </w:r>
+      <w:bookmarkStart w:id="4" w:name="_Toc230211047"/>
+      <w:r>
+        <w:t>1.1 Системный анализ предметной области рекрутмента, процессов найма и ATS-систем</w:t>
+      </w:r>
+      <w:bookmarkEnd w:id="4"/>
     </w:p>
     <w:p ns2:paraId="1C4739E1" ns2:textId="77777777">
       <w:r>
-        <w:t>Являясь программным ядром современного рекрутинга, системы автоматизированного управления подбором персонала поддерживают как минимум два критически важных и взаимосвязанных процесса: управление воронкой найма (от формирования лонг-листа к шорт-листу) и поддержку принятия решений посредством ранжирования и фильтрации больших пулов кандидатов [2].</w:t>
+        <w:t>Являясь программным ядром современного рекрутинга, системы класса ATS поддерживают как минимум два критически важных и взаимосвязанных процесса: управление воронкой найма (от формирования лонг-листа к шорт-листу) и поддержку принятия решений посредством ранжирования и фильтрации больших пулов кандидатов [2].</w:t>
       </w:r>
     </w:p>
     <w:p ns2:paraId="73842681" ns2:textId="77777777">
@@ -1907,535 +2483,765 @@
     </w:p>
     <w:p ns2:paraId="2FC624CA" ns2:textId="77777777">
       <w:r>
-        <w:t>Практический эффект алгоритмов ранжирования на популяцию кандидатов объясняется преимущественно моделью просмотра списков: позиции, находящиеся в топе выдачи, получают непропорционально большую долю внимания (экспозицию). В контексте управления персоналом данный эффект способен многократно усиливать различия между группами соискателей даже при незначительных отличиях в исходных оценках релевантности [2]. Таким образом, справедливость подобных систем зависит не только от лежащего в их основе алгоритма, но и от интерфейса самой системы подбора, а также от стратегии просмотра списков пользователем [2].</w:t>
-      </w:r>
-    </w:p>
-    <w:p ns2:paraId="5F7E3205" ns2:textId="77777777">
-      <w:r>
-        <w:t>Исторически инструменты, ориентированные на интеграцию с системами автоматизированного подбора персонала и автоматизацию процессов отбора, чаще всего использовали методы извлечения структурированных атрибутов (навыков, стажа, образования), механизмы фасетного поиска и техники ранжирования из арсенала классического информационного поиска. Характерным примером подобного подхода может служить система PROSPECT, позиционируемая как система поддержки принятия решений. Данный комплекс извлекает ключевые аспекты профиля кандидата, представляет их в виде фасетов и применяет алгоритмы информационного поиска для ранжирования соискателей относительно требований вакансии. В экспериментальной части исследования авторы отмечают, что использование выявленной структурированной информации повысило качество ранжирования на 30% [3].</w:t>
-      </w:r>
-    </w:p>
-    <w:p ns2:paraId="0751E574" ns2:textId="77777777">
-      <w:r>
-        <w:t>Современная эволюция систем рекрутмента характеризуется переходом к семантическому сопоставлению кандидатов на базе плотных векторных представлений (эмбеддингов) и к обучению ранжирующих моделей на основе поведенческой обратной связи (кликов, конверсий на следующие этапы, фактов найма). Современные индустриальные решения используют конвейеры многозадачного обучения, а также алгоритмы на базе больших языковых моделей (LLM) для более глубокого анализа требований вакансии. В частности, передовые архитектуры включают трехступенчатый процесс поиска талантов (</w:t>
-      </w:r>
-      <w:commentRangeStart w:id="11"/>
-      <w:r>
-        <w:t>отбор кандидатов, предварительное ранжирование, окончательное переранжирование</w:t>
-      </w:r>
-      <w:commentRangeEnd w:id="11"/>
+        <w:t xml:space="preserve">Практический эффект алгоритмов ранжирования на </w:t>
+      </w:r>
+      <w:commentRangeStart w:id="6"/>
+      <w:r>
+        <w:t>популяцию кандидатов</w:t>
+      </w:r>
+      <w:commentRangeEnd w:id="6"/>
       <w:r>
         <w:rPr>
           <w:rStyle w:val="ac"/>
           <w:sz w:val="24"/>
           <w:szCs w:val="24"/>
         </w:rPr>
-        <w:commentReference w:id="11"/>
-      </w:r>
-      <w:r>
-        <w:t xml:space="preserve">), применяют LLM для извлечения тонких предпочтений рекрутера из текстовых описаний позиций и истории закрытия вакансий, а также </w:t>
-      </w:r>
-      <w:commentRangeStart w:id="12"/>
-      <w:r>
-        <w:t>задействуют модели класса mixture-of-experts</w:t>
-      </w:r>
-      <w:commentRangeEnd w:id="12"/>
+        <w:commentReference w:id="6"/>
+      </w:r>
+      <w:r>
+        <w:t xml:space="preserve"> объясняется преимущественно моделью просмотра списков: позиции, находящиеся в топе выдачи, получают </w:t>
+      </w:r>
+      <w:commentRangeStart w:id="7"/>
+      <w:r>
+        <w:t>непропорционально большую долю внимания (экспозицию).</w:t>
+      </w:r>
+      <w:commentRangeEnd w:id="7"/>
       <w:r>
         <w:rPr>
           <w:rStyle w:val="ac"/>
           <w:sz w:val="24"/>
           <w:szCs w:val="24"/>
         </w:rPr>
-        <w:commentReference w:id="12"/>
-      </w:r>
-      <w:r>
-        <w:t xml:space="preserve"> с учетом специфики конкретной роли [17].</w:t>
-      </w:r>
-    </w:p>
-    <w:p ns2:paraId="6BDC3B60" ns2:textId="77777777">
-      <w:r>
-        <w:t>В контексте настоящего исследования целевая система автоматизированного управления подбором персонала рассматривается как программная среда, для работы внутри которой разрабатываемый модуль должен выполнять следующие функции: 1) принимать на вход текстовое описание вакансии и пул кандидатов; 2) вычислять меру семантической близости и осуществлять эффективное ранжирование; 3) обеспечивать объяснимость результатов выдачи (минимально — через сопоставление извлеченных навыков и атрибутов); 4) предоставлять верифицируемую оценку качества работы [2, 23].</w:t>
-      </w:r>
-    </w:p>
-    <w:p ns2:paraId="7ADEC077" ns2:textId="77777777">
-      <w:pPr>
-        <w:pStyle w:val="2"/>
-        <w:rPr>
-          <w:highlight w:val="yellow"/>
-        </w:rPr>
-      </w:pPr>
-      <w:bookmarkStart w:id="13" w:name="_Toc230211048"/>
-      <w:r>
-        <w:t>1.2 Аналитический обзор методов обработки естественного языка (NLP) и алгоритмов машинного обучения (Learning to Rank)</w:t>
-      </w:r>
-      <w:bookmarkEnd w:id="13"/>
-    </w:p>
-    <w:p ns2:paraId="4E8A9954" ns2:textId="77777777">
-      <w:r>
-        <w:t>Для решения задач сопоставления текстов вакансий и резюме традиционно применяются различные семейства методов представления и сравнения текстовой информации: лексические модели (такие как TF-IDF), вероятностные ранжирующие функции (в частности BM25), а в последнее время — нейросетевые семантические вложения на базе трансформеров. В классической вероятностной парадигме функция BM25 зарекомендовала себя как надежная базовая метрика информационного поиска. Связь показателя релевантности с вероятностными предпосылками, параметрами насыщения частоты термина (tf) и нормализацией по длине документа критически важна для текстов вакансий и резюме, поскольку они зачастую существенно различаются по объему и стилистике [11]. В современных системах поиска информации и рекомендаций (в том числе построенных на методологии Learning to Rank) метрика BM25 по-прежнему служит мощным и устойчивым ориентиром; при интеграции нейросетевых алгоритмов ранжирования в контур системы автоматизированного подбора персонала требуется наличие воспроизводимой классической базовой линии для проведения сравнительного анализа [8, 11].</w:t>
-      </w:r>
-    </w:p>
-    <w:p ns2:paraId="36290E59" ns2:textId="77777777">
-      <w:r>
-        <w:t xml:space="preserve">Методология обучения ранжированию (Learning to Rank, LTR) формализует процесс построения оптимальной ранжирующей функции по заранее размеченным данным (уровням релевантности или </w:t>
-      </w:r>
-      <w:commentRangeStart w:id="15"/>
-      <w:r>
-        <w:t>картам предпочтений</w:t>
-      </w:r>
-      <w:commentRangeEnd w:id="15"/>
+        <w:commentReference w:id="7"/>
+      </w:r>
+      <w:r>
+        <w:t xml:space="preserve"> В контексте управления персоналом данный эффект способен многократно усиливать различия между группами соискателей даже при незначительных отличиях в исходных оценках релевантности [2]. Таким образом, </w:t>
+      </w:r>
+      <w:commentRangeStart w:id="8"/>
+      <w:r>
+        <w:t xml:space="preserve">справедливость </w:t>
+      </w:r>
+      <w:commentRangeEnd w:id="8"/>
       <w:r>
         <w:rPr>
           <w:rStyle w:val="ac"/>
           <w:sz w:val="24"/>
           <w:szCs w:val="24"/>
         </w:rPr>
-        <w:commentReference w:id="15"/>
-      </w:r>
-      <w:r>
-        <w:t xml:space="preserve">). </w:t>
-      </w:r>
-      <w:commentRangeStart w:id="16"/>
-      <w:r>
-        <w:t>Общепринято классифицировать алгоритмы LTR на три основные группы: поточечный подход (pointwise, сводящийся к регрессии или классификации по отдельным объектам), попарный подход (pairwise, обучающийся предсказывать предпочтения между двумя документами) и списочный подход (listwise, оптимизирующий функцию потерь непосредственно на всем списке документов на основе ранжирующих метрик) [8]</w:t>
-      </w:r>
-      <w:commentRangeEnd w:id="16"/>
+        <w:commentReference w:id="8"/>
+      </w:r>
+      <w:r>
+        <w:t>подобных систем зависит не только от лежащего в их основе алгоритма, но и от интерфейса самой ATS, а также от стратегии просмотра списков пользователем [2].</w:t>
+      </w:r>
+    </w:p>
+    <w:p ns2:paraId="5F7E3205" ns2:textId="77777777">
+      <w:r>
+        <w:t xml:space="preserve">Исторически инструменты, ориентированные на интеграцию с ATS и автоматизацию процессов отбора, чаще всего использовали методы извлечения структурированных атрибутов (навыков, стажа, образования), механизмы </w:t>
+      </w:r>
+      <w:commentRangeStart w:id="9"/>
+      <w:r>
+        <w:t>фасетного поиска</w:t>
+      </w:r>
+      <w:commentRangeEnd w:id="9"/>
       <w:r>
         <w:rPr>
           <w:rStyle w:val="ac"/>
           <w:sz w:val="24"/>
           <w:szCs w:val="24"/>
         </w:rPr>
-        <w:commentReference w:id="16"/>
-      </w:r>
-      <w:r>
-        <w:t xml:space="preserve">. Классическим примером попарного подхода выступает </w:t>
-      </w:r>
-      <w:commentRangeStart w:id="17"/>
-      <w:r>
-        <w:t>архитектура RankNet</w:t>
-      </w:r>
-      <w:commentRangeEnd w:id="17"/>
+        <w:commentReference w:id="9"/>
+      </w:r>
+      <w:r>
+        <w:t xml:space="preserve"> и техники ранжирования из арсенала классического информационного поиска. Характерным примером подобного подхода может служить </w:t>
+      </w:r>
+      <w:commentRangeStart w:id="10"/>
+      <w:r>
+        <w:t>система PROSPECT</w:t>
+      </w:r>
+      <w:commentRangeEnd w:id="10"/>
       <w:r>
         <w:rPr>
           <w:rStyle w:val="ac"/>
           <w:sz w:val="24"/>
           <w:szCs w:val="24"/>
         </w:rPr>
-        <w:commentReference w:id="17"/>
-      </w:r>
-      <w:r>
-        <w:t xml:space="preserve">, </w:t>
-      </w:r>
-      <w:commentRangeStart w:id="18"/>
-      <w:r>
-        <w:t xml:space="preserve">в рамках которой задается вероятностная модель предпочтения между парой объектов исходя из разности их индивидуальных оценок, после чего минимизируется кросс-энтропийная ошибка функции потерь </w:t>
-      </w:r>
-      <w:commentRangeStart w:id="19"/>
-      <w:r>
-        <w:t>логистического связывания</w:t>
-      </w:r>
-      <w:commentRangeEnd w:id="18"/>
+        <w:commentReference w:id="10"/>
+      </w:r>
+      <w:r>
+        <w:t xml:space="preserve">, позиционируемая как система поддержки принятия решений. Данный комплекс извлекает ключевые аспекты профиля кандидата, представляет их в виде фасетов и применяет алгоритмы информационного поиска для ранжирования соискателей относительно </w:t>
+      </w:r>
+      <w:r>
+        <w:lastRenderedPageBreak/>
+        <w:t>требований вакансии. В экспериментальной части исследования авторы отмечают, что использование выявленной структурированной информации повысило качество ранжирования на 30% [3].</w:t>
+      </w:r>
+    </w:p>
+    <w:p ns2:paraId="0751E574" ns2:textId="77777777">
+      <w:r>
+        <w:t>Современная эволюция систем рекрутмента характеризуется переходом к семантическому сопоставлению кандидатов на базе плотных векторных представлений (эмбеддингов) и к обучению ранжирующих моделей на основе поведенческой обратной связи (кликов, конверсий на следующие этапы, фактов найма). Современные индустриальные решения используют конвейеры многозадачного обучения, а также алгоритмы на базе больших языковых моделей (LLM) для более глубокого анализа требований вакансии. В частности, передовые архитектуры включают трехступенчатый процесс поиска талантов (</w:t>
+      </w:r>
+      <w:commentRangeStart w:id="11"/>
+      <w:r>
+        <w:t>отбор кандидатов, предварительное ранжирование, окончательное переранжирование</w:t>
+      </w:r>
+      <w:commentRangeEnd w:id="11"/>
       <w:r>
         <w:rPr>
           <w:rStyle w:val="ac"/>
           <w:sz w:val="24"/>
           <w:szCs w:val="24"/>
         </w:rPr>
-        <w:commentReference w:id="18"/>
-      </w:r>
-      <w:commentRangeEnd w:id="19"/>
+        <w:commentReference w:id="11"/>
+      </w:r>
+      <w:r>
+        <w:t xml:space="preserve">), применяют LLM для извлечения тонких предпочтений рекрутера из текстовых описаний позиций и истории закрытия вакансий, а также </w:t>
+      </w:r>
+      <w:commentRangeStart w:id="12"/>
+      <w:r>
+        <w:t>задействуют модели класса mixture-of-experts</w:t>
+      </w:r>
+      <w:commentRangeEnd w:id="12"/>
       <w:r>
         <w:rPr>
           <w:rStyle w:val="ac"/>
           <w:sz w:val="24"/>
           <w:szCs w:val="24"/>
         </w:rPr>
-        <w:commentReference w:id="19"/>
-      </w:r>
-      <w:r>
-        <w:t>. Главное практическое преимущество подобных методов заключается в их дифференцируемости и встроенной совместимости с нейросетевыми архитектурами [9].</w:t>
-      </w:r>
-    </w:p>
-    <w:p ns2:paraId="60183636" ns2:textId="77777777">
-      <w:r>
-        <w:t xml:space="preserve">Ключевым аспектом LTR является оценка качества получаемого ранжирования. Такие метрики, как </w:t>
-      </w:r>
-      <w:commentRangeStart w:id="20"/>
-      <w:r>
-        <w:t>дисконтированная кумулятивная выгода (DCG)</w:t>
-      </w:r>
-      <w:commentRangeEnd w:id="20"/>
+        <w:commentReference w:id="12"/>
+      </w:r>
+      <w:r>
+        <w:t xml:space="preserve"> с учетом специфики конкретной роли [17].</w:t>
+      </w:r>
+    </w:p>
+    <w:p ns2:paraId="6BDC3B60" ns2:textId="77777777">
+      <w:r>
+        <w:t>В контексте настоящего исследования целевая ATS рассматривается как программная среда, для работы внутри которой разрабатываемый модуль должен выполнять следующие функции: 1) принимать на вход текстовое описание вакансии и пул кандидатов; 2) вычислять меру семантической близости и осуществлять эффективное ранжирование; 3) обеспечивать объяснимость результатов выдачи (минимально — через сопоставление извлеченных навыков и атрибутов); 4) предоставлять верифицируемую оценку качества работы [2, 23].</w:t>
+      </w:r>
+    </w:p>
+    <w:p ns2:paraId="7ADEC077" ns2:textId="77777777">
+      <w:pPr>
+        <w:pStyle w:val="2"/>
+        <w:rPr>
+          <w:highlight w:val="yellow"/>
+        </w:rPr>
+      </w:pPr>
+      <w:bookmarkStart w:id="13" w:name="_Toc230211048"/>
+      <w:r>
+        <w:t>1.2 Аналитический обзор методов обработки естественного языка (NLP) и алгоритмов машинного обучения (Learning to Rank)</w:t>
+      </w:r>
+      <w:bookmarkEnd w:id="13"/>
+    </w:p>
+    <w:p ns2:paraId="4E8A9954" ns2:textId="77777777">
+      <w:r>
+        <w:t xml:space="preserve">Для решения задач сопоставления текстов вакансий и резюме традиционно применяются различные семейства методов представления и сравнения текстовой информации: лексические модели (такие как TF-IDF), вероятностные ранжирующие функции (в частности BM25), а в последнее время — </w:t>
+      </w:r>
+      <w:commentRangeStart w:id="14"/>
+      <w:r>
+        <w:t>нейросетевые семантические вложения на базе трансформеров</w:t>
+      </w:r>
+      <w:commentRangeEnd w:id="14"/>
       <w:r>
         <w:rPr>
           <w:rStyle w:val="ac"/>
           <w:sz w:val="24"/>
           <w:szCs w:val="24"/>
         </w:rPr>
-        <w:commentReference w:id="20"/>
-      </w:r>
-      <w:r>
-        <w:t xml:space="preserve"> и нормализованная дисконтированная кумулятивная выгода (NDCG), не только учитывают градуированный уровень релевантности, но и </w:t>
-      </w:r>
-      <w:commentRangeStart w:id="21"/>
-      <w:r>
-        <w:t>применяют прогрессивный дисконт в зависимости от занятой позиции</w:t>
-      </w:r>
-      <w:commentRangeEnd w:id="21"/>
+        <w:commentReference w:id="14"/>
+      </w:r>
+      <w:r>
+        <w:t xml:space="preserve">. В классической вероятностной парадигме функция BM25 зарекомендовала себя как надежная базовая метрика информационного поиска. Связь показателя релевантности с вероятностными предпосылками, параметрами насыщения частоты термина (tf) и нормализацией по длине документа критически важна для текстов вакансий и резюме, поскольку они зачастую существенно различаются по объему и стилистике [11]. В современных системах поиска информации и рекомендаций (в том числе построенных на методологии Learning to Rank) метрика BM25 по-прежнему служит мощным и устойчивым ориентиром; при интеграции нейросетевых алгоритмов </w:t>
+      </w:r>
+      <w:r>
+        <w:lastRenderedPageBreak/>
+        <w:t>ранжирования в контур ATS требуется наличие воспроизводимой классической базовой линии для проведения сравнительного анализа [8, 11].</w:t>
+      </w:r>
+    </w:p>
+    <w:p ns2:paraId="36290E59" ns2:textId="77777777">
+      <w:r>
+        <w:t xml:space="preserve">Методология обучения ранжированию (Learning to Rank, LTR) формализует процесс построения оптимальной ранжирующей функции по заранее размеченным данным (уровням релевантности или </w:t>
+      </w:r>
+      <w:commentRangeStart w:id="15"/>
+      <w:r>
+        <w:t>картам предпочтений</w:t>
+      </w:r>
+      <w:commentRangeEnd w:id="15"/>
       <w:r>
         <w:rPr>
           <w:rStyle w:val="ac"/>
           <w:sz w:val="24"/>
           <w:szCs w:val="24"/>
         </w:rPr>
-        <w:commentReference w:id="21"/>
-      </w:r>
-      <w:r>
-        <w:t xml:space="preserve">, что полностью согласуется с когнитивным эффектом позиционного смещения при просмотре списков пользователем [10]. В прикладной сфере рекрутмента метрики семейства NDCG признаются наиболее подходящими, так как </w:t>
-      </w:r>
-      <w:commentRangeStart w:id="22"/>
-      <w:r>
-        <w:t>HR-специалисты редко просматривают весь перечень соискателей целиком: релевантность первых позиций ранжирования имеет прямое влияние на итоговый результат набора [2, 16]</w:t>
-      </w:r>
-      <w:commentRangeEnd w:id="22"/>
+        <w:commentReference w:id="15"/>
+      </w:r>
+      <w:r>
+        <w:t xml:space="preserve">). </w:t>
+      </w:r>
+      <w:commentRangeStart w:id="16"/>
+      <w:r>
+        <w:t>Общепринято классифицировать алгоритмы LTR на три основные группы: поточечный подход (pointwise, сводящийся к регрессии или классификации по отдельным объектам), попарный подход (pairwise, обучающийся предсказывать предпочтения между двумя документами) и списочный подход (listwise, оптимизирующий функцию потерь непосредственно на всем списке документов на основе ранжирующих метрик) [8]</w:t>
+      </w:r>
+      <w:commentRangeEnd w:id="16"/>
       <w:r>
         <w:rPr>
           <w:rStyle w:val="ac"/>
           <w:sz w:val="24"/>
           <w:szCs w:val="24"/>
         </w:rPr>
-        <w:commentReference w:id="22"/>
-      </w:r>
-      <w:r>
-        <w:t>.</w:t>
-      </w:r>
-    </w:p>
-    <w:p ns2:paraId="1BE49335" ns2:textId="77777777">
-      <w:r>
-        <w:t>Самостоятельным фундаментальным направлением исследований алгоритмов машинного обучения выступает обеспечение справедливости ранжирования (fairness in ranking). В подобных формулировках основной акцент делается на распределении экспозиции как ограниченного ресурса. Применяются ограничения на долю экспозиции в зависимости от объективных достоинств кандидата, с оптимизацией метрики полезности (например, алгоритмы policy-gradient могут оптимизировать NDCG при условии выполнения заданных критериев справедливости) [16]. Для архитектуры системы подбора персонала это представляет значительную концептуальную ценность: вероятность найма кандидата напрямую зависит от занимаемой позиции, и даже незначительные перекосы в базовых скорингах способны резко изменить экспозицию [2, 16].</w:t>
-      </w:r>
-    </w:p>
-    <w:p ns2:paraId="2AF006B6" ns2:textId="77777777">
-      <w:pPr>
-        <w:pStyle w:val="2"/>
-      </w:pPr>
-      <w:bookmarkStart w:id="25" w:name="_Toc230211049"/>
-      <w:r>
-        <w:lastRenderedPageBreak/>
-        <w:t>1.3 Обоснование выбора архитектуры нейросетевых моделей (BERT, Sentence-BERT) и методов векторизации</w:t>
-      </w:r>
-      <w:bookmarkEnd w:id="25"/>
-    </w:p>
-    <w:p ns2:paraId="553E3F45" ns2:textId="77777777">
-      <w:r>
-        <w:t>Современным стандартом анализа семантики текста в области обработки естественного языка выступает архитектура трансформеров, механизм внимания которой позволяет эффективно моделировать смысловые зависимости внутри последовательностей токенов без использования классических сверточных или рекуррентных подходов [7]. На основе этой парадигмы архитектура BERT (Bidirectional Encoder Representations from Transformers) предложила инновационную схему двунаправленного предобучения я</w:t>
-      </w:r>
-      <w:commentRangeStart w:id="26"/>
-      <w:r>
-        <w:t>зыковых представлений</w:t>
-      </w:r>
-      <w:commentRangeEnd w:id="26"/>
+        <w:commentReference w:id="16"/>
+      </w:r>
+      <w:r>
+        <w:t xml:space="preserve">. Классическим примером попарного подхода выступает </w:t>
+      </w:r>
+      <w:commentRangeStart w:id="17"/>
+      <w:r>
+        <w:t>архитектура RankNet</w:t>
+      </w:r>
+      <w:commentRangeEnd w:id="17"/>
       <w:r>
         <w:rPr>
           <w:rStyle w:val="ac"/>
           <w:sz w:val="24"/>
           <w:szCs w:val="24"/>
         </w:rPr>
-        <w:commentReference w:id="26"/>
-      </w:r>
-      <w:r>
-        <w:t xml:space="preserve"> на больших объемах неразмеченных текстов с их последующим дообучением (fine-tuning) под прикладные задачи [5].</w:t>
-      </w:r>
-    </w:p>
-    <w:p ns2:paraId="500E1B06" ns2:textId="77777777">
-      <w:r>
-        <w:t>При решении задач семантического сопоставления пар «вакансия–резюме» важнейшим архитектурным решением является выбор между перекрестным энкодером (cross-encoder) и архитектурой независимого энкодера (bi-encoder). Перекрестный энкодер производит совместную контекстную обработку пары текстов сквозь всю сеть, требуя высоких вычислительных затрат на формирование предсказания. Независимый энкодер генерирует отдельные семантические вложения для каждого текста, после чего сравнивает их с помощью стандартной косинусной меры сходства или скалярного произведения. В основополагающей статье по Sentence-BERT (SBERT) подробно раскрыто ограничение перекрестных энкодеров: при использовании классического BERT попарное вычисление мер близости внутри большой базы приводит к непомерно высокому числу циклов инференса. Модели семейства SBERT модифицируют BERT в сиамскую или триплетную архитектуру для генерации оптимизированных вложений предложений, сравнимых напрямую. Это кардинально снижает вычислительные издержки вывода с сохранением высокого качества на бенчмарках семантического сходства текста [6].</w:t>
-      </w:r>
-    </w:p>
-    <w:p ns2:paraId="482F90AB" ns2:textId="77777777">
-      <w:r>
-        <w:t>В сценарии разработки для системы автоматизированного подбора персонала вышеупомянутые выводы делают рациональной реализацию архитектуры двухступенчатого ранжирования. Первая ступень — стадия выборки (recall), основанная на поиске по плотным вложениям через независимый энкодер для быстрого отбора топ-N кандидатов из глобальной базы. Вторая ступень — стадия переранжирования (re-rank), которая может осуществляться более ресурсоемкой моделью перекрестного энкодера либо строиться как отдельная LTR-надстройка над широким пулом признаков. Подобная логика построения конвейера явно задокументирована в передовых индустриальных исследованиях корпоративного поиска соискателей [17].</w:t>
-      </w:r>
-    </w:p>
-    <w:p ns2:paraId="63CDC1A4" ns2:textId="77777777">
-      <w:r>
-        <w:t xml:space="preserve">Эмпирическую применимость решения на базе SBERT к предметной области найма доказывает статья по архитектуре </w:t>
-      </w:r>
-      <w:commentRangeStart w:id="28"/>
-      <w:r>
-        <w:t>CareerBERT</w:t>
-      </w:r>
-      <w:commentRangeEnd w:id="28"/>
+        <w:commentReference w:id="17"/>
+      </w:r>
+      <w:r>
+        <w:t xml:space="preserve">, </w:t>
+      </w:r>
+      <w:commentRangeStart w:id="18"/>
+      <w:r>
+        <w:t xml:space="preserve">в рамках которой задается вероятностная модель предпочтения между парой объектов исходя из разности их индивидуальных оценок, после чего минимизируется кросс-энтропийная ошибка функции потерь </w:t>
+      </w:r>
+      <w:commentRangeStart w:id="19"/>
+      <w:r>
+        <w:t>логистического связывания</w:t>
+      </w:r>
+      <w:commentRangeEnd w:id="18"/>
       <w:r>
         <w:rPr>
           <w:rStyle w:val="ac"/>
           <w:sz w:val="24"/>
           <w:szCs w:val="24"/>
         </w:rPr>
-        <w:commentReference w:id="28"/>
-      </w:r>
-      <w:r>
-        <w:t xml:space="preserve">: авторам удалось перевести резюме соискателей и описания вакансий в единое векторное пространство. Применялась сиамская </w:t>
-      </w:r>
-      <w:r>
-        <w:lastRenderedPageBreak/>
-        <w:t>нейросеть с функцией потерь попарного ранжирования (Multiple Negatives Ranking loss), формирующая пространство, в котором семантически связанные тексты предельно близки друг к другу, а нерелевантные отдалены [1].</w:t>
-      </w:r>
-    </w:p>
-    <w:p ns2:paraId="678AA264" ns2:textId="77777777">
-      <w:r>
-        <w:t>При работе с русскоязычными текстами дополнительными факторами выступают качество готовых весовых моделей для целевого языка, а также доступность референсных метрик бенчмарков. В современных публикациях вводится мультиязычный формат оценки Massive Text Embedding Benchmark для русского языка (ruMTEB), предлагаются базовые векторные модели (например, cointegrated/rubert-tiny2) и формализуются категории тестовых задач переранжирования, что имеет критическое значение для тестирования будущего модуля обработки отечественного контента [19, 20].</w:t>
-      </w:r>
-    </w:p>
-    <w:p ns2:paraId="4C84D329" ns2:textId="77777777">
-      <w:commentRangeStart w:id="29"/>
-      <w:r>
-        <w:t>Выбор методов векторизации обязательно должен учитывать риски алгоритмического смещения: аудиты в системах рекрутмента подтверждают, что использование только векторных эмбеддингов может провоцировать дискриминационные искажения результатов (по полу, расе, национальности и объему текстового профиля кандидата) [22].</w:t>
-      </w:r>
-      <w:r>
-        <w:br w:type="page"/>
-      </w:r>
-      <w:commentRangeEnd w:id="29"/>
+        <w:commentReference w:id="18"/>
+      </w:r>
+      <w:commentRangeEnd w:id="19"/>
       <w:r>
         <w:rPr>
           <w:rStyle w:val="ac"/>
           <w:sz w:val="24"/>
           <w:szCs w:val="24"/>
         </w:rPr>
-        <w:commentReference w:id="29"/>
-      </w:r>
-    </w:p>
-    <w:p ns2:paraId="1EA596E6" ns2:textId="77777777">
-      <w:pPr>
-        <w:pStyle w:val="1"/>
-      </w:pPr>
-      <w:r>
-        <w:t>2 Проектирование данных, архитектуры обработки и интеграции с системой автоматизированного подбора персонала</w:t>
-      </w:r>
-    </w:p>
-    <w:p ns2:paraId="519AC893" ns2:textId="77777777">
-      <w:pPr>
-        <w:pStyle w:val="2"/>
-      </w:pPr>
-      <w:bookmarkStart w:id="31" w:name="_Toc230211051"/>
-      <w:r>
-        <w:t>2.1 Выполнение сбора, профилирования, очистки и разметки исходных данных (вакансии и резюме)</w:t>
-      </w:r>
-      <w:bookmarkEnd w:id="31"/>
-    </w:p>
-    <w:p ns2:paraId="3A0D9322" ns2:textId="77777777">
-      <w:r>
-        <w:t>Сбор текстовой информации в системе подбора персонала концептуально подразделяется на работу с двумя классами сущностей. С одной стороны, обрабатываются данные вакансий (должностные обязанности, формальные требования, стек технологий, условия труда). С другой стороны, обрабатываются резюме (развернутый опыт работы, ключевые навыки, наличие сертификатов, данные об образовании, стаж работы). Практика систематического извлечения данных аспектов для целей ранжирования была ранее описана как надежная основа первичной обработки соискателей [3].</w:t>
-      </w:r>
-    </w:p>
-    <w:p ns2:paraId="35D25020" ns2:textId="77777777">
-      <w:commentRangeStart w:id="34"/>
-      <w:r>
-        <w:t>Профилирование корпуса вакансий и резюме должно протоколировать распределение длины текста, долю шумовой или неформативной информации (маркетинговые блоки, универсальные фразы), плотность доменных терминов, процентную долю смысловых дубликатов, а также языковой состав.</w:t>
-      </w:r>
-      <w:commentRangeEnd w:id="34"/>
+        <w:commentReference w:id="19"/>
+      </w:r>
+      <w:r>
+        <w:t>. Главное практическое преимущество подобных методов заключается в их дифференцируемости и встроенной совместимости с нейросетевыми архитектурами [9].</w:t>
+      </w:r>
+    </w:p>
+    <w:p ns2:paraId="60183636" ns2:textId="77777777">
+      <w:r>
+        <w:t xml:space="preserve">Ключевым аспектом LTR является оценка качества получаемого ранжирования. Такие метрики, как </w:t>
+      </w:r>
+      <w:commentRangeStart w:id="20"/>
+      <w:r>
+        <w:t>дисконтированная кумулятивная выгода (DCG)</w:t>
+      </w:r>
+      <w:commentRangeEnd w:id="20"/>
       <w:r>
         <w:rPr>
           <w:rStyle w:val="ac"/>
           <w:sz w:val="24"/>
           <w:szCs w:val="24"/>
         </w:rPr>
-        <w:commentReference w:id="34"/>
-      </w:r>
-      <w:r>
-        <w:t xml:space="preserve"> </w:t>
-      </w:r>
-      <w:commentRangeStart w:id="35"/>
-      <w:r>
-        <w:t>В контексте извлечения навыков из резюме существенной проблемой признаются границы определений терминологии: научные обзоры демонстрируют тенденцию к разнообразию в подходах к классификации и стандартизации доменных параметров HR, что обуславливает необходимость создания строгих внутренних регламентов и унификации метрик для разметки данных [18].</w:t>
-      </w:r>
-      <w:commentRangeEnd w:id="35"/>
+        <w:commentReference w:id="20"/>
+      </w:r>
+      <w:r>
+        <w:t xml:space="preserve"> и нормализованная дисконтированная кумулятивная выгода (NDCG), не только учитывают градуированный уровень релевантности, но и </w:t>
+      </w:r>
+      <w:commentRangeStart w:id="21"/>
+      <w:r>
+        <w:t>применяют прогрессивный дисконт в зависимости от занятой позиции</w:t>
+      </w:r>
+      <w:commentRangeEnd w:id="21"/>
       <w:r>
         <w:rPr>
           <w:rStyle w:val="ac"/>
           <w:sz w:val="24"/>
           <w:szCs w:val="24"/>
         </w:rPr>
-        <w:commentReference w:id="35"/>
-      </w:r>
-    </w:p>
-    <w:p ns2:paraId="6058AE1F" ns2:textId="77777777">
-      <w:r>
-        <w:t>Процедура разметки массива данных в рамках проекта протекает на нескольких уровнях:</w:t>
-      </w:r>
-    </w:p>
-    <w:p ns2:paraId="451CB494" ns2:textId="77777777">
-      <w:r>
-        <w:t xml:space="preserve">1. </w:t>
-      </w:r>
-      <w:commentRangeStart w:id="36"/>
-      <w:r>
-        <w:t>Разметка глобальной релевантности пар «вакансия–резюме» для последующего обучения ранжирующих моделей и контроля качества по NDCG.</w:t>
-      </w:r>
-      <w:commentRangeEnd w:id="36"/>
+        <w:commentReference w:id="21"/>
+      </w:r>
+      <w:r>
+        <w:t xml:space="preserve">, что полностью согласуется с когнитивным эффектом позиционного смещения при просмотре списков пользователем [10]. В прикладной сфере рекрутмента метрики семейства NDCG признаются наиболее подходящими, так как </w:t>
+      </w:r>
+      <w:commentRangeStart w:id="22"/>
+      <w:r>
+        <w:t>HR-специалисты редко просматривают весь перечень соискателей целиком: релевантность первых позиций ранжирования имеет прямое влияние на итоговый результат набора [2, 16]</w:t>
+      </w:r>
+      <w:commentRangeEnd w:id="22"/>
       <w:r>
         <w:rPr>
           <w:rStyle w:val="ac"/>
           <w:sz w:val="24"/>
           <w:szCs w:val="24"/>
         </w:rPr>
-        <w:commentReference w:id="36"/>
-      </w:r>
-    </w:p>
-    <w:p ns2:paraId="79485905" ns2:textId="77777777">
-      <w:r>
-        <w:t xml:space="preserve">2. </w:t>
-      </w:r>
-      <w:commentRangeStart w:id="37"/>
-      <w:r>
-        <w:t>Детализированная разметка терминов на уровне выделения текстовых фрагментов (span-level) с типизацией скиллов (hard, soft, knowledge) для построения интерпретируемой выдачи.</w:t>
-      </w:r>
-      <w:commentRangeEnd w:id="37"/>
+        <w:commentReference w:id="22"/>
+      </w:r>
+      <w:r>
+        <w:t>.</w:t>
+      </w:r>
+    </w:p>
+    <w:p ns2:paraId="1BE49335" ns2:textId="77777777">
+      <w:commentRangeStart w:id="23"/>
+      <w:r>
+        <w:t xml:space="preserve">Самостоятельным фундаментальным направлением исследований алгоритмов машинного обучения выступает обеспечение справедливости ранжирования (fairness in ranking). В подобных формулировках основной акцент делается на распределении экспозиции как ограниченного ресурса. Применяются ограничения на долю экспозиции в зависимости от объективных достоинств кандидата, с оптимизацией метрики полезности (например, </w:t>
+      </w:r>
+      <w:commentRangeStart w:id="24"/>
+      <w:r>
+        <w:t>алгоритмы policy-gradient</w:t>
+      </w:r>
+      <w:commentRangeEnd w:id="24"/>
       <w:r>
         <w:rPr>
           <w:rStyle w:val="ac"/>
           <w:sz w:val="24"/>
           <w:szCs w:val="24"/>
         </w:rPr>
-        <w:commentReference w:id="37"/>
-      </w:r>
-    </w:p>
-    <w:p ns2:paraId="678C0B0D" ns2:textId="77777777">
-      <w:r>
-        <w:t xml:space="preserve">3. </w:t>
-      </w:r>
-      <w:commentRangeStart w:id="38"/>
-      <w:r>
-        <w:t>Косвенная разметка посредством накопления поведенческих сигналов рекрутеров (отказы, приглашения на собеседование), реализуемая в условиях промышленной эксплуатации алгоритма.</w:t>
-      </w:r>
-      <w:commentRangeEnd w:id="38"/>
+        <w:commentReference w:id="24"/>
+      </w:r>
+      <w:r>
+        <w:t xml:space="preserve"> могут оптимизировать NDCG при условии выполнения заданных критериев справедливости) [16]. Для архитектуры ATS это представляет значительную концептуальную ценность: вероятность найма кандидата напрямую зависит от занимаемой позиции, и даже незначительные перекосы в базовых скорингах способны резко изменить экспозицию [2, 16].</w:t>
+      </w:r>
+      <w:commentRangeEnd w:id="23"/>
       <w:r>
         <w:rPr>
           <w:rStyle w:val="ac"/>
           <w:sz w:val="24"/>
           <w:szCs w:val="24"/>
         </w:rPr>
-        <w:commentReference w:id="38"/>
-      </w:r>
-    </w:p>
-    <w:p ns2:paraId="0290E3D8" ns2:textId="77777777">
-      <w:r>
-        <w:t>Ключевым примером при решении задачи разметки является ресурс SKILLSPAN, включающий более 14 тысяч предложений из описаний вакансий, экспертно размеченных согласно строгим гайдлайнам. В исследовании показано, что доменно адаптированные модели машинного обучения (single-task подход) в этой задаче значительно превосходят общие алгоритмы генерации текстов [24]. Основываясь на этом, необходимо: а) актуализировать собственную таксономию навыков; б) выполнять настройку трансформеров на локальных корпусах системы подбора персонала; в) оформлять модуль извлечения навыков как независимый подпроцесс [18, 24].</w:t>
-      </w:r>
-    </w:p>
-    <w:p ns2:paraId="0B817B16" ns2:textId="77777777">
-      <w:commentRangeStart w:id="42"/>
-      <w:r>
-        <w:t>По аналогии с работой CareerBERT [1], при наличии внутреннего резерва данных целесообразно использовать подходы лемматизации и стандартизации профессий по государственным классификаторам или международным таксономиям (например, ESCO). Это снижает терминологический разрыв между кандидатами и рекрутерами [1, 18, 24].</w:t>
-      </w:r>
-      <w:commentRangeEnd w:id="42"/>
+        <w:commentReference w:id="23"/>
+      </w:r>
+    </w:p>
+    <w:p ns2:paraId="2AF006B6" ns2:textId="77777777">
+      <w:pPr>
+        <w:pStyle w:val="2"/>
+      </w:pPr>
+      <w:bookmarkStart w:id="25" w:name="_Toc230211049"/>
+      <w:r>
+        <w:lastRenderedPageBreak/>
+        <w:t>1.3 Обоснование выбора архитектуры нейросетевых моделей (BERT, Sentence-BERT) и методов векторизации</w:t>
+      </w:r>
+      <w:bookmarkEnd w:id="25"/>
+    </w:p>
+    <w:p ns2:paraId="553E3F45" ns2:textId="77777777">
+      <w:r>
+        <w:t>Современным стандартом анализа семантики текста в области обработки естественного языка выступает архитектура трансформеров, механизм внимания которой позволяет эффективно моделировать смысловые зависимости внутри последовательностей токенов без использования классических сверточных или рекуррентных подходов [7]. На основе этой парадигмы архитектура BERT (Bidirectional Encoder Representations from Transformers) предложила инновационную схему двунаправленного предобучения я</w:t>
+      </w:r>
+      <w:commentRangeStart w:id="26"/>
+      <w:r>
+        <w:t>зыковых представлений</w:t>
+      </w:r>
+      <w:commentRangeEnd w:id="26"/>
       <w:r>
         <w:rPr>
           <w:rStyle w:val="ac"/>
           <w:sz w:val="24"/>
           <w:szCs w:val="24"/>
         </w:rPr>
-        <w:commentReference w:id="42"/>
-      </w:r>
-    </w:p>
-    <w:p ns2:paraId="015BB585" ns2:textId="77777777">
-      <w:r>
-        <w:t>Ввиду наличия конфиденциальных персональных данных в резюме процедуры очистки должны включать деидентификацию. Доказано, что избыточные «сигнальные» поля (индикация локации, ФИО, университета) способны стать фактором предвзятости для трансформерных моделей [22]. Корректная подготовка данных обязана скрывать параметры, не отражающие напрямую профессиональные качества [2, 22]. В реализованном конвейере маскирование персональных данных выполнено методом жесткой подстановки токенов: все обнаруженные паттерны телефонных номеров и адресов электронной почты заменяются соответственно на токены `[MASKED_PHONE]` и `[MASKED_EMAIL]`, удаляются HTML-теги и шумовые спецсимволы, заполняются пропущенные значения полей. Весь конвейер подготовки данных реализован по принципу Zero-Dependency Batch Processing — на нативном Python с потоковым чтением файлов, что позволяет обрабатывать корпуса объемом в десятки гигабайт без загрузки полного объема информации в оперативную память и повышает воспроизводимость на маломощных серверных конфигурациях.</w:t>
-      </w:r>
-    </w:p>
-    <w:p ns2:paraId="364F4E1A" ns2:textId="77777777">
-      <w:pPr>
-        <w:pStyle w:val="2"/>
-      </w:pPr>
-      <w:bookmarkStart w:id="43" w:name="_Toc230211052"/>
-      <w:r>
-        <w:t>2.2 Проектирование архитектуры пайплайна предварительной обработки и модуля семантического анализа</w:t>
-      </w:r>
-      <w:bookmarkEnd w:id="43"/>
-    </w:p>
-    <w:p ns2:paraId="1B741F22" ns2:textId="77777777">
-      <w:pPr>
-        <w:ind w:firstLine="708"/>
-      </w:pPr>
-      <w:r>
-        <w:t>Архитектура пайплайна проектируется в виде логически упорядоченной последовательности модулей предпроцессинга:</w:t>
-      </w:r>
-    </w:p>
-    <w:p ns2:paraId="50DB11AD" ns2:textId="77777777">
-      <w:pPr>
-        <w:ind w:firstLine="708"/>
-      </w:pPr>
-      <w:r>
-        <w:t>1. Модуль приема (ingestion): получение профилей кандидатов и описаний позиций из БД системы автоматизированного управления подбором персонала, проверка структурного формата и нормализация кодировок.</w:t>
-      </w:r>
-    </w:p>
-    <w:p ns2:paraId="7F41E7C5" ns2:textId="77777777">
-      <w:pPr>
-        <w:ind w:firstLine="708"/>
-      </w:pPr>
-      <w:r>
-        <w:t xml:space="preserve">2. Модуль лингвистической нормализации: реализация токенизации строк, удаление пунктуации и приведение текста к нижнему регистру (lowercasing). Модуль выявляет язык источника, производит дедупликацию и удаляет </w:t>
-      </w:r>
-      <w:commentRangeStart w:id="44"/>
-      <w:r>
-        <w:t>юридические штампы</w:t>
-      </w:r>
-      <w:commentRangeEnd w:id="44"/>
+        <w:commentReference w:id="26"/>
+      </w:r>
+      <w:r>
+        <w:t xml:space="preserve"> на больших объемах неразмеченных текстов с их последующим дообучением (fine-tuning) под прикладные задачи [5].</w:t>
+      </w:r>
+    </w:p>
+    <w:p ns2:paraId="500E1B06" ns2:textId="77777777">
+      <w:r>
+        <w:t>При решении задач семантического сопоставления пар «вакансия–резюме» важнейшим архитектурным решением является выбор между перекрестным энкодером (cross-encoder) и архитектурой на основе независимого энкодера (bi-encoder). Перекрестный энкодер производит совместную контекстную обработку пары текстов сквозь всю сеть, требуя высоких вычислительных затрат на формирование предсказания. Би-энкодер генерирует независимые семантические вложения для каждого текста, после чего сравнивает их с помощью стандартной косинусной меры сходства или скалярного произведения. В основополагающей статье по Sentence-BERT (SBERT) подробно раскрыто ограничение перекрестных энкодеров: при использовании классического BERT попарное вычисление мер близости внутри большой базы приводит к непомерно высокому числу циклов инференса. Модели семейства SBERT модифицируют BERT в сиамскую или триплетную архитектуру для генерации оптимизированных вложений предложений, сравнимых напрямую. Это кардинально снижает вычислительные издержки вывода с сохранением высокого качества на бенчмарках семантического сходства текста [6].</w:t>
+      </w:r>
+    </w:p>
+    <w:p ns2:paraId="482F90AB" ns2:textId="77777777">
+      <w:r>
+        <w:t xml:space="preserve">В сценарии разработки для ATS вышеупомянутые выводы делают рациональной реализацию архитектуры двухступенчатого ранжирования. Первая ступень — стадия выборки (recall), основанная на поиске по плотным вложениям через независимый энкодер для быстрого отбора топ-N кандидатов из глобальной базы. Вторая ступень — стадия переранжирования (re-rank), которая может осуществляться более ресурсоемкой моделью перекрестного энкодера либо строиться как отдельная LTR-надстройка над широким пулом признаков. Подобная логика построения конвейера </w:t>
+      </w:r>
+      <w:commentRangeStart w:id="27"/>
+      <w:r>
+        <w:t>явно задокументирована в передовых индустриальных исследованиях корпоративного поиска соискателей [17]</w:t>
+      </w:r>
+      <w:commentRangeEnd w:id="27"/>
       <w:r>
         <w:rPr>
           <w:rStyle w:val="ac"/>
           <w:sz w:val="24"/>
           <w:szCs w:val="24"/>
         </w:rPr>
-        <w:commentReference w:id="44"/>
+        <w:commentReference w:id="27"/>
       </w:r>
       <w:r>
         <w:t>.</w:t>
       </w:r>
     </w:p>
-    <w:p ns2:paraId="1E656D2D" ns2:textId="77777777">
-      <w:pPr>
-        <w:ind w:firstLine="708"/>
-      </w:pPr>
-      <w:r>
-        <w:t xml:space="preserve">3. Структурно-аналитический модуль: отвечает за вычленение смысловых кластеров (опыт работы, образование, навыки), экстракцию специализированных терминов по категориям hard/soft skills. </w:t>
-      </w:r>
-      <w:commentRangeStart w:id="45"/>
-      <w:r>
-        <w:t>Формируется детальная цифровая матрица компетенций профиля [24].</w:t>
-      </w:r>
-      <w:commentRangeEnd w:id="45"/>
+    <w:p ns2:paraId="63CDC1A4" ns2:textId="77777777">
+      <w:r>
+        <w:t xml:space="preserve">Эмпирическую применимость решения на базе SBERT к предметной области найма доказывает статья по архитектуре </w:t>
+      </w:r>
+      <w:commentRangeStart w:id="28"/>
+      <w:r>
+        <w:t>CareerBERT</w:t>
+      </w:r>
+      <w:commentRangeEnd w:id="28"/>
       <w:r>
         <w:rPr>
           <w:rStyle w:val="ac"/>
           <w:sz w:val="24"/>
           <w:szCs w:val="24"/>
         </w:rPr>
-        <w:commentReference w:id="45"/>
-      </w:r>
-    </w:p>
-    <w:p ns2:paraId="341A0D86" ns2:textId="77777777">
-      <w:pPr>
-        <w:ind w:firstLine="708"/>
-      </w:pPr>
-      <w:r>
-        <w:t xml:space="preserve">4. Модуль построения эмбеддингов: компонент конвертации нормализованных текстов в плотные векторные представления на базе сиамских архитектур Sentence-BERT. </w:t>
+        <w:commentReference w:id="28"/>
+      </w:r>
+      <w:r>
+        <w:t xml:space="preserve">: авторам удалось перевести резюме соискателей и описания вакансий в единое векторное пространство. Применялась сиамская </w:t>
       </w:r>
       <w:r>
         <w:lastRenderedPageBreak/>
-        <w:t>При необходимости базовые веса моделей обогащаются в ходе доменного</w:t>
-      </w:r>
-      <w:commentRangeStart w:id="46"/>
-      <w:r>
-        <w:t xml:space="preserve"> дообучения ин-хаус</w:t>
-      </w:r>
-      <w:commentRangeEnd w:id="46"/>
+        <w:t>нейросеть с функцией потерь попарного ранжирования (Multiple Negatives Ranking loss), формирующая пространство, в котором семантически связанные тексты предельно близки друг к другу, а нерелевантные отдалены [1].</w:t>
+      </w:r>
+    </w:p>
+    <w:p ns2:paraId="678AA264" ns2:textId="77777777">
+      <w:r>
+        <w:t>При работе с русскоязычными текстами дополнительными факторами выступают качество готовых весовых моделей для целевого языка, а также доступность референсных метрик бенчмарков. В современных публикациях вводится мультиязычный формат оценки Massive Text Embedding Benchmark для русского языка (ruMTEB), предлагаются базовые векторные модели (например, cointegrated/rubert-tiny2) и формализуются категории тестовых задач переранжирования, что имеет критическое значение для тестирования будущего модуля обработки отечественного контента [19, 20].</w:t>
+      </w:r>
+    </w:p>
+    <w:p ns2:paraId="4C84D329" ns2:textId="77777777">
+      <w:commentRangeStart w:id="29"/>
+      <w:r>
+        <w:t>Выбор методов векторизации обязательно должен учитывать риски алгоритмического смещения: аудиты в системах рекрутмента подтверждают, что использование только векторных эмбеддингов может провоцировать дискриминационные искажения результатов (по полу, расе, национальности и объему текстового профиля кандидата) [22].</w:t>
+      </w:r>
+      <w:r>
+        <w:br w:type="page"/>
+      </w:r>
+      <w:commentRangeEnd w:id="29"/>
       <w:r>
         <w:rPr>
           <w:rStyle w:val="ac"/>
           <w:sz w:val="24"/>
           <w:szCs w:val="24"/>
         </w:rPr>
+        <w:commentReference w:id="29"/>
+      </w:r>
+    </w:p>
+    <w:p ns2:paraId="1EA596E6" ns2:textId="77777777">
+      <w:pPr>
+        <w:pStyle w:val="1"/>
+      </w:pPr>
+      <w:bookmarkStart w:id="30" w:name="_Toc230211050"/>
+      <w:r>
+        <w:lastRenderedPageBreak/>
+        <w:t>2 Проектирование данных, архитектуры обработки и интеграции с ATS</w:t>
+      </w:r>
+      <w:bookmarkEnd w:id="30"/>
+    </w:p>
+    <w:p ns2:paraId="519AC893" ns2:textId="77777777">
+      <w:pPr>
+        <w:pStyle w:val="2"/>
+      </w:pPr>
+      <w:bookmarkStart w:id="31" w:name="_Toc230211051"/>
+      <w:r>
+        <w:t>2.1 Выполнение сбора, профилирования, очистки и разметки исходных данных (вакансии и резюме)</w:t>
+      </w:r>
+      <w:bookmarkEnd w:id="31"/>
+    </w:p>
+    <w:p ns2:paraId="3A0D9322" ns2:textId="77777777">
+      <w:r>
+        <w:t>Сбор текстовой информации в ATS концептуально подразделяется на работу с двумя классами сущностей. С одной стороны, обрабатываются данные вакансий (</w:t>
+      </w:r>
+      <w:commentRangeStart w:id="32"/>
+      <w:r>
+        <w:t>должностные обязанности, формальные требования, стек технологий, условия труда</w:t>
+      </w:r>
+      <w:commentRangeEnd w:id="32"/>
+      <w:r>
+        <w:rPr>
+          <w:rStyle w:val="ac"/>
+          <w:sz w:val="24"/>
+          <w:szCs w:val="24"/>
+        </w:rPr>
+        <w:commentReference w:id="32"/>
+      </w:r>
+      <w:r>
+        <w:t>). С другой стороны, обрабатываются резюме (</w:t>
+      </w:r>
+      <w:commentRangeStart w:id="33"/>
+      <w:r>
+        <w:t>развернутый опыт работы, ключевые навыки, наличие сертификатов, данные об образовании, стаж работы</w:t>
+      </w:r>
+      <w:commentRangeEnd w:id="33"/>
+      <w:r>
+        <w:rPr>
+          <w:rStyle w:val="ac"/>
+          <w:sz w:val="24"/>
+          <w:szCs w:val="24"/>
+        </w:rPr>
+        <w:commentReference w:id="33"/>
+      </w:r>
+      <w:r>
+        <w:t>). Практика систематического извлечения данных аспектов для целей ранжирования была ранее описана как надежная основа первичной обработки соискателей [3].</w:t>
+      </w:r>
+    </w:p>
+    <w:p ns2:paraId="35D25020" ns2:textId="77777777">
+      <w:commentRangeStart w:id="34"/>
+      <w:r>
+        <w:t>Профилирование корпуса вакансий и резюме должно протоколировать распределение длины текста, долю шумовой или неформативной информации (маркетинговые блоки, универсальные фразы), плотность доменных терминов, процентную долю смысловых дубликатов, а также языковой состав.</w:t>
+      </w:r>
+      <w:commentRangeEnd w:id="34"/>
+      <w:r>
+        <w:rPr>
+          <w:rStyle w:val="ac"/>
+          <w:sz w:val="24"/>
+          <w:szCs w:val="24"/>
+        </w:rPr>
+        <w:commentReference w:id="34"/>
+      </w:r>
+      <w:r>
+        <w:t xml:space="preserve"> </w:t>
+      </w:r>
+      <w:commentRangeStart w:id="35"/>
+      <w:r>
+        <w:t>В контексте извлечения навыков из резюме существенной проблемой признаются границы определений терминологии: научные обзоры демонстрируют тенденцию к разнообразию в подходах к классификации и стандартизации доменных параметров HR, что обуславливает необходимость создания строгих внутренних регламентов и унификации метрик для разметки данных [18].</w:t>
+      </w:r>
+      <w:commentRangeEnd w:id="35"/>
+      <w:r>
+        <w:rPr>
+          <w:rStyle w:val="ac"/>
+          <w:sz w:val="24"/>
+          <w:szCs w:val="24"/>
+        </w:rPr>
+        <w:commentReference w:id="35"/>
+      </w:r>
+    </w:p>
+    <w:p ns2:paraId="6058AE1F" ns2:textId="77777777">
+      <w:r>
+        <w:t>Процедура разметки массива данных в рамках проекта протекает на нескольких уровнях:</w:t>
+      </w:r>
+    </w:p>
+    <w:p ns2:paraId="451CB494" ns2:textId="77777777">
+      <w:r>
+        <w:t xml:space="preserve">1. </w:t>
+      </w:r>
+      <w:commentRangeStart w:id="36"/>
+      <w:r>
+        <w:t>Разметка глобальной релевантности пар «вакансия–резюме» для последующего обучения ранжирующих моделей и контроля качества по NDCG.</w:t>
+      </w:r>
+      <w:commentRangeEnd w:id="36"/>
+      <w:r>
+        <w:rPr>
+          <w:rStyle w:val="ac"/>
+          <w:sz w:val="24"/>
+          <w:szCs w:val="24"/>
+        </w:rPr>
+        <w:commentReference w:id="36"/>
+      </w:r>
+    </w:p>
+    <w:p ns2:paraId="79485905" ns2:textId="77777777">
+      <w:r>
+        <w:t xml:space="preserve">2. </w:t>
+      </w:r>
+      <w:commentRangeStart w:id="37"/>
+      <w:r>
+        <w:t>Детализированная разметка терминов на уровне выделения текстовых фрагментов (span-level) с типизацией скиллов (hard, soft, knowledge) для построения интерпретируемой выдачи.</w:t>
+      </w:r>
+      <w:commentRangeEnd w:id="37"/>
+      <w:r>
+        <w:rPr>
+          <w:rStyle w:val="ac"/>
+          <w:sz w:val="24"/>
+          <w:szCs w:val="24"/>
+        </w:rPr>
+        <w:commentReference w:id="37"/>
+      </w:r>
+    </w:p>
+    <w:p ns2:paraId="678C0B0D" ns2:textId="77777777">
+      <w:r>
+        <w:t xml:space="preserve">3. </w:t>
+      </w:r>
+      <w:commentRangeStart w:id="38"/>
+      <w:r>
+        <w:t>Косвенная разметка посредством накопления поведенческих сигналов рекрутеров (отказы, приглашения на собеседование), реализуемая в условиях промышленной эксплуатации алгоритма.</w:t>
+      </w:r>
+      <w:commentRangeEnd w:id="38"/>
+      <w:r>
+        <w:rPr>
+          <w:rStyle w:val="ac"/>
+          <w:sz w:val="24"/>
+          <w:szCs w:val="24"/>
+        </w:rPr>
+        <w:commentReference w:id="38"/>
+      </w:r>
+    </w:p>
+    <w:p ns2:paraId="0290E3D8" ns2:textId="77777777">
+      <w:r>
+        <w:t xml:space="preserve">Ключевым примером при решении задачи разметки является ресурс </w:t>
+      </w:r>
+      <w:commentRangeStart w:id="39"/>
+      <w:r>
+        <w:t>SKILLSPAN</w:t>
+      </w:r>
+      <w:commentRangeEnd w:id="39"/>
+      <w:r>
+        <w:rPr>
+          <w:rStyle w:val="ac"/>
+          <w:sz w:val="24"/>
+          <w:szCs w:val="24"/>
+        </w:rPr>
+        <w:commentReference w:id="39"/>
+      </w:r>
+      <w:r>
+        <w:t xml:space="preserve">, включающий более 14 тысяч предложений из описаний вакансий, экспертно размеченных согласно строгим гайдлайнам. В исследовании показано, что доменно адаптированные модели машинного обучения (single-task подход) в этой задаче значительно превосходят </w:t>
+      </w:r>
+      <w:commentRangeStart w:id="40"/>
+      <w:r>
+        <w:t>общие алгоритмы генерации текстов [24]</w:t>
+      </w:r>
+      <w:commentRangeEnd w:id="40"/>
+      <w:r>
+        <w:rPr>
+          <w:rStyle w:val="ac"/>
+          <w:sz w:val="24"/>
+          <w:szCs w:val="24"/>
+        </w:rPr>
+        <w:commentReference w:id="40"/>
+      </w:r>
+      <w:r>
+        <w:t xml:space="preserve">. Основываясь на этом, необходимо: а) актуализировать собственную таксономию навыков; б) выполнять настройку </w:t>
+      </w:r>
+      <w:r>
+        <w:lastRenderedPageBreak/>
+        <w:t xml:space="preserve">трансформеров на локальных корпусах ATS; </w:t>
+      </w:r>
+      <w:commentRangeStart w:id="41"/>
+      <w:r>
+        <w:t>в) оформлять модуль извлечения навыков как независимый подпроцесс [18, 24].</w:t>
+      </w:r>
+      <w:commentRangeEnd w:id="41"/>
+      <w:r>
+        <w:rPr>
+          <w:rStyle w:val="ac"/>
+          <w:sz w:val="24"/>
+          <w:szCs w:val="24"/>
+        </w:rPr>
+        <w:commentReference w:id="41"/>
+      </w:r>
+    </w:p>
+    <w:p ns2:paraId="0B817B16" ns2:textId="77777777">
+      <w:commentRangeStart w:id="42"/>
+      <w:r>
+        <w:t>По аналогии с работой CareerBERT [1], при наличии внутреннего резерва данных целесообразно использовать подходы лемматизации и стандартизации профессий по государственным классификаторам или международным таксономиям (например, ESCO). Это снижает терминологический разрыв между кандидатами и рекрутерами [1, 18, 24].</w:t>
+      </w:r>
+      <w:commentRangeEnd w:id="42"/>
+      <w:r>
+        <w:rPr>
+          <w:rStyle w:val="ac"/>
+          <w:sz w:val="24"/>
+          <w:szCs w:val="24"/>
+        </w:rPr>
+        <w:commentReference w:id="42"/>
+      </w:r>
+    </w:p>
+    <w:p ns2:paraId="015BB585" ns2:textId="77777777">
+      <w:r>
+        <w:t>Ввиду наличия конфиденциальных персональных данных в резюме процедуры очистки должны включать деидентификацию. Доказано, что избыточные «сигнальные» поля (индикация локации, ФИО, университета) способны стать фактором предвзятости для трансформерных моделей [22]. Корректная подготовка данных обязана скрывать параметры, не отражающие напрямую профессиональные качества [2, 22]. В реализованном конвейере маскирование персональных данных выполнено методом жесткой подстановки токенов: все обнаруженные паттерны телефонных номеров и адресов электронной почты заменяются соответственно на токены `[MASKED_PHONE]` и `[MASKED_EMAIL]`, удаляются HTML-теги и шумовые спецсимволы, заполняются пропущенные значения полей. Весь конвейер подготовки данных реализован по принципу Zero-Dependency Batch Processing — на нативном Python с потоковым чтением файлов, что позволяет обрабатывать корпуса объемом в десятки гигабайт без загрузки полного объема информации в оперативную память и повышает воспроизводимость на маломощных серверных конфигурациях.</w:t>
+      </w:r>
+    </w:p>
+    <w:p ns2:paraId="364F4E1A" ns2:textId="77777777">
+      <w:pPr>
+        <w:pStyle w:val="2"/>
+      </w:pPr>
+      <w:bookmarkStart w:id="43" w:name="_Toc230211052"/>
+      <w:r>
+        <w:t>2.2 Проектирование архитектуры пайплайна предварительной обработки и модуля семантического анализа</w:t>
+      </w:r>
+      <w:bookmarkEnd w:id="43"/>
+    </w:p>
+    <w:p ns2:paraId="1B741F22" ns2:textId="77777777">
+      <w:pPr>
+        <w:ind w:firstLine="708"/>
+      </w:pPr>
+      <w:r>
+        <w:t>Архитектура пайплайна проектируется в виде логически упорядоченной последовательности модулей предпроцессинга:</w:t>
+      </w:r>
+    </w:p>
+    <w:p ns2:paraId="50DB11AD" ns2:textId="77777777">
+      <w:pPr>
+        <w:ind w:firstLine="708"/>
+      </w:pPr>
+      <w:r>
+        <w:t>1. Модуль приема (ingestion): получение профилей кандидатов и описаний позиций из БД комплекса ATS, проверка структурного формата и нормализация кодировок.</w:t>
+      </w:r>
+    </w:p>
+    <w:p ns2:paraId="7F41E7C5" ns2:textId="77777777">
+      <w:pPr>
+        <w:ind w:firstLine="708"/>
+      </w:pPr>
+      <w:r>
+        <w:t xml:space="preserve">2. Модуль лингвистической нормализации: реализация токенизации строк, удаление пунктуации и приведение текста к нижнему регистру (lowercasing). Модуль выявляет язык источника, производит дедупликацию и удаляет </w:t>
+      </w:r>
+      <w:commentRangeStart w:id="44"/>
+      <w:r>
+        <w:t>юридические штампы</w:t>
+      </w:r>
+      <w:commentRangeEnd w:id="44"/>
+      <w:r>
+        <w:rPr>
+          <w:rStyle w:val="ac"/>
+          <w:sz w:val="24"/>
+          <w:szCs w:val="24"/>
+        </w:rPr>
+        <w:commentReference w:id="44"/>
+      </w:r>
+      <w:r>
+        <w:t>.</w:t>
+      </w:r>
+    </w:p>
+    <w:p ns2:paraId="1E656D2D" ns2:textId="77777777">
+      <w:pPr>
+        <w:ind w:firstLine="708"/>
+      </w:pPr>
+      <w:r>
+        <w:t xml:space="preserve">3. Структурно-аналитический модуль: отвечает за вычленение смысловых кластеров (опыт работы, образование, навыки), экстракцию специализированных терминов по категориям hard/soft skills. </w:t>
+      </w:r>
+      <w:commentRangeStart w:id="45"/>
+      <w:r>
+        <w:t>Формируется детальная цифровая матрица компетенций профиля [24].</w:t>
+      </w:r>
+      <w:commentRangeEnd w:id="45"/>
+      <w:r>
+        <w:rPr>
+          <w:rStyle w:val="ac"/>
+          <w:sz w:val="24"/>
+          <w:szCs w:val="24"/>
+        </w:rPr>
+        <w:commentReference w:id="45"/>
+      </w:r>
+    </w:p>
+    <w:p ns2:paraId="341A0D86" ns2:textId="77777777">
+      <w:pPr>
+        <w:ind w:firstLine="708"/>
+      </w:pPr>
+      <w:r>
+        <w:t xml:space="preserve">4. Модуль построения эмбеддингов: компонент конвертации нормализованных текстов в плотные векторные представления на базе сиамских архитектур Sentence-BERT. </w:t>
+      </w:r>
+      <w:r>
+        <w:lastRenderedPageBreak/>
+        <w:t>При необходимости базовые веса моделей обогащаются в ходе доменного</w:t>
+      </w:r>
+      <w:commentRangeStart w:id="46"/>
+      <w:r>
+        <w:t xml:space="preserve"> дообучения ин-хаус</w:t>
+      </w:r>
+      <w:commentRangeEnd w:id="46"/>
+      <w:r>
+        <w:rPr>
+          <w:rStyle w:val="ac"/>
+          <w:sz w:val="24"/>
+          <w:szCs w:val="24"/>
+        </w:rPr>
         <w:commentReference w:id="46"/>
       </w:r>
       <w:r>
@@ -2462,8 +3268,18 @@
       <w:pPr>
         <w:ind w:firstLine="708"/>
       </w:pPr>
-      <w:r>
-        <w:t>7. Модуль объяснимости (Explainability Engine): формирует интерпретируемые сводки (например, текстовые плашки совпадения навыков). Механизм прозрачности работы модели призван компенсировать фактор эффекта «черного ящика», повышая доверие конечного пользователя внутри системы подбора персонала к результату алгоритма [23].</w:t>
+      <w:commentRangeStart w:id="47"/>
+      <w:r>
+        <w:t>7. Модуль объяснимости (Explainability Engine): формирует интерпретируемые сводки (например, текстовые плашки совпадения навыков). Механизм прозрачности работы модели призван компенсировать фактор эффекта «черного ящика», повышая доверие конечного пользователя внутри ATS к результату алгоритма [23].</w:t>
+      </w:r>
+      <w:commentRangeEnd w:id="47"/>
+      <w:r>
+        <w:rPr>
+          <w:rStyle w:val="ac"/>
+          <w:sz w:val="24"/>
+          <w:szCs w:val="24"/>
+        </w:rPr>
+        <w:commentReference w:id="47"/>
       </w:r>
     </w:p>
     <w:p ns2:paraId="1E70533F" ns2:textId="77777777">
@@ -2471,16 +3287,18 @@
         <w:ind w:firstLine="708"/>
       </w:pPr>
       <w:r>
-        <w:t>8. И наконец в планах развития проекта, чтобы заверщающим шагом должен идти модуль LLM-генерации критериев оценки: в целевой системе Reqcore реализован автоматизированный конвейер формирования объективной шкалы оценивания кандидатов на основе текста описания вакансии. Система передает описание позиции в LLM (с поддержкой нескольких провайдеров: OpenAI, Anthropic, Google AI) и получает структурированный ответ, жестко валидируемый JSON-схемой. Каждый сгенерированный критерий содержит уникальный идентификатор, наименование, инструкцию по поиску фактов в резюме, категорию (технический навык, soft skill, образование), базовую шкалу оценки и рекомендованный вес значимости. Полученные критерии далее выступают в роли формализованного чек-листа для автоматического AI-скоринга входящих резюме.</w:t>
+        <w:t>8. И наконец в планах развития проекта, чтобы заверщающим шагом должен идти модуль LLM-генерации критериев оценки: в целевой ATS-системе (Reqcore) реализован автоматизированный конвейер формирования объективной шкалы оценивания кандидатов на основе текста описания вакансии. Система передает описание позиции в LLM (с поддержкой нескольких провайдеров: OpenAI, Anthropic, Google AI) и получает структурированный ответ, жестко валидируемый JSON-схемой. Каждый сгенерированный критерий содержит уникальный идентификатор, наименование, инструкцию по поиску фактов в резюме, категорию (технический навык, soft skill, образование), базовую шкалу оценки и рекомендованный вес значимости. Полученные критерии далее выступают в роли формализованного чек-листа для автоматического AI-скоринга входящих резюме.</w:t>
       </w:r>
     </w:p>
     <w:p ns2:paraId="5636570D" ns2:textId="77777777">
       <w:pPr>
         <w:pStyle w:val="2"/>
       </w:pPr>
-      <w:r>
-        <w:t>2.3 Спецификация программного интерфейса (API) и модулей интеграции с ядром системы подбора персонала</w:t>
-      </w:r>
+      <w:bookmarkStart w:id="48" w:name="_Toc230211053"/>
+      <w:r>
+        <w:t>2.3 Спецификация программного интерфейса (API) и модулей интеграции с ядром ATS</w:t>
+      </w:r>
+      <w:bookmarkEnd w:id="48"/>
     </w:p>
     <w:p ns2:paraId="7DB66C47" ns2:textId="77777777">
       <w:r>
@@ -3274,12 +4092,16 @@
     </w:p>
     <w:p ns2:paraId="2854CA36" ns2:textId="4515C8B0">
       <w:r>
-        <w:t>Одним из таких направлений может стать введение отдельных публичных маршрутов для работы с эмбеддингами вакансий и резюме. В отличие от текущей реализации, где кандидатский профиль поступает в систему уже в подготовленном текстовом виде, выделение специализированных endpointов для получения векторных представлений позволило бы формализовать этап предрасчёта признаков, упростить инкрементальное обновление представлений и сделать API более пригодным для сценариев, в которых этап подготовки данных отделён от этапа ранжирования. Такое расширение особенно актуально при переходе от прототипной схемы взаимодействия к более устойчивой сервисной архитектуре.</w:t>
+        <w:t xml:space="preserve">Одним из таких направлений может стать введение отдельных публичных маршрутов для работы с эмбеддингами вакансий и резюме. В отличие от текущей реализации, где кандидатский профиль поступает в систему уже в подготовленном текстовом виде, выделение специализированных endpointов для получения векторных представлений позволило бы формализовать этап предрасчёта признаков, упростить </w:t>
+      </w:r>
+      <w:r>
+        <w:lastRenderedPageBreak/>
+        <w:t>инкрементальное обновление представлений и сделать API более пригодным для сценариев, в которых контур подготовки данных отделён от контура ранжирования. Такое расширение особенно актуально при переходе от прототипной схемы взаимодействия к более устойчивой сервисной архитектуре.</w:t>
       </w:r>
     </w:p>
     <w:p ns2:paraId="57DE3D0D" ns2:textId="77777777">
       <w:r>
-        <w:t>Перспективным направлением также является развитие механизмов синхронизации индекса. В текущем состоянии используется временный in-memory индекс, достаточный для демонстрации и проверки базовой логики поиска, однако в дальнейшем API может быть дополнено операциями обновления и удаления записей, ориентированными на согласованную синхронизацию между системой подбора персонала и внешним хранилищем представлений кандидатов. Реализация такого слоя позволила бы перейти от эпизодической загрузки данных к управляемому жизненному циклу профилей в системе и тем самым приблизить решение к требованиям промышленной эксплуатации.</w:t>
+        <w:t>Перспективным направлением также является развитие механизмов синхронизации индекса. В текущем состоянии используется временный in-memory индекс, достаточный для демонстрации и проверки базовой логики поиска, однако в дальнейшем API может быть дополнено операциями обновления и удаления записей, ориентированными на согласованную синхронизацию между ATS и внешним хранилищем представлений кандидатов. Реализация такого слоя позволила бы перейти от эпизодической загрузки данных к управляемому жизненному циклу профилей в системе и тем самым приблизить решение к требованиям промышленной эксплуатации.</w:t>
       </w:r>
     </w:p>
     <w:p ns2:paraId="03D907D9" ns2:textId="77777777">
@@ -3289,12 +4111,12 @@
     </w:p>
     <w:p ns2:paraId="380EC76E" ns2:textId="77777777">
       <w:r>
-        <w:t>Наконец, дальнейшее расширение возможно на уровне самого поискового маршрута. Если в текущей реализации выдача ориентирована прежде всего на возврат результата ранжирования, то в перспективе API может быть дополнено поддержкой более богатого выходного формата, включающего дополнительные метаданные и интерпретационные компоненты. Подобное развитие позволило бы сделать систему удобнее для практического использования в сценариях автоматизированного подбора персонала, где важна не только численная релевантность кандидата, но и возможность объяснить основания, по которым профиль оказался выше или ниже в итоговом списке.</w:t>
+        <w:t>Наконец, дальнейшее расширение возможно на уровне самого поискового маршрута. Если в текущей реализации выдача ориентирована прежде всего на возврат результата ранжирования, то в перспективе API может быть дополнено поддержкой более богатого выходного формата, включающего дополнительные метаданные и интерпретационные компоненты. Подобное развитие позволило бы сделать систему удобнее для практического использования в ATS-сценариях, где важна не только численная релевантность кандидата, но и возможность объяснить основания, по которым профиль оказался выше или ниже в итоговом списке.</w:t>
       </w:r>
     </w:p>
     <w:p ns2:paraId="2A059843" ns2:textId="77777777">
       <w:r>
-        <w:t>Текущая серверная интеграция между системой Reqcore и модулем ML-оценки реализована в обработчике `ats/reqcore/server/api/applications/[id]/analyze.post.ts`. Эта точка является фактическим входом для анализа одной заявки и отвечает за выбор ветки скоринга по значению `ai_config.provider`. В обоих вариантах результат интеграции сводится к обновлению числового поля `application.score` и записи аудита в `analysis_run`; различается только способ получения этого числа.</w:t>
+        <w:t>Текущая серверная интеграция между ATS Reqcore и модулем ML-оценки реализована в обработчике `ats/reqcore/server/api/applications/[id]/analyze.post.ts`. Эта точка является фактическим входом для анализа одной заявки и отвечает за выбор ветки скоринга по значению `ai_config.provider`. В обоих вариантах результат интеграции сводится к обновлению числового поля `application.score` и записи аудита в `analysis_run`; различается только способ получения этого числа.</w:t>
       </w:r>
     </w:p>
     <w:p ns2:paraId="33AEF8E4" ns2:textId="77777777">
@@ -3376,9 +4198,12 @@
       <w:pPr>
         <w:pStyle w:val="1"/>
       </w:pPr>
-      <w:r>
-        <w:t>3 Разработка и реализация модуля сопоставления вакансий и резюме для ранжирования кандидатов</w:t>
-      </w:r>
+      <w:bookmarkStart w:id="49" w:name="_Toc230211054"/>
+      <w:r>
+        <w:lastRenderedPageBreak/>
+        <w:t>3 Разработка и реализация модуля семантического ранжирования кандидатов</w:t>
+      </w:r>
+      <w:bookmarkEnd w:id="49"/>
     </w:p>
     <w:p ns2:paraId="7C2893EF" ns2:textId="77777777">
       <w:pPr>
@@ -3402,7 +4227,7 @@
     </w:p>
     <w:p ns2:paraId="3BC02EA9" ns2:textId="77777777">
       <w:r>
-        <w:t>Программная реализация ML-модуля разделена на офлайн-часть и онлайн-часть в соответствии с передовой практикой систем поиска талантов [17]. Офлайн-модули собирают, очищают и размечают данные, формируют обучающие пары «текст вакансии–текст резюме» и проводят обучение модели; онлайн-часть выполняет инференс векторных представлений и предоставляет API-команды для ранжирования.</w:t>
+        <w:t>Контур разработки ML-кода разделен на офлайн- и онлайн-контуры в соответствии с передовой практикой систем талантов [17]. Офлайн-модули собирают, подготавливают данные и проводят обучение; онлайн-система занимается инференсом эмбеддингов и передачей API-команд.</w:t>
       </w:r>
     </w:p>
     <w:p ns2:paraId="56CAE688" ns2:textId="77777777">
@@ -3421,17 +4246,32 @@
       </w:r>
     </w:p>
     <w:p ns2:paraId="353C54B2" ns2:textId="77777777">
-      <w:r>
-        <w:t>3. Формирования разметки корпуса в рамках подготовки к обучению алгоритма. Данный этап реализован совместно с инструментарием доменных экспертов системы автоматизированного управления подбором персонала для формирования локальных гайдлайнов поиска [24]. В будущем планируется адаптировать/применить эту разметку для обучения алгоритмов LTR.</w:t>
+      <w:commentRangeStart w:id="52"/>
+      <w:r>
+        <w:t xml:space="preserve">3. </w:t>
+      </w:r>
+      <w:commentRangeEnd w:id="52"/>
+      <w:r>
+        <w:rPr>
+          <w:rStyle w:val="ac"/>
+          <w:sz w:val="24"/>
+          <w:szCs w:val="24"/>
+        </w:rPr>
+        <w:commentReference w:id="52"/>
+      </w:r>
+      <w:r>
+        <w:t>Формирования разметки корпуса в рамках подготовки к обучению алгоритма. Данный этап реализован совместно с инструментарием доменных экспертов системы ATS для формирования локальных гайдлайнов поиска [24]. В будущем планируется адаптировать/применить эту разметку для обучения алгоритмов LTR.</w:t>
       </w:r>
     </w:p>
     <w:p ns2:paraId="6689FAEA" ns2:textId="77777777">
       <w:pPr>
         <w:pStyle w:val="2"/>
       </w:pPr>
-      <w:r>
-        <w:t>3.2 Реализация и доменная настройка (fine-tuning) модели сопоставления «вакансия-резюме»</w:t>
-      </w:r>
+      <w:bookmarkStart w:id="53" w:name="_Toc230211056"/>
+      <w:r>
+        <w:t>3.2 Реализация и дообучение (fine-tuning) модели сопоставления «вакансия-резюме»</w:t>
+      </w:r>
+      <w:bookmarkEnd w:id="53"/>
     </w:p>
     <w:p ns2:paraId="566BE36F" ns2:textId="77777777">
       <w:pPr>
@@ -3440,7 +4280,112 @@
         </w:rPr>
       </w:pPr>
       <w:r>
-        <w:t>В реализации основного масштабируемого подхода используется архитектура независимого энкодера (bi-encoder) на базе `cointegrated/rubert-tiny2`: вакансия и резюме кодируются раздельно, а затем сравниваются по косинусной близости полученных векторных представлений. Это реализовано обучающим скриптом `experiments/scripts/09_train_biencoder.py`, где аргумент `--model_name` имеет значение по умолчанию `cointegrated/rubert-tiny2`, а также сохраненным артефактом `experiments/models/bi_encoder_rubert_tiny2`, в `README.md` которого указан `base_model: cointegrated/rubert-tiny2`.</w:t>
+        <w:t xml:space="preserve">При реализации контура векторного кодирования фактически используется только модель `cointegrated/rubert-tiny2`. Это реализовано обучающим скриптом `experiments/scripts/09_train_biencoder.py`, где аргумент `--model_name` имеет значение по умолчанию </w:t>
+      </w:r>
+      <w:r>
+        <w:rPr>
+          <w:lang w:val="en-US"/>
+        </w:rPr>
+        <w:t xml:space="preserve">`cointegrated/rubert-tiny2`, </w:t>
+      </w:r>
+      <w:r>
+        <w:t>а</w:t>
+      </w:r>
+      <w:r>
+        <w:rPr>
+          <w:lang w:val="en-US"/>
+        </w:rPr>
+        <w:t xml:space="preserve"> </w:t>
+      </w:r>
+      <w:r>
+        <w:t>также</w:t>
+      </w:r>
+      <w:r>
+        <w:rPr>
+          <w:lang w:val="en-US"/>
+        </w:rPr>
+        <w:t xml:space="preserve"> </w:t>
+      </w:r>
+      <w:r>
+        <w:t>сохраненным</w:t>
+      </w:r>
+      <w:r>
+        <w:rPr>
+          <w:lang w:val="en-US"/>
+        </w:rPr>
+        <w:t xml:space="preserve"> </w:t>
+      </w:r>
+      <w:r>
+        <w:t>артефактом</w:t>
+      </w:r>
+      <w:r>
+        <w:rPr>
+          <w:lang w:val="en-US"/>
+        </w:rPr>
+        <w:t xml:space="preserve"> `experiments/models/bi_encoder_rubert_tiny2`, </w:t>
+      </w:r>
+      <w:r>
+        <w:t>в</w:t>
+      </w:r>
+      <w:r>
+        <w:rPr>
+          <w:lang w:val="en-US"/>
+        </w:rPr>
+        <w:t xml:space="preserve"> `README.md` </w:t>
+      </w:r>
+      <w:r>
+        <w:t>которого</w:t>
+      </w:r>
+      <w:r>
+        <w:rPr>
+          <w:lang w:val="en-US"/>
+        </w:rPr>
+        <w:t xml:space="preserve"> </w:t>
+      </w:r>
+      <w:r>
+        <w:t>указан</w:t>
+      </w:r>
+      <w:r>
+        <w:rPr>
+          <w:lang w:val="en-US"/>
+        </w:rPr>
+        <w:t xml:space="preserve"> `base_model: cointegrated/rubert-tiny2`. </w:t>
+      </w:r>
+      <w:r>
+        <w:t>В</w:t>
+      </w:r>
+      <w:r>
+        <w:rPr>
+          <w:lang w:val="en-US"/>
+        </w:rPr>
+        <w:t xml:space="preserve"> </w:t>
+      </w:r>
+      <w:r>
+        <w:t>планах</w:t>
+      </w:r>
+      <w:r>
+        <w:rPr>
+          <w:lang w:val="en-US"/>
+        </w:rPr>
+        <w:t xml:space="preserve"> </w:t>
+      </w:r>
+      <w:r>
+        <w:t>возможно</w:t>
+      </w:r>
+      <w:r>
+        <w:rPr>
+          <w:lang w:val="en-US"/>
+        </w:rPr>
+        <w:t xml:space="preserve"> </w:t>
+      </w:r>
+      <w:r>
+        <w:t>применение</w:t>
+      </w:r>
+      <w:r>
+        <w:rPr>
+          <w:lang w:val="en-US"/>
+        </w:rPr>
+        <w:t xml:space="preserve"> `ru-en-RoSBERTa`.</w:t>
       </w:r>
     </w:p>
     <w:p ns2:paraId="0400FFE8" ns2:textId="77777777">
@@ -6814,7 +7759,133 @@
     </w:p>
     <w:p ns2:paraId="20E87204" ns2:textId="77777777">
       <w:r>
-        <w:t>Оценка качества текущей модели интерпретируется как проверка семантического скоринга на сформированных split-файлах, а не как внешняя бизнес-валидация системы автоматизированного подбора персонала. Для исправленных `val.tsv` и `test.tsv` были измерены метрики бинарного разделения пар по cosine score с подбором лучшего порога. Базовая модель `cointegrated/rubert-tiny2` без дообучения на `val` имела Average Precision `0.2590`, best F1 `0.5079`, best accuracy `0.6603`, MCC `0.0315`; после fine-tuning сохраненная модель `experiments/models/bi_encoder_rubert_tiny2` достигла Average Precision `0.9870`, best F1 `0.9582`, best accuracy `0.9712`, MCC `0.9365`. На `test` baseline показал Average Precision `0.2222`, best F1 `0.5072`, best accuracy `0.6583`, MCC `0.0000`; fine-tuned модель показала Average Precision `0.9921`, best F1 `0.9636`, best accuracy `0.9750`, MCC `0.9447`. Эти числа подтверждают улучшение разделимости положительных и отрицательных пар после обучения, но не являются метриками fair ranking или внешней экспертной проверки.</w:t>
+        <w:t>Оценка качества текущей модели интерпретируется как проверка семантического скоринга на сформированных split-файлах, а не как внешняя бизнес-валидация ATS. Для исправленных `val.tsv` и `test.tsv` были измерены метрики бинарного разделения пар по cosine score с подбором лучшего порога. Базовая</w:t>
+      </w:r>
+      <w:r>
+        <w:rPr>
+          <w:lang w:val="en-US"/>
+        </w:rPr>
+        <w:t xml:space="preserve"> </w:t>
+      </w:r>
+      <w:r>
+        <w:t>модель</w:t>
+      </w:r>
+      <w:r>
+        <w:rPr>
+          <w:lang w:val="en-US"/>
+        </w:rPr>
+        <w:t xml:space="preserve"> `cointegrated/rubert-tiny2` </w:t>
+      </w:r>
+      <w:r>
+        <w:t>без</w:t>
+      </w:r>
+      <w:r>
+        <w:rPr>
+          <w:lang w:val="en-US"/>
+        </w:rPr>
+        <w:t xml:space="preserve"> </w:t>
+      </w:r>
+      <w:r>
+        <w:t>дообучения</w:t>
+      </w:r>
+      <w:r>
+        <w:rPr>
+          <w:lang w:val="en-US"/>
+        </w:rPr>
+        <w:t xml:space="preserve"> </w:t>
+      </w:r>
+      <w:r>
+        <w:t>на</w:t>
+      </w:r>
+      <w:r>
+        <w:rPr>
+          <w:lang w:val="en-US"/>
+        </w:rPr>
+        <w:t xml:space="preserve"> `val` </w:t>
+      </w:r>
+      <w:r>
+        <w:t>имела</w:t>
+      </w:r>
+      <w:r>
+        <w:rPr>
+          <w:lang w:val="en-US"/>
+        </w:rPr>
+        <w:t xml:space="preserve"> Average Precision `0.2590`, best F1 `0.5079`, best accuracy `0.6603`, MCC `0.0315`; </w:t>
+      </w:r>
+      <w:r>
+        <w:t>после</w:t>
+      </w:r>
+      <w:r>
+        <w:rPr>
+          <w:lang w:val="en-US"/>
+        </w:rPr>
+        <w:t xml:space="preserve"> fine-tuning </w:t>
+      </w:r>
+      <w:r>
+        <w:t>сохраненная</w:t>
+      </w:r>
+      <w:r>
+        <w:rPr>
+          <w:lang w:val="en-US"/>
+        </w:rPr>
+        <w:t xml:space="preserve"> </w:t>
+      </w:r>
+      <w:r>
+        <w:t>модель</w:t>
+      </w:r>
+      <w:r>
+        <w:rPr>
+          <w:lang w:val="en-US"/>
+        </w:rPr>
+        <w:t xml:space="preserve"> `experiments/models/bi_encoder_rubert_tiny2` </w:t>
+      </w:r>
+      <w:r>
+        <w:t>достигла</w:t>
+      </w:r>
+      <w:r>
+        <w:rPr>
+          <w:lang w:val="en-US"/>
+        </w:rPr>
+        <w:t xml:space="preserve"> Average Precision `0.9870`, best F1 `0.9582`, best accuracy `0.9712`, MCC `0.9365`. </w:t>
+      </w:r>
+      <w:r>
+        <w:t>На</w:t>
+      </w:r>
+      <w:r>
+        <w:rPr>
+          <w:lang w:val="en-US"/>
+        </w:rPr>
+        <w:t xml:space="preserve"> `test` baseline </w:t>
+      </w:r>
+      <w:r>
+        <w:t>показал</w:t>
+      </w:r>
+      <w:r>
+        <w:rPr>
+          <w:lang w:val="en-US"/>
+        </w:rPr>
+        <w:t xml:space="preserve"> Average Precision `0.2222`, best F1 `0.5072`, best accuracy `0.6583`, MCC `0.0000`; fine-tuned </w:t>
+      </w:r>
+      <w:r>
+        <w:t>модель</w:t>
+      </w:r>
+      <w:r>
+        <w:rPr>
+          <w:lang w:val="en-US"/>
+        </w:rPr>
+        <w:t xml:space="preserve"> </w:t>
+      </w:r>
+      <w:r>
+        <w:t>показала</w:t>
+      </w:r>
+      <w:r>
+        <w:rPr>
+          <w:lang w:val="en-US"/>
+        </w:rPr>
+        <w:t xml:space="preserve"> Average Precision `0.9921`, best F1 `0.9636`, best accuracy `0.9750`, MCC `0.9447`. </w:t>
+      </w:r>
+      <w:r>
+        <w:t>Эти числа подтверждают улучшение разделимости положительных и отрицательных пар после обучения, но не являются метриками fair ranking или внешней экспертной проверки.</w:t>
       </w:r>
     </w:p>
     <w:p ns2:paraId="106ABBA7" ns2:textId="77777777">
@@ -7643,12 +8714,12 @@
     </w:p>
     <w:p ns2:paraId="5E3C6997" ns2:textId="77777777">
       <w:r>
-        <w:t>Перед интерпретацией экспериментальных метрик важно зафиксировать, с какими классами ранжирующих систем сопоставляется реализованный подход на базе двунаправленного кодировщика представлений на основе трансформера (Bidirectional Encoder Representations from Transformers), модели векторных представлений предложений (Sentence Bidirectional Encoder Representations from Transformers) и архитектуры двойного кодировщика (dual encoder architecture). В задаче автоматизированного подбора персонала описание вакансии фактически играет роль поискового запроса, а резюме кандидатов — роль документов, которые необходимо упорядочить по степени релевантности. Поэтому естественной точкой отсчета являются классические методы информационного поиска: векторная модель, TF-IDF, BM25, вероятностные модели релевантности, а также методы обучения ранжированию над заранее рассчитанными признаками [8, 11, 25, 26].</w:t>
+        <w:t>Перед интерпретацией экспериментальных метрик важно зафиксировать, с какими классами ранжирующих систем сопоставляется реализованный подход на базе двунаправленного кодировщика представлений на основе трансформера (Bidirectional Encoder Representations from Transformers), модели векторных представлений предложений (Sentence Bidirectional Encoder Representations from Transformers) и архитектуры двойного кодировщика (dual encoder architecture). В задаче ATS описание вакансии фактически играет роль поискового запроса, а резюме кандидатов — роль документов, которые необходимо упорядочить по степени релевантности. Поэтому естественной точкой отсчета являются классические методы информационного поиска: векторная модель, TF-IDF, BM25, вероятностные модели релевантности, а также методы обучения ранжированию над заранее рассчитанными признаками [8, 11, 25, 26].</w:t>
       </w:r>
     </w:p>
     <w:p ns2:paraId="5E3C6997" ns2:textId="77777777">
       <w:r>
-        <w:t>Лексические методы, такие как TF-IDF и BM25, остаются полезными baseline-подходами, поскольку они просты, вычислительно дешевы и хорошо интерпретируются. Для сценария автоматизированного подбора персонала это означает возможность быстро оценивать совпадение должностей, технологий, сертификатов и иных явно указанных требований. Однако в текстах вакансий и резюме релевантность часто выражается не буквальным совпадением слов, а согласованностью содержания вакансии и резюме: совпадением названия должности и уровня позиции, пересечением требуемых и указанных в резюме навыков и технологий, а также сопоставимостью описанных задач, обязанностей и достижений. В таких случаях чисто лексическое ранжирование может недооценивать релевантное резюме, если кандидат и работодатель описывают один и тот же опыт разными словами.</w:t>
+        <w:t>Лексические методы, такие как TF-IDF и BM25, остаются полезными baseline-подходами, поскольку они просты, вычислительно дешевы и хорошо интерпретируются. Для ATS-сценария это означает возможность быстро оценивать совпадение должностей, технологий, сертификатов и иных явно указанных требований. Однако в текстах вакансий и резюме релевантность часто выражается не буквальным совпадением слов, а согласованностью содержания вакансии и резюме: совпадением названия должности и уровня позиции, пересечением требуемых и указанных в резюме навыков и технологий, а также сопоставимостью описанных задач, обязанностей и достижений. В таких случаях чисто лексическое ранжирование может недооценивать релевантное резюме, если кандидат и работодатель описывают один и тот же опыт разными словами.</w:t>
       </w:r>
     </w:p>
     <w:p ns2:paraId="5E3C6997" ns2:textId="77777777">
@@ -7658,7 +8729,7 @@
     </w:p>
     <w:p ns2:paraId="5E3C6997" ns2:textId="77777777">
       <w:r>
-        <w:t>Ссылочные методы, например PageRank, в рассматриваемой постановке имеют меньшую практическую роль: они естественны для веб-графов и сетей цитирования, но не описывают напрямую смысловое соответствие вакансии и резюме [27]. Напротив, классические методы обучения ранжированию (learning to rank), включая RankNet, LambdaMART и градиентный бустинг для ранжирования, являются логичным направлением дальнейшего развития [8, 9, 28]. При наличии достаточного числа списков кандидатов и градуированных оценок они могут объединить BM25-score, семантический показатель, полученный архитектурой двойного кодировщика (dual encoder architecture), структурные признаки профиля и поведенческие сигналы системы подбора персонала в единую ранжирующую функцию. Поэтому выбор двунаправленного кодировщика (Bidirectional Encoder Representations from Transformers) и модели векторных представлений предложений (Sentence Bidirectional Encoder Representations from Transformers) в текущей реализации следует понимать не как отказ от классического информационного поиска, а как реализацию первого, семантического признака в более широком семействе методов ранжирования.</w:t>
+        <w:t>Ссылочные методы, например PageRank, в рассматриваемой постановке имеют меньшую практическую роль: они естественны для веб-графов и сетей цитирования, но не описывают напрямую смысловое соответствие вакансии и резюме [27]. Напротив, классические методы обучения ранжированию (learning to rank), включая RankNet, LambdaMART и градиентный бустинг для ранжирования, являются логичным направлением дальнейшего развития [8, 9, 28]. При наличии достаточного числа списков кандидатов и градуированных оценок они могут объединить BM25-score, семантический показатель, полученный архитектурой двойного кодировщика (dual encoder architecture), структурные признаки профиля и поведенческие сигналы ATS в единую ранжирующую функцию. Поэтому выбор двунаправленного кодировщика (Bidirectional Encoder Representations from Transformers) и модели векторных представлений предложений (Sentence Bidirectional Encoder Representations from Transformers) в текущей реализации следует понимать не как отказ от классического информационного поиска, а как получение и экспериментальную проверку воспроизводимого семантического показателя для русскоязычных пар «вакансия–резюме»; построение полноценной гибридной модели ранжирования с обучением ранжированию (learning to rank) вынесено на следующий этап и предполагает использование этого показателя как одного из входных признаков.</w:t>
       </w:r>
     </w:p>
     <w:p ns2:paraId="4EABBBF1" ns2:textId="77777777">
@@ -7806,7 +8877,7 @@
         <w:jc w:val="left"/>
       </w:pPr>
       <w:r>
-        <w:t>Таким образом, в работе реально подтверждены два результата. Во-первых, дообучение `cointegrated/rubert-tiny2` на целевом наборе связанных пар заметно улучшает качество бинарного различения релевантных и нерелевантных соответствий. Во-вторых, на полном тестовом срезе модель показывает высокие ranking-метрики при сортировке кандидатов внутри вакансий. Вместе с тем эти результаты следует интерпретировать как офлайн-валидацию на исторических данных, а не как онлайн-эксперимент в рабочем контуре Reqcore.</w:t>
+        <w:t>Таким образом, в работе реально подтверждены два результата. Во-первых, дообучение `cointegrated/rubert-tiny2` на целевом наборе связанных пар заметно улучшает качество бинарного различения релевантных и нерелевантных соответствий. Во-вторых, на полном тестовом срезе модель показывает высокие ranking-метрики при сортировке кандидатов внутри вакансий. Вместе с тем эти результаты следует интерпретировать как офлайн-валидацию на исторических данных, а не как онлайн-эксперимент в рабочем контуре ATS.</w:t>
       </w:r>
     </w:p>
     <w:p ns2:paraId="5D5F3ADB" ns2:textId="3A6B7152">
@@ -7816,20 +8887,38 @@
         <w:jc w:val="left"/>
       </w:pPr>
       <w:r>
-        <w:t>Ограничения экспериментальной части также должны быть зафиксированы явно. В работе нет отдельных воспроизводимых экспериментов по подтверждению утверждения о TF-IDF edge-case baseline, полном ablation-анализе архитектурных блоков, HR-валидации explainability, bias-audit по социальным признакам и нагрузочном сравнении больших кандидатских пулов. Кроме того, treatment-ветка `biencoder` в текущем коде возвращает только числовой score и не формирует criterion-level `evidence`, `strengths` и `gaps`, поэтому результаты корректно трактовать именно как проверку качества числового сопоставления и ранжирования, а не как оценку полноты объяснимости решения.</w:t>
+        <w:t xml:space="preserve">Ограничения экспериментальной части также должны быть зафиксированы явно. В работе </w:t>
+      </w:r>
+      <w:r>
+        <w:t>нет отдельных воспроизводимых экспериментов</w:t>
+      </w:r>
+      <w:r>
+        <w:rPr>
+          <w:lang w:val="ru-RU"/>
+        </w:rPr>
+        <w:t xml:space="preserve"> </w:t>
+      </w:r>
+      <w:r>
+        <w:t>по подтверждению утверждения о TF-IDF edge-case baseline, полном ablation-анализе архитектурных блоков, HR-валидации explainability, bias-audit по социальным признакам и нагрузочном сравнении больших кандидатских пулов. Кроме того, treatment-ветка `biencoder` в текущем коде возвращает только числовой score и не формирует criterion-level `evidence`, `strengths` и `gaps`, поэтому результаты корректно трактовать именно как проверку качества числового сопоставления и ранжирования, а не как оценку полноты объяснимости решения.</w:t>
       </w:r>
     </w:p>
     <w:p ns2:paraId="2961DD05" ns2:textId="77777777">
       <w:pPr>
         <w:pStyle w:val="2"/>
       </w:pPr>
-      <w:r>
-        <w:t>4.2 Выполнение интеграции созданного модуля в целевую систему автоматизированного управления подбором персонала</w:t>
-      </w:r>
+      <w:bookmarkStart w:id="57" w:name="_Toc230211059"/>
+      <w:r>
+        <w:t>4.2 Выполнение интеграции созданного модуля в целевую ATS-систему</w:t>
+      </w:r>
+      <w:bookmarkEnd w:id="57"/>
     </w:p>
     <w:p ns2:paraId="2A68CD27" ns2:textId="77777777">
       <w:r>
-        <w:t>Интеграция реализована в виде отдельного сервиса HTTP API на Python-фреймворке FastAPI, который взаимодействует с Reqcore по HTTP. В текущем коде Python-сервис `experiments/scripts/11_api_server.py` предоставляет три маршрута: `POST /index/candidate` для загрузки кандидатских профилей во временный in-memory пул, `POST /search/rank` для ранжирования списка кандидатов по косинусному сходству и `POST /score` для расчета числовой оценки соответствия одной пары «текст вакансии–текст резюме». Таким образом, фактически реализованная интеграция представляет собой внешний сервис семантического скоринга с in-memory хранением профилей, а не связку с промышленной векторной базой данных.</w:t>
+        <w:t xml:space="preserve">Интеграция реализована в виде отдельного FastAPI-сервиса ранжирования, который взаимодействует с ATS по HTTP. В текущем коде Python-сервис `experiments/scripts/11_api_server.py` предоставляет три маршрута: `POST /index/candidate` для загрузки кандидатских профилей во временный in-memory пул, `POST /search/rank` для ранжирования списка кандидатов по cosine similarity и `POST /score` для расчета score </w:t>
+      </w:r>
+      <w:r>
+        <w:lastRenderedPageBreak/>
+        <w:t>одной пары `вакансия-кандидат`. Таким образом, фактически реализованный контур представляет собой внешний сервис семантического скоринга с in-memory хранением профилей, а не связку с промышленной векторной базой данных.</w:t>
       </w:r>
     </w:p>
     <w:p ns2:paraId="11931DD3" ns2:textId="77777777">
@@ -7839,17 +8928,27 @@
     </w:p>
     <w:p ns2:paraId="53EBD429" ns2:textId="5A1E205B">
       <w:r>
-        <w:t>Дополнительно была выполнена практическая локальная проверка интеграции с Reqcore. Для этого был поднят локальный demo-стенд Reqcore через Docker Compose, Python-сервис независимого энкодера (bi-encoder) был запущен отдельно с указанием `MODEL_PATH`, а серверная переменная `BIENCODER_URL` была направлена на этот сервис. В результате treatment-путь `provider === biencoder` в `ats/reqcore/server/api/applications/[id]/analyze.post.ts` был реально пройден до конца: Reqcore вызвал `POST /score`, получил числовой `match_score`, преобразовал его в итоговый `application.score` и сохранил completed `analysis_run` с `provider = biencoder`, `model = cointegrated/rubert-tiny2`, `promptTokens = 0` и `completionTokens = 0`. Тем самым подтверждена не только автономная работа сервиса на FastAPI, но и его фактическое подключение к тестовому контуру Reqcore.</w:t>
+        <w:t xml:space="preserve">Дополнительно была выполнена практическая локальная проверка интеграции с Reqcore. Для этого был поднят локальный demo-стенд Reqcore через Docker Compose, Python сервис независимого энкодера (bi-encoder) был запущен отдельно с указанием `MODEL_PATH`, а серверная переменная `BIENCODER_URL` была направлена на этот сервис. В результате treatment-путь `provider === biencoder` в `ats/reqcore/server/api/applications/[id]/analyze.post.ts` был реально пройден до конца: Reqcore вызвал `POST /score`, получил числовой `match_score`, преобразовал его в итоговый `application.score` и сохранил completed `analysis_run` с `provider = biencoder`, `model = cointegrated/rubert-tiny2`, `promptTokens = 0` и `completionTokens = 0`. Тем самым подтверждена не только автономная работа FastAPI-сервиса, но и его фактическое подключение к </w:t>
+      </w:r>
+      <w:r>
+        <w:t>ATS-контуру Reqcore</w:t>
+      </w:r>
+      <w:r>
+        <w:t>.</w:t>
       </w:r>
     </w:p>
     <w:p ns2:paraId="1936FEB1" ns2:textId="77777777">
       <w:r>
-        <w:t>Важно, что текущая интеграция с Reqcore не заменяет весь LLM-контур целиком, а добавляет альтернативный score-only путь. Для стандартного LLM-сценария маршрут `POST /api/applications/[id]/analyze` продолжает использовать `scoreApplication()`, провайдера LLM и сохранение criterion-level breakdown в `criterion_score`. Для biencoder-сценария тот же маршрут использует отдельную ветку с вызовом `BIENCODER_URL + /score`, после чего в Reqcore записывается только итоговый числовой score без `criterion_score`, `evidence`, `strengths` и `gaps`. Следовательно, интеграция корректно описывается как подключение альтернативного семантического scoring-модуля, а не как внедрение полноценной векторной БД или полного replacement всего LLM-анализа.</w:t>
+        <w:t>Важно, что текущая интеграция с Reqcore не заменяет весь LLM-контур целиком, а добавляет альтернативный score-only путь. Для стандартного LLM-сценария маршрут `POST /api/applications/[id]/analyze` продолжает использовать `scoreApplication()`, провайдера LLM и сохранение criterion-level breakdown в `criterion_score`. Для biencoder-сценария тот же маршрут использует отдельную ветку с вызовом `BIENCODER_URL + /score`, после чего в ATS записывается только итоговый числовой score без `criterion_score`, `evidence`, `strengths` и `gaps`. Следовательно, интеграция корректно описывается как подключение альтернативного семантического scoring-модуля, а не как внедрение полноценной векторной БД или полного replacement всего LLM-анализа.</w:t>
       </w:r>
     </w:p>
     <w:p ns2:paraId="6DD57EF3" ns2:textId="77777777">
       <w:r>
-        <w:t>Ограничения интеграционного контура также должны быть зафиксированы явно. В текущей реализации не подтверждены утверждения о корпоративном дисковом векторном хранилище профилей, Milvus, DiskANN, SPANN, миллионных индексах, графовой навигации по ANN-структурам или специальных механизмах контроля деградации через версионируемое внешнее векторное хранилище. Также не подтверждено наличие отдельного production-контура аудита на независимых тестовых корпусах русского языка. Реально реализованный и проверенный контур ограничивается микросервисом независимого энкодера (bi-encoder), in-memory candidate pool для ranking API, Reqcore-интеграцией через `BIENCODER_URL` и локальным E2E/smoke-тестированием этой связки.</w:t>
+        <w:t xml:space="preserve">Ограничения интеграционного контура также должны быть зафиксированы явно. В текущей реализации не подтверждены утверждения о корпоративном дисковом векторном хранилище профилей, Milvus, DiskANN, SPANN, миллионных индексах, графовой навигации по ANN-структурам или специальных механизмах контроля деградации через версионируемое внешнее векторное хранилище. Также не подтверждено наличие </w:t>
+      </w:r>
+      <w:r>
+        <w:lastRenderedPageBreak/>
+        <w:t>отдельного production-контура аудита на независимых тестовых корпусах русского языка. Реально реализованный и проверенный контур ограничивается микросервисом независимого энкодера (bi-encoder), in-memory candidate pool для ranking API, Reqcore-интеграцией через `BIENCODER_URL` и локальным E2E/smoke-тестированием этой связки.</w:t>
       </w:r>
     </w:p>
     <w:p ns2:paraId="32742863" ns2:textId="77777777">
@@ -7864,7 +8963,7 @@
     </w:p>
     <w:p ns2:paraId="2D3E3E66" ns2:textId="77777777">
       <w:r>
-        <w:t>Экономическая оценка в данной версии не опирается на production-логи токенов и не утверждает, что фактический расход был извлечен из работающей системы подбора персонала. В коде Reqcore действительно предусмотрены поля `analysis_run.prompt_tokens`, `analysis_run.completion_tokens` и настраиваемые `input_price_per_1m` / `output_price_per_1m`, а UI рассчитывает стоимость по формуле `(promptTokens / 1_000_000) * inputPrice + (completionTokens / 1_000_000) * outputPrice`. Однако в рамках данной работы эти значения не выгружались из production-БД, поэтому ниже приведен только оценочный расчет на публичных pricing constants и явно заданных допущениях.</w:t>
+        <w:t>Экономическая оценка в данной версии не опирается на production-логи токенов и не утверждает, что фактический расход был извлечен из работающей ATS. В коде Reqcore действительно предусмотрены поля `analysis_run.prompt_tokens`, `analysis_run.completion_tokens` и настраиваемые `input_price_per_1m` / `output_price_per_1m`, а UI рассчитывает стоимость по формуле `(promptTokens / 1_000_000) * inputPrice + (completionTokens / 1_000_000) * outputPrice`. Однако в рамках данной работы эти значения не выгружались из production-БД, поэтому ниже приведен только оценочный расчет на публичных pricing constants и явно заданных допущениях.</w:t>
       </w:r>
     </w:p>
     <w:p ns2:paraId="47ECA020" ns2:textId="77777777">
@@ -9338,7 +10437,7 @@
         </w:rPr>
       </w:pPr>
       <w:r>
-        <w:t>Если локальная инфраструктурная стоимость мала относительно LLM API-cost или уже включена в стоимость работающего сервера системы подбора персонала, то оценочная экономия по внешнему API приближенно равна:</w:t>
+        <w:t>Если локальная инфраструктурная стоимость мала относительно LLM API-cost или уже включена в стоимость работающего ATS-сервера, то оценочная экономия по внешнему API приближенно равна:</w:t>
       </w:r>
     </w:p>
     <w:p ns2:paraId="7A69F076" ns2:textId="192AE64F">
@@ -10654,7 +11753,10 @@
     </w:p>
     <w:p ns2:paraId="3331DABC" ns2:textId="77777777">
       <w:r>
-        <w:t>Таким образом, LLM scoring дает более детальное объяснимое оценивание по критериям, но имеет переменную стоимость за каждый candidate/job вызов и зависит от внешнего API. Скоринг независимым энкодером (bi-encoder) дешевле по внешним API-платежам и лучше подходит для первичного top-K отбора, но требует локального обслуживания модели и не заменяет полноценную экспертную или LLM-интерпретацию причин соответствия кандидата.</w:t>
+        <w:t>Таким образом, LLM scoring дает более детальное объяснимое оценивание по критериям, но имеет переменную стоимость за каждый candidate/job вызов и зависит от внешнего API. Bi-encoder scoring дешевле по внешним API-платежам и лучше подходит для первичного top-K отбора, но требует локального обслуживания модели и не заменяет полноценную экспертную или LLM-интерпретацию причин соответствия кандидата.</w:t>
+      </w:r>
+      <w:r>
+        <w:br w:type="page"/>
       </w:r>
     </w:p>
     <w:p ns2:paraId="1AA13F8E" ns2:textId="77777777">
@@ -10675,7 +11777,7 @@
         </w:rPr>
       </w:pPr>
       <w:r>
-        <w:t>В ходе работы был разработан и проверен прототип модуля семантического сопоставления пары «вакансия–резюме» для интеграции в систему автоматизированного управления подбором персонала. Основой решения стала архитектура независимого энкодера (bi-encoder) на базе `cointegrated/rubert-tiny2`: вакансия и резюме кодируются раздельно, после чего оценка рассчитывается по косинусному сходству. Для подготовки данных были выполнены фильтрация явно интерпретируемых статусов, деидентификация текстов, формирование unified-представлений резюме и вакансий, а также построение train/val/test split.</w:t>
+        <w:t>В ходе работы был разработан и проверен прототип модуля семантического сопоставления пары «вакансия–резюме» для интеграции в ATS-систему. Основой решения стала архитектура независимого энкодера (bi-encoder) на базе cointegrated/rubert-tiny2, дообученная на корпусе связанных HR-событий. Для подготовки данных были выполнены фильтрация явно интерпретируемых статусов, деидентификация текстов, формирование unified-представлений резюме и вакансий, а также построение train/val/test split.</w:t>
       </w:r>
     </w:p>
     <w:p ns2:paraId="632A2732" ns2:textId="7AA56A26">
@@ -10685,7 +11787,7 @@
         </w:rPr>
       </w:pPr>
       <w:r>
-        <w:t>Практическая реализация включает модуль ранжирования `ATSRanker` и сервис HTTP API на Python-фреймворке FastAPI, предоставляющий маршруты для индексации кандидатов, ранжирования кандидатского пула и вычисления score для одной пары «вакансия–резюме». Дополнительно была выполнена интеграция с тестовым контуром Reqcore через ветку `provider === biencoder`, где результат работы модели преобразуется в числовое поле `application.score`.</w:t>
+        <w:t>Практическая реализация включает модуль ранжирования ATSRanker и FastAPI-сервис, предоставляющий маршруты для индексации кандидатов, ранжирования кандидатского пула и вычисления score для одной пары «вакансия–резюме». Дополнительно была выполнена интеграция с тестовым контуром ATS Reqcore через ветку provider === biencoder, где результат работы модели преобразуется в числовое поле application.score.</w:t>
       </w:r>
     </w:p>
     <w:p ns2:paraId="0B2DC5FC" ns2:textId="5EF0B305">
@@ -10705,7 +11807,7 @@
         </w:rPr>
       </w:pPr>
       <w:r>
-        <w:t>Ограничения текущей реализации связаны с использованием in-memory candidate pool, отсутствием промышленного векторного хранилища, ANN-поиска, LTR-реранжирования, bias-audit и нагрузочного тестирования. Дальнейшее развитие работы целесообразно направить на масштабирование поиска, добавление второго этапа reranking, расширение explainability-механизмов и проведение онлайн-валидации в рабочем контуре Reqcore.</w:t>
+        <w:t>Ограничения текущей реализации связаны с использованием in-memory candidate pool, отсутствием промышленного векторного хранилища, ANN-поиска, LTR-реранжирования, bias-audit и нагрузочного тестирования. Дальнейшее развитие работы целесообразно направить на масштабирование поиска, добавление второго этапа reranking, расширение explainability-механизмов и проведение онлайн-валидации в рабочем ATS-контуре.</w:t>
       </w:r>
     </w:p>
     <w:p ns2:paraId="58AC8CB7" ns2:textId="77777777"/>

</xml_diff>